<commit_message>
feat(report): add clickable dynamic table of contents
</commit_message>
<xml_diff>
--- a/deliverables/report.docx
+++ b/deliverables/report.docx
@@ -767,10 +767,12 @@
         <w:pStyle w:val="section"/>
         <w:pageBreakBefore w:val="0"/>
       </w:pPr>
+      <w:bookmarkStart w:id="0" w:name="_Toc1500940944"/>
       <w:r>
         <w:rPr/>
         <w:t>DANH SÁCH THÀNH VIÊN</w:t>
       </w:r>
+      <w:bookmarkEnd w:id="0"/>
     </w:p>
     <w:tbl>
       <w:tblPr>
@@ -1257,10 +1259,12 @@
         <w:pStyle w:val="section"/>
         <w:pageBreakBefore w:val="0"/>
       </w:pPr>
+      <w:bookmarkStart w:id="1" w:name="_Toc3719665044"/>
       <w:r>
         <w:rPr/>
         <w:t>PHÂN CÔNG NHIỆM VỤ</w:t>
       </w:r>
+      <w:bookmarkEnd w:id="1"/>
     </w:p>
     <w:tbl>
       <w:tblPr>
@@ -2228,10 +2232,25 @@
         </w:tabs>
       </w:pPr>
       <w:r>
-        <w:t>DANH SÁCH THÀNH VIÊN</w:t>
-        <w:tab/>
-        <w:t>ii</w:t>
-      </w:r>
+        <w:fldChar w:fldCharType="begin"/>
+      </w:r>
+      <w:r>
+        <w:instrText xml:space="preserve"> TOC \o "1-2" \h \z </w:instrText>
+      </w:r>
+      <w:r>
+        <w:fldChar w:fldCharType="separate"/>
+      </w:r>
+      <w:hyperlink w:anchor="_Toc1500940944" w:history="1">
+        <w:r>
+          <w:t xml:space="preserve">DANH SÁCH THÀNH VIÊN</w:t>
+        </w:r>
+        <w:r>
+          <w:tab/>
+        </w:r>
+        <w:r>
+          <w:t xml:space="preserve">ii</w:t>
+        </w:r>
+      </w:hyperlink>
     </w:p>
     <w:p>
       <w:pPr>
@@ -2240,11 +2259,17 @@
           <w:tab w:pos="9061" w:val="right" w:leader="dot"/>
         </w:tabs>
       </w:pPr>
-      <w:r>
-        <w:t>PHÂN CÔNG NHIỆM VỤ</w:t>
-        <w:tab/>
-        <w:t>ii</w:t>
-      </w:r>
+      <w:hyperlink w:anchor="_Toc3719665044" w:history="1">
+        <w:r>
+          <w:t xml:space="preserve">PHÂN CÔNG NHIỆM VỤ</w:t>
+        </w:r>
+        <w:r>
+          <w:tab/>
+        </w:r>
+        <w:r>
+          <w:t xml:space="preserve">ii</w:t>
+        </w:r>
+      </w:hyperlink>
     </w:p>
     <w:p>
       <w:pPr>
@@ -2253,11 +2278,17 @@
           <w:tab w:pos="9061" w:val="right" w:leader="dot"/>
         </w:tabs>
       </w:pPr>
-      <w:r>
-        <w:t>DANH MỤC BẢNG</w:t>
-        <w:tab/>
-        <w:t>vi</w:t>
-      </w:r>
+      <w:hyperlink w:anchor="_Toc393368658" w:history="1">
+        <w:r>
+          <w:t xml:space="preserve">DANH MỤC BẢNG</w:t>
+        </w:r>
+        <w:r>
+          <w:tab/>
+        </w:r>
+        <w:r>
+          <w:t xml:space="preserve">vi</w:t>
+        </w:r>
+      </w:hyperlink>
     </w:p>
     <w:p>
       <w:pPr>
@@ -2266,11 +2297,17 @@
           <w:tab w:pos="9061" w:val="right" w:leader="dot"/>
         </w:tabs>
       </w:pPr>
-      <w:r>
-        <w:t>DANH MỤC HÌNH</w:t>
-        <w:tab/>
-        <w:t>vii</w:t>
-      </w:r>
+      <w:hyperlink w:anchor="_Toc2974129692" w:history="1">
+        <w:r>
+          <w:t xml:space="preserve">DANH MỤC HÌNH</w:t>
+        </w:r>
+        <w:r>
+          <w:tab/>
+        </w:r>
+        <w:r>
+          <w:t xml:space="preserve">vii</w:t>
+        </w:r>
+      </w:hyperlink>
     </w:p>
     <w:p>
       <w:pPr>
@@ -2279,11 +2316,17 @@
           <w:tab w:pos="9061" w:val="right" w:leader="dot"/>
         </w:tabs>
       </w:pPr>
-      <w:r>
-        <w:t>DANH SÁCH THUẬT NGỮ</w:t>
-        <w:tab/>
-        <w:t>viii</w:t>
-      </w:r>
+      <w:hyperlink w:anchor="_Toc3895705433" w:history="1">
+        <w:r>
+          <w:t xml:space="preserve">DANH SÁCH THUẬT NGỮ</w:t>
+        </w:r>
+        <w:r>
+          <w:tab/>
+        </w:r>
+        <w:r>
+          <w:t xml:space="preserve">viii</w:t>
+        </w:r>
+      </w:hyperlink>
     </w:p>
     <w:p>
       <w:pPr>
@@ -2292,11 +2335,17 @@
           <w:tab w:pos="9061" w:val="right" w:leader="dot"/>
         </w:tabs>
       </w:pPr>
-      <w:r>
-        <w:t>TÓM TẮT BÁO CÁO</w:t>
-        <w:tab/>
-        <w:t>1</w:t>
-      </w:r>
+      <w:hyperlink w:anchor="_Toc73744571" w:history="1">
+        <w:r>
+          <w:t xml:space="preserve">TÓM TẮT BÁO CÁO</w:t>
+        </w:r>
+        <w:r>
+          <w:tab/>
+        </w:r>
+        <w:r>
+          <w:t xml:space="preserve">1</w:t>
+        </w:r>
+      </w:hyperlink>
     </w:p>
     <w:p>
       <w:pPr>
@@ -2305,11 +2354,17 @@
           <w:tab w:pos="9061" w:val="right" w:leader="dot"/>
         </w:tabs>
       </w:pPr>
-      <w:r>
-        <w:t>CHƯƠNG 1. GIỚI THIỆU</w:t>
-        <w:tab/>
-        <w:t>2</w:t>
-      </w:r>
+      <w:hyperlink w:anchor="_Toc3544288922" w:history="1">
+        <w:r>
+          <w:t xml:space="preserve">CHƯƠNG 1. GIỚI THIỆU</w:t>
+        </w:r>
+        <w:r>
+          <w:tab/>
+        </w:r>
+        <w:r>
+          <w:t xml:space="preserve">2</w:t>
+        </w:r>
+      </w:hyperlink>
     </w:p>
     <w:p>
       <w:pPr>
@@ -2318,11 +2373,17 @@
           <w:tab w:pos="9061" w:val="right" w:leader="dot"/>
         </w:tabs>
       </w:pPr>
-      <w:r>
-        <w:t>1.1. Bối cảnh</w:t>
-        <w:tab/>
-        <w:t>2</w:t>
-      </w:r>
+      <w:hyperlink w:anchor="_Toc2615902355" w:history="1">
+        <w:r>
+          <w:t xml:space="preserve">1.1. Bối cảnh</w:t>
+        </w:r>
+        <w:r>
+          <w:tab/>
+        </w:r>
+        <w:r>
+          <w:t xml:space="preserve">2</w:t>
+        </w:r>
+      </w:hyperlink>
     </w:p>
     <w:p>
       <w:pPr>
@@ -2331,11 +2392,17 @@
           <w:tab w:pos="9061" w:val="right" w:leader="dot"/>
         </w:tabs>
       </w:pPr>
-      <w:r>
-        <w:t>1.2. Mục tiêu và đối tượng</w:t>
-        <w:tab/>
-        <w:t>2</w:t>
-      </w:r>
+      <w:hyperlink w:anchor="_Toc3708436808" w:history="1">
+        <w:r>
+          <w:t xml:space="preserve">1.2. Mục tiêu và đối tượng</w:t>
+        </w:r>
+        <w:r>
+          <w:tab/>
+        </w:r>
+        <w:r>
+          <w:t xml:space="preserve">2</w:t>
+        </w:r>
+      </w:hyperlink>
     </w:p>
     <w:p>
       <w:pPr>
@@ -2344,11 +2411,17 @@
           <w:tab w:pos="9061" w:val="right" w:leader="dot"/>
         </w:tabs>
       </w:pPr>
-      <w:r>
-        <w:t>1.3. Câu hỏi phân tích</w:t>
-        <w:tab/>
-        <w:t>2</w:t>
-      </w:r>
+      <w:hyperlink w:anchor="_Toc2781230238" w:history="1">
+        <w:r>
+          <w:t xml:space="preserve">1.3. Câu hỏi phân tích</w:t>
+        </w:r>
+        <w:r>
+          <w:tab/>
+        </w:r>
+        <w:r>
+          <w:t xml:space="preserve">2</w:t>
+        </w:r>
+      </w:hyperlink>
     </w:p>
     <w:p>
       <w:pPr>
@@ -2357,11 +2430,17 @@
           <w:tab w:pos="9061" w:val="right" w:leader="dot"/>
         </w:tabs>
       </w:pPr>
-      <w:r>
-        <w:t>1.4. Phạm vi và cấu trúc báo cáo</w:t>
-        <w:tab/>
-        <w:t>2</w:t>
-      </w:r>
+      <w:hyperlink w:anchor="_Toc4111894682" w:history="1">
+        <w:r>
+          <w:t xml:space="preserve">1.4. Phạm vi và cấu trúc báo cáo</w:t>
+        </w:r>
+        <w:r>
+          <w:tab/>
+        </w:r>
+        <w:r>
+          <w:t xml:space="preserve">2</w:t>
+        </w:r>
+      </w:hyperlink>
     </w:p>
     <w:p>
       <w:pPr>
@@ -2370,11 +2449,17 @@
           <w:tab w:pos="9061" w:val="right" w:leader="dot"/>
         </w:tabs>
       </w:pPr>
-      <w:r>
-        <w:t>CHƯƠNG 2. DỮ LIỆU VÀ TIỀN XỬ LÝ</w:t>
-        <w:tab/>
-        <w:t>4</w:t>
-      </w:r>
+      <w:hyperlink w:anchor="_Toc2719321501" w:history="1">
+        <w:r>
+          <w:t xml:space="preserve">CHƯƠNG 2. DỮ LIỆU VÀ TIỀN XỬ LÝ</w:t>
+        </w:r>
+        <w:r>
+          <w:tab/>
+        </w:r>
+        <w:r>
+          <w:t xml:space="preserve">4</w:t>
+        </w:r>
+      </w:hyperlink>
     </w:p>
     <w:p>
       <w:pPr>
@@ -2383,11 +2468,17 @@
           <w:tab w:pos="9061" w:val="right" w:leader="dot"/>
         </w:tabs>
       </w:pPr>
-      <w:r>
-        <w:t>2.1. Nguồn dữ liệu và cấu trúc</w:t>
-        <w:tab/>
-        <w:t>4</w:t>
-      </w:r>
+      <w:hyperlink w:anchor="_Toc1014418225" w:history="1">
+        <w:r>
+          <w:t xml:space="preserve">2.1. Nguồn dữ liệu và cấu trúc</w:t>
+        </w:r>
+        <w:r>
+          <w:tab/>
+        </w:r>
+        <w:r>
+          <w:t xml:space="preserve">4</w:t>
+        </w:r>
+      </w:hyperlink>
     </w:p>
     <w:p>
       <w:pPr>
@@ -2396,11 +2487,17 @@
           <w:tab w:pos="9061" w:val="right" w:leader="dot"/>
         </w:tabs>
       </w:pPr>
-      <w:r>
-        <w:t>2.2. Các biến được sử dụng</w:t>
-        <w:tab/>
-        <w:t>4</w:t>
-      </w:r>
+      <w:hyperlink w:anchor="_Toc2106933653" w:history="1">
+        <w:r>
+          <w:t xml:space="preserve">2.2. Các biến được sử dụng</w:t>
+        </w:r>
+        <w:r>
+          <w:tab/>
+        </w:r>
+        <w:r>
+          <w:t xml:space="preserve">4</w:t>
+        </w:r>
+      </w:hyperlink>
     </w:p>
     <w:p>
       <w:pPr>
@@ -2409,11 +2506,17 @@
           <w:tab w:pos="9061" w:val="right" w:leader="dot"/>
         </w:tabs>
       </w:pPr>
-      <w:r>
-        <w:t>2.3. Dữ liệu thiếu</w:t>
-        <w:tab/>
-        <w:t>5</w:t>
-      </w:r>
+      <w:hyperlink w:anchor="_Toc1634008197" w:history="1">
+        <w:r>
+          <w:t xml:space="preserve">2.3. Dữ liệu thiếu</w:t>
+        </w:r>
+        <w:r>
+          <w:tab/>
+        </w:r>
+        <w:r>
+          <w:t xml:space="preserve">5</w:t>
+        </w:r>
+      </w:hyperlink>
     </w:p>
     <w:p>
       <w:pPr>
@@ -2422,11 +2525,17 @@
           <w:tab w:pos="9061" w:val="right" w:leader="dot"/>
         </w:tabs>
       </w:pPr>
-      <w:r>
-        <w:t>2.4. Quy tắc làm sạch dữ liệu</w:t>
-        <w:tab/>
-        <w:t>5</w:t>
-      </w:r>
+      <w:hyperlink w:anchor="_Toc1932709038" w:history="1">
+        <w:r>
+          <w:t xml:space="preserve">2.4. Quy tắc làm sạch dữ liệu</w:t>
+        </w:r>
+        <w:r>
+          <w:tab/>
+        </w:r>
+        <w:r>
+          <w:t xml:space="preserve">5</w:t>
+        </w:r>
+      </w:hyperlink>
     </w:p>
     <w:p>
       <w:pPr>
@@ -2435,11 +2544,17 @@
           <w:tab w:pos="9061" w:val="right" w:leader="dot"/>
         </w:tabs>
       </w:pPr>
-      <w:r>
-        <w:t>2.5. Phương pháp</w:t>
-        <w:tab/>
-        <w:t>6</w:t>
-      </w:r>
+      <w:hyperlink w:anchor="_Toc1204738964" w:history="1">
+        <w:r>
+          <w:t xml:space="preserve">2.5. Phương pháp</w:t>
+        </w:r>
+        <w:r>
+          <w:tab/>
+        </w:r>
+        <w:r>
+          <w:t xml:space="preserve">6</w:t>
+        </w:r>
+      </w:hyperlink>
     </w:p>
     <w:p>
       <w:pPr>
@@ -2448,11 +2563,17 @@
           <w:tab w:pos="9061" w:val="right" w:leader="dot"/>
         </w:tabs>
       </w:pPr>
-      <w:r>
-        <w:t>2.6. Hồ sơ người trả lời (Q1)</w:t>
-        <w:tab/>
-        <w:t>7</w:t>
-      </w:r>
+      <w:hyperlink w:anchor="_Toc433832425" w:history="1">
+        <w:r>
+          <w:t xml:space="preserve">2.6. Hồ sơ người trả lời (Q1)</w:t>
+        </w:r>
+        <w:r>
+          <w:tab/>
+        </w:r>
+        <w:r>
+          <w:t xml:space="preserve">7</w:t>
+        </w:r>
+      </w:hyperlink>
     </w:p>
     <w:p>
       <w:pPr>
@@ -2461,11 +2582,17 @@
           <w:tab w:pos="9061" w:val="right" w:leader="dot"/>
         </w:tabs>
       </w:pPr>
-      <w:r>
-        <w:t>CHƯƠNG 3. XU HƯỚNG CÔNG NGHỆ</w:t>
-        <w:tab/>
-        <w:t>10</w:t>
-      </w:r>
+      <w:hyperlink w:anchor="_Toc3846948962" w:history="1">
+        <w:r>
+          <w:t xml:space="preserve">CHƯƠNG 3. XU HƯỚNG CÔNG NGHỆ</w:t>
+        </w:r>
+        <w:r>
+          <w:tab/>
+        </w:r>
+        <w:r>
+          <w:t xml:space="preserve">10</w:t>
+        </w:r>
+      </w:hyperlink>
     </w:p>
     <w:p>
       <w:pPr>
@@ -2474,11 +2601,17 @@
           <w:tab w:pos="9061" w:val="right" w:leader="dot"/>
         </w:tabs>
       </w:pPr>
-      <w:r>
-        <w:t>3.1. Công nghệ nào đang được dùng nhiều nhất (Q2)</w:t>
-        <w:tab/>
-        <w:t>10</w:t>
-      </w:r>
+      <w:hyperlink w:anchor="_Toc3326192056" w:history="1">
+        <w:r>
+          <w:t xml:space="preserve">3.1. Công nghệ nào đang được dùng nhiều nhất (Q2)</w:t>
+        </w:r>
+        <w:r>
+          <w:tab/>
+        </w:r>
+        <w:r>
+          <w:t xml:space="preserve">10</w:t>
+        </w:r>
+      </w:hyperlink>
     </w:p>
     <w:p>
       <w:pPr>
@@ -2487,11 +2620,17 @@
           <w:tab w:pos="9061" w:val="right" w:leader="dot"/>
         </w:tabs>
       </w:pPr>
-      <w:r>
-        <w:t>3.2. Dùng nhiều có được ngưỡng mộ và muốn dùng nhiều không (Q3)</w:t>
-        <w:tab/>
-        <w:t>12</w:t>
-      </w:r>
+      <w:hyperlink w:anchor="_Toc2418456719" w:history="1">
+        <w:r>
+          <w:t xml:space="preserve">3.2. Dùng nhiều có được ngưỡng mộ và muốn dùng nhiều không (Q3)</w:t>
+        </w:r>
+        <w:r>
+          <w:tab/>
+        </w:r>
+        <w:r>
+          <w:t xml:space="preserve">12</w:t>
+        </w:r>
+      </w:hyperlink>
     </w:p>
     <w:p>
       <w:pPr>
@@ -2500,11 +2639,17 @@
           <w:tab w:pos="9061" w:val="right" w:leader="dot"/>
         </w:tabs>
       </w:pPr>
-      <w:r>
-        <w:t>3.3. Các ngôn ngữ đi cùng nhau thế nào (Q4)</w:t>
-        <w:tab/>
-        <w:t>14</w:t>
-      </w:r>
+      <w:hyperlink w:anchor="_Toc3827661762" w:history="1">
+        <w:r>
+          <w:t xml:space="preserve">3.3. Các ngôn ngữ đi cùng nhau thế nào (Q4)</w:t>
+        </w:r>
+        <w:r>
+          <w:tab/>
+        </w:r>
+        <w:r>
+          <w:t xml:space="preserve">14</w:t>
+        </w:r>
+      </w:hyperlink>
     </w:p>
     <w:p>
       <w:pPr>
@@ -2513,11 +2658,17 @@
           <w:tab w:pos="9061" w:val="right" w:leader="dot"/>
         </w:tabs>
       </w:pPr>
-      <w:r>
-        <w:t>3.4. Tóm tắt chương</w:t>
-        <w:tab/>
-        <w:t>16</w:t>
-      </w:r>
+      <w:hyperlink w:anchor="_Toc68325474" w:history="1">
+        <w:r>
+          <w:t xml:space="preserve">3.4. Tóm tắt chương</w:t>
+        </w:r>
+        <w:r>
+          <w:tab/>
+        </w:r>
+        <w:r>
+          <w:t xml:space="preserve">16</w:t>
+        </w:r>
+      </w:hyperlink>
     </w:p>
     <w:p>
       <w:pPr>
@@ -2526,11 +2677,17 @@
           <w:tab w:pos="9061" w:val="right" w:leader="dot"/>
         </w:tabs>
       </w:pPr>
-      <w:r>
-        <w:t>CHƯƠNG 4. MỨC LƯƠNG</w:t>
-        <w:tab/>
-        <w:t>17</w:t>
-      </w:r>
+      <w:hyperlink w:anchor="_Toc1088599849" w:history="1">
+        <w:r>
+          <w:t xml:space="preserve">CHƯƠNG 4. MỨC LƯƠNG</w:t>
+        </w:r>
+        <w:r>
+          <w:tab/>
+        </w:r>
+        <w:r>
+          <w:t xml:space="preserve">17</w:t>
+        </w:r>
+      </w:hyperlink>
     </w:p>
     <w:p>
       <w:pPr>
@@ -2539,11 +2696,17 @@
           <w:tab w:pos="9061" w:val="right" w:leader="dot"/>
         </w:tabs>
       </w:pPr>
-      <w:r>
-        <w:t>4.1. Phân phối lương theo vai trò và kinh nghiệm (Q5)</w:t>
-        <w:tab/>
-        <w:t>17</w:t>
-      </w:r>
+      <w:hyperlink w:anchor="_Toc3002508662" w:history="1">
+        <w:r>
+          <w:t xml:space="preserve">4.1. Phân phối lương theo vai trò và kinh nghiệm (Q5)</w:t>
+        </w:r>
+        <w:r>
+          <w:tab/>
+        </w:r>
+        <w:r>
+          <w:t xml:space="preserve">17</w:t>
+        </w:r>
+      </w:hyperlink>
     </w:p>
     <w:p>
       <w:pPr>
@@ -2552,11 +2715,17 @@
           <w:tab w:pos="9061" w:val="right" w:leader="dot"/>
         </w:tabs>
       </w:pPr>
-      <w:r>
-        <w:t>4.2. Công nghệ nào đi cùng mức lương cao (Q6)</w:t>
-        <w:tab/>
-        <w:t>20</w:t>
-      </w:r>
+      <w:hyperlink w:anchor="_Toc2168904604" w:history="1">
+        <w:r>
+          <w:t xml:space="preserve">4.2. Công nghệ nào đi cùng mức lương cao (Q6)</w:t>
+        </w:r>
+        <w:r>
+          <w:tab/>
+        </w:r>
+        <w:r>
+          <w:t xml:space="preserve">20</w:t>
+        </w:r>
+      </w:hyperlink>
     </w:p>
     <w:p>
       <w:pPr>
@@ -2565,11 +2734,17 @@
           <w:tab w:pos="9061" w:val="right" w:leader="dot"/>
         </w:tabs>
       </w:pPr>
-      <w:r>
-        <w:t>4.3. Lương theo nước và vị trí của Việt Nam (Q7)</w:t>
-        <w:tab/>
-        <w:t>23</w:t>
-      </w:r>
+      <w:hyperlink w:anchor="_Toc2214735358" w:history="1">
+        <w:r>
+          <w:t xml:space="preserve">4.3. Lương theo nước và vị trí của Việt Nam (Q7)</w:t>
+        </w:r>
+        <w:r>
+          <w:tab/>
+        </w:r>
+        <w:r>
+          <w:t xml:space="preserve">23</w:t>
+        </w:r>
+      </w:hyperlink>
     </w:p>
     <w:p>
       <w:pPr>
@@ -2578,11 +2753,17 @@
           <w:tab w:pos="9061" w:val="right" w:leader="dot"/>
         </w:tabs>
       </w:pPr>
-      <w:r>
-        <w:t>4.4. So sánh các vai trò (Q8)</w:t>
-        <w:tab/>
-        <w:t>26</w:t>
-      </w:r>
+      <w:hyperlink w:anchor="_Toc2518512753" w:history="1">
+        <w:r>
+          <w:t xml:space="preserve">4.4. So sánh các vai trò (Q8)</w:t>
+        </w:r>
+        <w:r>
+          <w:tab/>
+        </w:r>
+        <w:r>
+          <w:t xml:space="preserve">26</w:t>
+        </w:r>
+      </w:hyperlink>
     </w:p>
     <w:p>
       <w:pPr>
@@ -2591,11 +2772,17 @@
           <w:tab w:pos="9061" w:val="right" w:leader="dot"/>
         </w:tabs>
       </w:pPr>
-      <w:r>
-        <w:t>4.5. Tóm tắt chương</w:t>
-        <w:tab/>
-        <w:t>28</w:t>
-      </w:r>
+      <w:hyperlink w:anchor="_Toc572703701" w:history="1">
+        <w:r>
+          <w:t xml:space="preserve">4.5. Tóm tắt chương</w:t>
+        </w:r>
+        <w:r>
+          <w:tab/>
+        </w:r>
+        <w:r>
+          <w:t xml:space="preserve">28</w:t>
+        </w:r>
+      </w:hyperlink>
     </w:p>
     <w:p>
       <w:pPr>
@@ -2604,11 +2791,17 @@
           <w:tab w:pos="9061" w:val="right" w:leader="dot"/>
         </w:tabs>
       </w:pPr>
-      <w:r>
-        <w:t>CHƯƠNG 5. AI VÀ KỸ NĂNG CÒN GIÁ TRỊ, CÂU CHUYỆN DỮ LIỆU TỔNG HỢP</w:t>
-        <w:tab/>
-        <w:t>29</w:t>
-      </w:r>
+      <w:hyperlink w:anchor="_Toc2010487642" w:history="1">
+        <w:r>
+          <w:t xml:space="preserve">CHƯƠNG 5. AI VÀ KỸ NĂNG CÒN GIÁ TRỊ, CÂU CHUYỆN DỮ LIỆU TỔNG HỢP</w:t>
+        </w:r>
+        <w:r>
+          <w:tab/>
+        </w:r>
+        <w:r>
+          <w:t xml:space="preserve">29</w:t>
+        </w:r>
+      </w:hyperlink>
     </w:p>
     <w:p>
       <w:pPr>
@@ -2617,11 +2810,17 @@
           <w:tab w:pos="9061" w:val="right" w:leader="dot"/>
         </w:tabs>
       </w:pPr>
-      <w:r>
-        <w:t>5.1. AI trong công việc của lập trình viên</w:t>
-        <w:tab/>
-        <w:t>29</w:t>
-      </w:r>
+      <w:hyperlink w:anchor="_Toc2491379647" w:history="1">
+        <w:r>
+          <w:t xml:space="preserve">5.1. AI trong công việc của lập trình viên</w:t>
+        </w:r>
+        <w:r>
+          <w:tab/>
+        </w:r>
+        <w:r>
+          <w:t xml:space="preserve">29</w:t>
+        </w:r>
+      </w:hyperlink>
     </w:p>
     <w:p>
       <w:pPr>
@@ -2630,11 +2829,17 @@
           <w:tab w:pos="9061" w:val="right" w:leader="dot"/>
         </w:tabs>
       </w:pPr>
-      <w:r>
-        <w:t>5.2. Kỹ năng nào còn giá trị trong 3–5 năm tới (Q9)</w:t>
-        <w:tab/>
-        <w:t>29</w:t>
-      </w:r>
+      <w:hyperlink w:anchor="_Toc2896829126" w:history="1">
+        <w:r>
+          <w:t xml:space="preserve">5.2. Kỹ năng nào còn giá trị trong 3–5 năm tới (Q9)</w:t>
+        </w:r>
+        <w:r>
+          <w:tab/>
+        </w:r>
+        <w:r>
+          <w:t xml:space="preserve">29</w:t>
+        </w:r>
+      </w:hyperlink>
     </w:p>
     <w:p>
       <w:pPr>
@@ -2643,11 +2848,17 @@
           <w:tab w:pos="9061" w:val="right" w:leader="dot"/>
         </w:tabs>
       </w:pPr>
-      <w:r>
-        <w:t>5.3. Câu chuyện dữ liệu tổng hợp</w:t>
-        <w:tab/>
-        <w:t>31</w:t>
-      </w:r>
+      <w:hyperlink w:anchor="_Toc4264006660" w:history="1">
+        <w:r>
+          <w:t xml:space="preserve">5.3. Câu chuyện dữ liệu tổng hợp</w:t>
+        </w:r>
+        <w:r>
+          <w:tab/>
+        </w:r>
+        <w:r>
+          <w:t xml:space="preserve">31</w:t>
+        </w:r>
+      </w:hyperlink>
     </w:p>
     <w:p>
       <w:pPr>
@@ -2656,11 +2867,17 @@
           <w:tab w:pos="9061" w:val="right" w:leader="dot"/>
         </w:tabs>
       </w:pPr>
-      <w:r>
-        <w:t>CHƯƠNG 6. KẾT LUẬN VÀ HẠN CHẾ</w:t>
-        <w:tab/>
-        <w:t>33</w:t>
-      </w:r>
+      <w:hyperlink w:anchor="_Toc3623029765" w:history="1">
+        <w:r>
+          <w:t xml:space="preserve">CHƯƠNG 6. KẾT LUẬN VÀ HẠN CHẾ</w:t>
+        </w:r>
+        <w:r>
+          <w:tab/>
+        </w:r>
+        <w:r>
+          <w:t xml:space="preserve">33</w:t>
+        </w:r>
+      </w:hyperlink>
     </w:p>
     <w:p>
       <w:pPr>
@@ -2669,11 +2886,17 @@
           <w:tab w:pos="9061" w:val="right" w:leader="dot"/>
         </w:tabs>
       </w:pPr>
-      <w:r>
-        <w:t>6.1. Kết luận</w:t>
-        <w:tab/>
-        <w:t>33</w:t>
-      </w:r>
+      <w:hyperlink w:anchor="_Toc3070284381" w:history="1">
+        <w:r>
+          <w:t xml:space="preserve">6.1. Kết luận</w:t>
+        </w:r>
+        <w:r>
+          <w:tab/>
+        </w:r>
+        <w:r>
+          <w:t xml:space="preserve">33</w:t>
+        </w:r>
+      </w:hyperlink>
     </w:p>
     <w:p>
       <w:pPr>
@@ -2682,11 +2905,17 @@
           <w:tab w:pos="9061" w:val="right" w:leader="dot"/>
         </w:tabs>
       </w:pPr>
-      <w:r>
-        <w:t>6.2. Khuyến nghị cho sinh viên và lập trình viên mới ở Việt Nam</w:t>
-        <w:tab/>
-        <w:t>33</w:t>
-      </w:r>
+      <w:hyperlink w:anchor="_Toc1338042166" w:history="1">
+        <w:r>
+          <w:t xml:space="preserve">6.2. Khuyến nghị cho sinh viên và lập trình viên mới ở Việt Nam</w:t>
+        </w:r>
+        <w:r>
+          <w:tab/>
+        </w:r>
+        <w:r>
+          <w:t xml:space="preserve">33</w:t>
+        </w:r>
+      </w:hyperlink>
     </w:p>
     <w:p>
       <w:pPr>
@@ -2695,11 +2924,17 @@
           <w:tab w:pos="9061" w:val="right" w:leader="dot"/>
         </w:tabs>
       </w:pPr>
-      <w:r>
-        <w:t>6.3. Hạn chế</w:t>
-        <w:tab/>
-        <w:t>33</w:t>
-      </w:r>
+      <w:hyperlink w:anchor="_Toc3010280920" w:history="1">
+        <w:r>
+          <w:t xml:space="preserve">6.3. Hạn chế</w:t>
+        </w:r>
+        <w:r>
+          <w:tab/>
+        </w:r>
+        <w:r>
+          <w:t xml:space="preserve">33</w:t>
+        </w:r>
+      </w:hyperlink>
     </w:p>
     <w:p>
       <w:pPr>
@@ -2708,11 +2943,17 @@
           <w:tab w:pos="9061" w:val="right" w:leader="dot"/>
         </w:tabs>
       </w:pPr>
-      <w:r>
-        <w:t>6.4. Hướng phát triển</w:t>
-        <w:tab/>
-        <w:t>33</w:t>
-      </w:r>
+      <w:hyperlink w:anchor="_Toc2224724612" w:history="1">
+        <w:r>
+          <w:t xml:space="preserve">6.4. Hướng phát triển</w:t>
+        </w:r>
+        <w:r>
+          <w:tab/>
+        </w:r>
+        <w:r>
+          <w:t xml:space="preserve">33</w:t>
+        </w:r>
+      </w:hyperlink>
     </w:p>
     <w:p>
       <w:pPr>
@@ -2721,11 +2962,17 @@
           <w:tab w:pos="9061" w:val="right" w:leader="dot"/>
         </w:tabs>
       </w:pPr>
-      <w:r>
-        <w:t>TÀI LIỆU THAM KHẢO</w:t>
-        <w:tab/>
-        <w:t>35</w:t>
-      </w:r>
+      <w:hyperlink w:anchor="_Toc1238319245" w:history="1">
+        <w:r>
+          <w:t xml:space="preserve">TÀI LIỆU THAM KHẢO</w:t>
+        </w:r>
+        <w:r>
+          <w:tab/>
+        </w:r>
+        <w:r>
+          <w:t xml:space="preserve">35</w:t>
+        </w:r>
+      </w:hyperlink>
     </w:p>
     <w:p>
       <w:pPr>
@@ -2734,11 +2981,17 @@
           <w:tab w:pos="9061" w:val="right" w:leader="dot"/>
         </w:tabs>
       </w:pPr>
-      <w:r>
-        <w:t>PHỤ LỤC</w:t>
-        <w:tab/>
-        <w:t>36</w:t>
-      </w:r>
+      <w:hyperlink w:anchor="_Toc2478337453" w:history="1">
+        <w:r>
+          <w:t xml:space="preserve">PHỤ LỤC</w:t>
+        </w:r>
+        <w:r>
+          <w:tab/>
+        </w:r>
+        <w:r>
+          <w:t xml:space="preserve">36</w:t>
+        </w:r>
+      </w:hyperlink>
     </w:p>
     <w:p>
       <w:pPr>
@@ -2747,11 +3000,17 @@
           <w:tab w:pos="9061" w:val="right" w:leader="dot"/>
         </w:tabs>
       </w:pPr>
-      <w:r>
-        <w:t>Phụ lục A. Bảng đầy đủ các ngôn ngữ</w:t>
-        <w:tab/>
-        <w:t>36</w:t>
-      </w:r>
+      <w:hyperlink w:anchor="_Toc1798744690" w:history="1">
+        <w:r>
+          <w:t xml:space="preserve">Phụ lục A. Bảng đầy đủ các ngôn ngữ</w:t>
+        </w:r>
+        <w:r>
+          <w:tab/>
+        </w:r>
+        <w:r>
+          <w:t xml:space="preserve">36</w:t>
+        </w:r>
+      </w:hyperlink>
     </w:p>
     <w:p>
       <w:pPr>
@@ -2760,11 +3019,17 @@
           <w:tab w:pos="9061" w:val="right" w:leader="dot"/>
         </w:tabs>
       </w:pPr>
-      <w:r>
-        <w:t>Phụ lục B. Median lương theo nước</w:t>
-        <w:tab/>
-        <w:t>37</w:t>
-      </w:r>
+      <w:hyperlink w:anchor="_Toc1026530522" w:history="1">
+        <w:r>
+          <w:t xml:space="preserve">Phụ lục B. Median lương theo nước</w:t>
+        </w:r>
+        <w:r>
+          <w:tab/>
+        </w:r>
+        <w:r>
+          <w:t xml:space="preserve">37</w:t>
+        </w:r>
+      </w:hyperlink>
     </w:p>
     <w:p>
       <w:pPr>
@@ -2773,11 +3038,17 @@
           <w:tab w:pos="9061" w:val="right" w:leader="dot"/>
         </w:tabs>
       </w:pPr>
-      <w:r>
-        <w:t>Phụ lục C. Hệ số hồi quy theo ngôn ngữ</w:t>
-        <w:tab/>
-        <w:t>39</w:t>
-      </w:r>
+      <w:hyperlink w:anchor="_Toc256363759" w:history="1">
+        <w:r>
+          <w:t xml:space="preserve">Phụ lục C. Hệ số hồi quy theo ngôn ngữ</w:t>
+        </w:r>
+        <w:r>
+          <w:tab/>
+        </w:r>
+        <w:r>
+          <w:t xml:space="preserve">39</w:t>
+        </w:r>
+      </w:hyperlink>
     </w:p>
     <w:p>
       <w:pPr>
@@ -2786,10 +3057,19 @@
           <w:tab w:pos="9061" w:val="right" w:leader="dot"/>
         </w:tabs>
       </w:pPr>
-      <w:r>
-        <w:t>Phụ lục D. Từ khóa trong câu trả lời về kỹ năng</w:t>
-        <w:tab/>
-        <w:t>40</w:t>
+      <w:hyperlink w:anchor="_Toc4199523761" w:history="1">
+        <w:r>
+          <w:t xml:space="preserve">Phụ lục D. Từ khóa trong câu trả lời về kỹ năng</w:t>
+        </w:r>
+        <w:r>
+          <w:tab/>
+        </w:r>
+        <w:r>
+          <w:t xml:space="preserve">40</w:t>
+        </w:r>
+      </w:hyperlink>
+      <w:r>
+        <w:fldChar w:fldCharType="end"/>
       </w:r>
     </w:p>
     <w:p>
@@ -2797,10 +3077,12 @@
         <w:pStyle w:val="section"/>
         <w:pageBreakBefore/>
       </w:pPr>
+      <w:bookmarkStart w:id="2" w:name="_Toc393368658"/>
       <w:r>
         <w:rPr/>
         <w:t>DANH MỤC BẢNG</w:t>
       </w:r>
+      <w:bookmarkEnd w:id="2"/>
     </w:p>
     <w:p>
       <w:pPr>
@@ -2810,10 +3092,25 @@
         </w:tabs>
       </w:pPr>
       <w:r>
-        <w:t>Bảng 2.1: Các biến được sử dụng và tỷ lệ người có trả lời.</w:t>
-        <w:tab/>
-        <w:t>4</w:t>
-      </w:r>
+        <w:fldChar w:fldCharType="begin"/>
+      </w:r>
+      <w:r>
+        <w:instrText xml:space="preserve"> TOC \f T \h \z </w:instrText>
+      </w:r>
+      <w:r>
+        <w:fldChar w:fldCharType="separate"/>
+      </w:r>
+      <w:hyperlink w:anchor="_Toc2854989561" w:history="1">
+        <w:r>
+          <w:t xml:space="preserve">Bảng 2.1: Các biến được sử dụng và tỷ lệ người có trả lời.</w:t>
+        </w:r>
+        <w:r>
+          <w:tab/>
+        </w:r>
+        <w:r>
+          <w:t xml:space="preserve">4</w:t>
+        </w:r>
+      </w:hyperlink>
     </w:p>
     <w:p>
       <w:pPr>
@@ -2822,11 +3119,17 @@
           <w:tab w:pos="9061" w:val="right" w:leader="dot"/>
         </w:tabs>
       </w:pPr>
-      <w:r>
-        <w:t>Bảng 2.2: Quy tắc làm sạch và số dòng còn lại.</w:t>
-        <w:tab/>
-        <w:t>5</w:t>
-      </w:r>
+      <w:hyperlink w:anchor="_Toc4168080369" w:history="1">
+        <w:r>
+          <w:t xml:space="preserve">Bảng 2.2: Quy tắc làm sạch và số dòng còn lại.</w:t>
+        </w:r>
+        <w:r>
+          <w:tab/>
+        </w:r>
+        <w:r>
+          <w:t xml:space="preserve">5</w:t>
+        </w:r>
+      </w:hyperlink>
     </w:p>
     <w:p>
       <w:pPr>
@@ -2835,11 +3138,17 @@
           <w:tab w:pos="9061" w:val="right" w:leader="dot"/>
         </w:tabs>
       </w:pPr>
-      <w:r>
-        <w:t>Bảng 3.1: 12 ngôn ngữ phổ biến nhất: đang dùng, muốn dùng, ngưỡng mộ và chênh lệch (điểm %).</w:t>
-        <w:tab/>
-        <w:t>13</w:t>
-      </w:r>
+      <w:hyperlink w:anchor="_Toc1381531766" w:history="1">
+        <w:r>
+          <w:t xml:space="preserve">Bảng 3.1: 12 ngôn ngữ phổ biến nhất: đang dùng, muốn dùng, ngưỡng mộ và chênh lệch (điểm %).</w:t>
+        </w:r>
+        <w:r>
+          <w:tab/>
+        </w:r>
+        <w:r>
+          <w:t xml:space="preserve">13</w:t>
+        </w:r>
+      </w:hyperlink>
     </w:p>
     <w:p>
       <w:pPr>
@@ -2848,11 +3157,17 @@
           <w:tab w:pos="9061" w:val="right" w:leader="dot"/>
         </w:tabs>
       </w:pPr>
-      <w:r>
-        <w:t>Bảng 4.1: Median lương và cỡ mẫu theo vai trò.</w:t>
-        <w:tab/>
-        <w:t>18</w:t>
-      </w:r>
+      <w:hyperlink w:anchor="_Toc2005663919" w:history="1">
+        <w:r>
+          <w:t xml:space="preserve">Bảng 4.1: Median lương và cỡ mẫu theo vai trò.</w:t>
+        </w:r>
+        <w:r>
+          <w:tab/>
+        </w:r>
+        <w:r>
+          <w:t xml:space="preserve">18</w:t>
+        </w:r>
+      </w:hyperlink>
     </w:p>
     <w:p>
       <w:pPr>
@@ -2861,11 +3176,17 @@
           <w:tab w:pos="9061" w:val="right" w:leader="dot"/>
         </w:tabs>
       </w:pPr>
-      <w:r>
-        <w:t>Bảng 4.2: Median lương theo nhóm năm kinh nghiệm (WorkExp).</w:t>
-        <w:tab/>
-        <w:t>19</w:t>
-      </w:r>
+      <w:hyperlink w:anchor="_Toc4029109411" w:history="1">
+        <w:r>
+          <w:t xml:space="preserve">Bảng 4.2: Median lương theo nhóm năm kinh nghiệm (WorkExp).</w:t>
+        </w:r>
+        <w:r>
+          <w:tab/>
+        </w:r>
+        <w:r>
+          <w:t xml:space="preserve">19</w:t>
+        </w:r>
+      </w:hyperlink>
     </w:p>
     <w:p>
       <w:pPr>
@@ -2874,11 +3195,17 @@
           <w:tab w:pos="9061" w:val="right" w:leader="dot"/>
         </w:tabs>
       </w:pPr>
-      <w:r>
-        <w:t>Bảng 4.3: R² của các mô hình hồi quy log(lương) và phần tăng thêm.</w:t>
-        <w:tab/>
-        <w:t>22</w:t>
-      </w:r>
+      <w:hyperlink w:anchor="_Toc703461009" w:history="1">
+        <w:r>
+          <w:t xml:space="preserve">Bảng 4.3: R² của các mô hình hồi quy log(lương) và phần tăng thêm.</w:t>
+        </w:r>
+        <w:r>
+          <w:tab/>
+        </w:r>
+        <w:r>
+          <w:t xml:space="preserve">22</w:t>
+        </w:r>
+      </w:hyperlink>
     </w:p>
     <w:p>
       <w:pPr>
@@ -2887,11 +3214,17 @@
           <w:tab w:pos="9061" w:val="right" w:leader="dot"/>
         </w:tabs>
       </w:pPr>
-      <w:r>
-        <w:t>Bảng 4.4: 10 nước có median cao nhất và 10 nước thấp nhất.</w:t>
-        <w:tab/>
-        <w:t>25</w:t>
-      </w:r>
+      <w:hyperlink w:anchor="_Toc1447259553" w:history="1">
+        <w:r>
+          <w:t xml:space="preserve">Bảng 4.4: 10 nước có median cao nhất và 10 nước thấp nhất.</w:t>
+        </w:r>
+        <w:r>
+          <w:tab/>
+        </w:r>
+        <w:r>
+          <w:t xml:space="preserve">25</w:t>
+        </w:r>
+      </w:hyperlink>
     </w:p>
     <w:p>
       <w:pPr>
@@ -2900,11 +3233,17 @@
           <w:tab w:pos="9061" w:val="right" w:leader="dot"/>
         </w:tabs>
       </w:pPr>
-      <w:r>
-        <w:t>Bảng 4.5: Việt Nam và một số nước chọn để so sánh (đủ 30 dòng lương).</w:t>
-        <w:tab/>
-        <w:t>25</w:t>
-      </w:r>
+      <w:hyperlink w:anchor="_Toc3729208642" w:history="1">
+        <w:r>
+          <w:t xml:space="preserve">Bảng 4.5: Việt Nam và một số nước chọn để so sánh (đủ 30 dòng lương).</w:t>
+        </w:r>
+        <w:r>
+          <w:tab/>
+        </w:r>
+        <w:r>
+          <w:t xml:space="preserve">25</w:t>
+        </w:r>
+      </w:hyperlink>
     </w:p>
     <w:p>
       <w:pPr>
@@ -2913,11 +3252,17 @@
           <w:tab w:pos="9061" w:val="right" w:leader="dot"/>
         </w:tabs>
       </w:pPr>
-      <w:r>
-        <w:t>Bảng 4.6: Hồ sơ 12 vai trò: lương, kinh nghiệm, dùng AI hằng ngày và hài lòng công việc.</w:t>
-        <w:tab/>
-        <w:t>28</w:t>
-      </w:r>
+      <w:hyperlink w:anchor="_Toc3569865858" w:history="1">
+        <w:r>
+          <w:t xml:space="preserve">Bảng 4.6: Hồ sơ 12 vai trò: lương, kinh nghiệm, dùng AI hằng ngày và hài lòng công việc.</w:t>
+        </w:r>
+        <w:r>
+          <w:tab/>
+        </w:r>
+        <w:r>
+          <w:t xml:space="preserve">28</w:t>
+        </w:r>
+      </w:hyperlink>
     </w:p>
     <w:p>
       <w:pPr>
@@ -2926,11 +3271,17 @@
           <w:tab w:pos="9061" w:val="right" w:leader="dot"/>
         </w:tabs>
       </w:pPr>
-      <w:r>
-        <w:t>Bảng 5.1: 15 từ khóa xuất hiện nhiều nhất trong câu trả lời về kỹ năng.</w:t>
-        <w:tab/>
-        <w:t>30</w:t>
-      </w:r>
+      <w:hyperlink w:anchor="_Toc805354525" w:history="1">
+        <w:r>
+          <w:t xml:space="preserve">Bảng 5.1: 15 từ khóa xuất hiện nhiều nhất trong câu trả lời về kỹ năng.</w:t>
+        </w:r>
+        <w:r>
+          <w:tab/>
+        </w:r>
+        <w:r>
+          <w:t xml:space="preserve">30</w:t>
+        </w:r>
+      </w:hyperlink>
     </w:p>
     <w:p>
       <w:pPr>
@@ -2939,11 +3290,17 @@
           <w:tab w:pos="9061" w:val="right" w:leader="dot"/>
         </w:tabs>
       </w:pPr>
-      <w:r>
-        <w:t>Bảng PL.1: 42 ngôn ngữ: đang dùng, muốn dùng, ngưỡng mộ.</w:t>
-        <w:tab/>
-        <w:t>36</w:t>
-      </w:r>
+      <w:hyperlink w:anchor="_Toc3304300766" w:history="1">
+        <w:r>
+          <w:t xml:space="preserve">Bảng PL.1: 42 ngôn ngữ: đang dùng, muốn dùng, ngưỡng mộ.</w:t>
+        </w:r>
+        <w:r>
+          <w:tab/>
+        </w:r>
+        <w:r>
+          <w:t xml:space="preserve">36</w:t>
+        </w:r>
+      </w:hyperlink>
     </w:p>
     <w:p>
       <w:pPr>
@@ -2952,11 +3309,17 @@
           <w:tab w:pos="9061" w:val="right" w:leader="dot"/>
         </w:tabs>
       </w:pPr>
-      <w:r>
-        <w:t>Bảng PL.2: Median lương của 62 nước.</w:t>
-        <w:tab/>
-        <w:t>37</w:t>
-      </w:r>
+      <w:hyperlink w:anchor="_Toc3985055823" w:history="1">
+        <w:r>
+          <w:t xml:space="preserve">Bảng PL.2: Median lương của 62 nước.</w:t>
+        </w:r>
+        <w:r>
+          <w:tab/>
+        </w:r>
+        <w:r>
+          <w:t xml:space="preserve">37</w:t>
+        </w:r>
+      </w:hyperlink>
     </w:p>
     <w:p>
       <w:pPr>
@@ -2965,11 +3328,17 @@
           <w:tab w:pos="9061" w:val="right" w:leader="dot"/>
         </w:tabs>
       </w:pPr>
-      <w:r>
-        <w:t>Bảng PL.3: Chênh lệch lương (%) đi cùng việc dùng ngôn ngữ, đã kiểm soát nước và kinh nghiệm.</w:t>
-        <w:tab/>
-        <w:t>40</w:t>
-      </w:r>
+      <w:hyperlink w:anchor="_Toc3253213675" w:history="1">
+        <w:r>
+          <w:t xml:space="preserve">Bảng PL.3: Chênh lệch lương (%) đi cùng việc dùng ngôn ngữ, đã kiểm soát nước và kinh nghiệm.</w:t>
+        </w:r>
+        <w:r>
+          <w:tab/>
+        </w:r>
+        <w:r>
+          <w:t xml:space="preserve">40</w:t>
+        </w:r>
+      </w:hyperlink>
     </w:p>
     <w:p>
       <w:pPr>
@@ -2978,10 +3347,19 @@
           <w:tab w:pos="9061" w:val="right" w:leader="dot"/>
         </w:tabs>
       </w:pPr>
-      <w:r>
-        <w:t>Bảng PL.4: 30 từ khóa xuất hiện nhiều nhất.</w:t>
-        <w:tab/>
-        <w:t>40</w:t>
+      <w:hyperlink w:anchor="_Toc1033398168" w:history="1">
+        <w:r>
+          <w:t xml:space="preserve">Bảng PL.4: 30 từ khóa xuất hiện nhiều nhất.</w:t>
+        </w:r>
+        <w:r>
+          <w:tab/>
+        </w:r>
+        <w:r>
+          <w:t xml:space="preserve">40</w:t>
+        </w:r>
+      </w:hyperlink>
+      <w:r>
+        <w:fldChar w:fldCharType="end"/>
       </w:r>
     </w:p>
     <w:p>
@@ -2989,10 +3367,12 @@
         <w:pStyle w:val="section"/>
         <w:pageBreakBefore/>
       </w:pPr>
+      <w:bookmarkStart w:id="3" w:name="_Toc2974129692"/>
       <w:r>
         <w:rPr/>
         <w:t>DANH MỤC HÌNH</w:t>
       </w:r>
+      <w:bookmarkEnd w:id="3"/>
     </w:p>
     <w:p>
       <w:pPr>
@@ -3002,10 +3382,25 @@
         </w:tabs>
       </w:pPr>
       <w:r>
-        <w:t>Hình 2.1: 76% người trả lời là lập trình viên chuyên nghiệp.</w:t>
-        <w:tab/>
-        <w:t>7</w:t>
-      </w:r>
+        <w:fldChar w:fldCharType="begin"/>
+      </w:r>
+      <w:r>
+        <w:instrText xml:space="preserve"> TOC \f F \h \z </w:instrText>
+      </w:r>
+      <w:r>
+        <w:fldChar w:fldCharType="separate"/>
+      </w:r>
+      <w:hyperlink w:anchor="_Toc533178864" w:history="1">
+        <w:r>
+          <w:t xml:space="preserve">Hình 2.1: 76% người trả lời là lập trình viên chuyên nghiệp.</w:t>
+        </w:r>
+        <w:r>
+          <w:tab/>
+        </w:r>
+        <w:r>
+          <w:t xml:space="preserve">7</w:t>
+        </w:r>
+      </w:hyperlink>
     </w:p>
     <w:p>
       <w:pPr>
@@ -3014,11 +3409,17 @@
           <w:tab w:pos="9061" w:val="right" w:leader="dot"/>
         </w:tabs>
       </w:pPr>
-      <w:r>
-        <w:t>Hình 2.2: Nhóm tuổi 25–34 chiếm 34% người trả lời.</w:t>
-        <w:tab/>
-        <w:t>8</w:t>
-      </w:r>
+      <w:hyperlink w:anchor="_Toc1842086776" w:history="1">
+        <w:r>
+          <w:t xml:space="preserve">Hình 2.2: Nhóm tuổi 25–34 chiếm 34% người trả lời.</w:t>
+        </w:r>
+        <w:r>
+          <w:tab/>
+        </w:r>
+        <w:r>
+          <w:t xml:space="preserve">8</w:t>
+        </w:r>
+      </w:hyperlink>
     </w:p>
     <w:p>
       <w:pPr>
@@ -3027,11 +3428,17 @@
           <w:tab w:pos="9061" w:val="right" w:leader="dot"/>
         </w:tabs>
       </w:pPr>
-      <w:r>
-        <w:t>Hình 2.3: Mẫu lệch về United States, Germany, India; Việt Nam chỉ có 145 phản hồi.</w:t>
-        <w:tab/>
-        <w:t>8</w:t>
-      </w:r>
+      <w:hyperlink w:anchor="_Toc3350291111" w:history="1">
+        <w:r>
+          <w:t xml:space="preserve">Hình 2.3: Mẫu lệch về United States, Germany, India; Việt Nam chỉ có 145 phản hồi.</w:t>
+        </w:r>
+        <w:r>
+          <w:tab/>
+        </w:r>
+        <w:r>
+          <w:t xml:space="preserve">8</w:t>
+        </w:r>
+      </w:hyperlink>
     </w:p>
     <w:p>
       <w:pPr>
@@ -3040,11 +3447,17 @@
           <w:tab w:pos="9061" w:val="right" w:leader="dot"/>
         </w:tabs>
       </w:pPr>
-      <w:r>
-        <w:t>Hình 3.1: JavaScript, HTML/CSS và SQL là ba ngôn ngữ được dùng nhiều nhất.</w:t>
-        <w:tab/>
-        <w:t>10</w:t>
-      </w:r>
+      <w:hyperlink w:anchor="_Toc646432681" w:history="1">
+        <w:r>
+          <w:t xml:space="preserve">Hình 3.1: JavaScript, HTML/CSS và SQL là ba ngôn ngữ được dùng nhiều nhất.</w:t>
+        </w:r>
+        <w:r>
+          <w:tab/>
+        </w:r>
+        <w:r>
+          <w:t xml:space="preserve">10</w:t>
+        </w:r>
+      </w:hyperlink>
     </w:p>
     <w:p>
       <w:pPr>
@@ -3053,11 +3466,17 @@
           <w:tab w:pos="9061" w:val="right" w:leader="dot"/>
         </w:tabs>
       </w:pPr>
-      <w:r>
-        <w:t>Hình 3.2: JavaScript, PostgreSQL, Docker và Node.js dẫn đầu từng nhóm công nghệ.</w:t>
-        <w:tab/>
-        <w:t>11</w:t>
-      </w:r>
+      <w:hyperlink w:anchor="_Toc2880975574" w:history="1">
+        <w:r>
+          <w:t xml:space="preserve">Hình 3.2: JavaScript, PostgreSQL, Docker và Node.js dẫn đầu từng nhóm công nghệ.</w:t>
+        </w:r>
+        <w:r>
+          <w:tab/>
+        </w:r>
+        <w:r>
+          <w:t xml:space="preserve">11</w:t>
+        </w:r>
+      </w:hyperlink>
     </w:p>
     <w:p>
       <w:pPr>
@@ -3066,11 +3485,17 @@
           <w:tab w:pos="9061" w:val="right" w:leader="dot"/>
         </w:tabs>
       </w:pPr>
-      <w:r>
-        <w:t>Hình 3.3: PostgreSQL, Docker và Node.js dẫn đầu CSDL, cloud và web framework.</w:t>
-        <w:tab/>
-        <w:t>11</w:t>
-      </w:r>
+      <w:hyperlink w:anchor="_Toc291862305" w:history="1">
+        <w:r>
+          <w:t xml:space="preserve">Hình 3.3: PostgreSQL, Docker và Node.js dẫn đầu CSDL, cloud và web framework.</w:t>
+        </w:r>
+        <w:r>
+          <w:tab/>
+        </w:r>
+        <w:r>
+          <w:t xml:space="preserve">11</w:t>
+        </w:r>
+      </w:hyperlink>
     </w:p>
     <w:p>
       <w:pPr>
@@ -3079,11 +3504,17 @@
           <w:tab w:pos="9061" w:val="right" w:leader="dot"/>
         </w:tabs>
       </w:pPr>
-      <w:r>
-        <w:t>Hình 3.4: JavaScript dùng nhiều nhất nhưng chỉ 64% ngưỡng mộ; Rust đạt 85%.</w:t>
-        <w:tab/>
-        <w:t>12</w:t>
-      </w:r>
+      <w:hyperlink w:anchor="_Toc1502257151" w:history="1">
+        <w:r>
+          <w:t xml:space="preserve">Hình 3.4: JavaScript dùng nhiều nhất nhưng chỉ 64% ngưỡng mộ; Rust đạt 85%.</w:t>
+        </w:r>
+        <w:r>
+          <w:tab/>
+        </w:r>
+        <w:r>
+          <w:t xml:space="preserve">12</w:t>
+        </w:r>
+      </w:hyperlink>
     </w:p>
     <w:p>
       <w:pPr>
@@ -3092,11 +3523,17 @@
           <w:tab w:pos="9061" w:val="right" w:leader="dot"/>
         </w:tabs>
       </w:pPr>
-      <w:r>
-        <w:t>Hình 3.5: Rust được muốn dùng vượt mức đang dùng 19,3 điểm %, JavaScript thấp hơn 27,2 điểm %.</w:t>
-        <w:tab/>
-        <w:t>13</w:t>
-      </w:r>
+      <w:hyperlink w:anchor="_Toc2100187553" w:history="1">
+        <w:r>
+          <w:t xml:space="preserve">Hình 3.5: Rust được muốn dùng vượt mức đang dùng 19,3 điểm %, JavaScript thấp hơn 27,2 điểm %.</w:t>
+        </w:r>
+        <w:r>
+          <w:tab/>
+        </w:r>
+        <w:r>
+          <w:t xml:space="preserve">13</w:t>
+        </w:r>
+      </w:hyperlink>
     </w:p>
     <w:p>
       <w:pPr>
@@ -3105,11 +3542,17 @@
           <w:tab w:pos="9061" w:val="right" w:leader="dot"/>
         </w:tabs>
       </w:pPr>
-      <w:r>
-        <w:t>Hình 3.6: Có 5 cụm ngôn ngữ hay được dùng chung.</w:t>
-        <w:tab/>
-        <w:t>14</w:t>
-      </w:r>
+      <w:hyperlink w:anchor="_Toc2372507050" w:history="1">
+        <w:r>
+          <w:t xml:space="preserve">Hình 3.6: Có 5 cụm ngôn ngữ hay được dùng chung.</w:t>
+        </w:r>
+        <w:r>
+          <w:tab/>
+        </w:r>
+        <w:r>
+          <w:t xml:space="preserve">14</w:t>
+        </w:r>
+      </w:hyperlink>
     </w:p>
     <w:p>
       <w:pPr>
@@ -3118,11 +3561,17 @@
           <w:tab w:pos="9061" w:val="right" w:leader="dot"/>
         </w:tabs>
       </w:pPr>
-      <w:r>
-        <w:t>Hình 3.7: Người dùng JavaScript thường muốn dùng thêm HTML/CSS (52%).</w:t>
-        <w:tab/>
-        <w:t>15</w:t>
-      </w:r>
+      <w:hyperlink w:anchor="_Toc2136881815" w:history="1">
+        <w:r>
+          <w:t xml:space="preserve">Hình 3.7: Người dùng JavaScript thường muốn dùng thêm HTML/CSS (52%).</w:t>
+        </w:r>
+        <w:r>
+          <w:tab/>
+        </w:r>
+        <w:r>
+          <w:t xml:space="preserve">15</w:t>
+        </w:r>
+      </w:hyperlink>
     </w:p>
     <w:p>
       <w:pPr>
@@ -3131,11 +3580,17 @@
           <w:tab w:pos="9061" w:val="right" w:leader="dot"/>
         </w:tabs>
       </w:pPr>
-      <w:r>
-        <w:t>Hình 4.1: Median lương 79.578 USD thấp hơn mean 92.934 USD: phân phối lệch phải.</w:t>
-        <w:tab/>
-        <w:t>17</w:t>
-      </w:r>
+      <w:hyperlink w:anchor="_Toc1674276452" w:history="1">
+        <w:r>
+          <w:t xml:space="preserve">Hình 4.1: Median lương 79.578 USD thấp hơn mean 92.934 USD: phân phối lệch phải.</w:t>
+        </w:r>
+        <w:r>
+          <w:tab/>
+        </w:r>
+        <w:r>
+          <w:t xml:space="preserve">17</w:t>
+        </w:r>
+      </w:hyperlink>
     </w:p>
     <w:p>
       <w:pPr>
@@ -3144,11 +3599,17 @@
           <w:tab w:pos="9061" w:val="right" w:leader="dot"/>
         </w:tabs>
       </w:pPr>
-      <w:r>
-        <w:t>Hình 4.2: Engineering manager có median lương cao nhất (133.417 USD), gấp 2,0 lần Front-end.</w:t>
-        <w:tab/>
-        <w:t>18</w:t>
-      </w:r>
+      <w:hyperlink w:anchor="_Toc3463762891" w:history="1">
+        <w:r>
+          <w:t xml:space="preserve">Hình 4.2: Engineering manager có median lương cao nhất (133.417 USD), gấp 2,0 lần Front-end.</w:t>
+        </w:r>
+        <w:r>
+          <w:tab/>
+        </w:r>
+        <w:r>
+          <w:t xml:space="preserve">18</w:t>
+        </w:r>
+      </w:hyperlink>
     </w:p>
     <w:p>
       <w:pPr>
@@ -3157,11 +3618,17 @@
           <w:tab w:pos="9061" w:val="right" w:leader="dot"/>
         </w:tabs>
       </w:pPr>
-      <w:r>
-        <w:t>Hình 4.3: Median lương tăng từ 28.083 USD (0–2 năm) lên 111.515 USD (21+ năm).</w:t>
-        <w:tab/>
-        <w:t>19</w:t>
-      </w:r>
+      <w:hyperlink w:anchor="_Toc3735082485" w:history="1">
+        <w:r>
+          <w:t xml:space="preserve">Hình 4.3: Median lương tăng từ 28.083 USD (0–2 năm) lên 111.515 USD (21+ năm).</w:t>
+        </w:r>
+        <w:r>
+          <w:tab/>
+        </w:r>
+        <w:r>
+          <w:t xml:space="preserve">19</w:t>
+        </w:r>
+      </w:hyperlink>
     </w:p>
     <w:p>
       <w:pPr>
@@ -3170,11 +3637,17 @@
           <w:tab w:pos="9061" w:val="right" w:leader="dot"/>
         </w:tabs>
       </w:pPr>
-      <w:r>
-        <w:t>Hình 4.4: Giữa 15 ngôn ngữ phổ biến, median lương chênh 49%: từ PHP đến Go.</w:t>
-        <w:tab/>
-        <w:t>20</w:t>
-      </w:r>
+      <w:hyperlink w:anchor="_Toc935326842" w:history="1">
+        <w:r>
+          <w:t xml:space="preserve">Hình 4.4: Giữa 15 ngôn ngữ phổ biến, median lương chênh 49%: từ PHP đến Go.</w:t>
+        </w:r>
+        <w:r>
+          <w:tab/>
+        </w:r>
+        <w:r>
+          <w:t xml:space="preserve">20</w:t>
+        </w:r>
+      </w:hyperlink>
     </w:p>
     <w:p>
       <w:pPr>
@@ -3183,11 +3656,17 @@
           <w:tab w:pos="9061" w:val="right" w:leader="dot"/>
         </w:tabs>
       </w:pPr>
-      <w:r>
-        <w:t>Hình 4.5: Architect có median lương cao nhất ở 10/10 ngôn ngữ được so sánh.</w:t>
-        <w:tab/>
-        <w:t>21</w:t>
-      </w:r>
+      <w:hyperlink w:anchor="_Toc2984389420" w:history="1">
+        <w:r>
+          <w:t xml:space="preserve">Hình 4.5: Architect có median lương cao nhất ở 10/10 ngôn ngữ được so sánh.</w:t>
+        </w:r>
+        <w:r>
+          <w:tab/>
+        </w:r>
+        <w:r>
+          <w:t xml:space="preserve">21</w:t>
+        </w:r>
+      </w:hyperlink>
     </w:p>
     <w:p>
       <w:pPr>
@@ -3196,11 +3675,17 @@
           <w:tab w:pos="9061" w:val="right" w:leader="dot"/>
         </w:tabs>
       </w:pPr>
-      <w:r>
-        <w:t>Hình 4.6: Quốc gia một mình giải thích 45% biến thiên lương; thêm 15 ngôn ngữ chỉ cộng 2,6 điểm phần trăm.</w:t>
-        <w:tab/>
-        <w:t>22</w:t>
-      </w:r>
+      <w:hyperlink w:anchor="_Toc1012992342" w:history="1">
+        <w:r>
+          <w:t xml:space="preserve">Hình 4.6: Quốc gia một mình giải thích 45% biến thiên lương; thêm 15 ngôn ngữ chỉ cộng 2,6 điểm phần trăm.</w:t>
+        </w:r>
+        <w:r>
+          <w:tab/>
+        </w:r>
+        <w:r>
+          <w:t xml:space="preserve">22</w:t>
+        </w:r>
+      </w:hyperlink>
     </w:p>
     <w:p>
       <w:pPr>
@@ -3209,11 +3694,17 @@
           <w:tab w:pos="9061" w:val="right" w:leader="dot"/>
         </w:tabs>
       </w:pPr>
-      <w:r>
-        <w:t>Hình 4.7: Sau khi cố định nước và kinh nghiệm, chênh lệch lương theo ngôn ngữ chỉ từ −21% đến 14%.</w:t>
-        <w:tab/>
-        <w:t>23</w:t>
-      </w:r>
+      <w:hyperlink w:anchor="_Toc1305277471" w:history="1">
+        <w:r>
+          <w:t xml:space="preserve">Hình 4.7: Sau khi cố định nước và kinh nghiệm, chênh lệch lương theo ngôn ngữ chỉ từ −21% đến 14%.</w:t>
+        </w:r>
+        <w:r>
+          <w:tab/>
+        </w:r>
+        <w:r>
+          <w:t xml:space="preserve">23</w:t>
+        </w:r>
+      </w:hyperlink>
     </w:p>
     <w:p>
       <w:pPr>
@@ -3222,11 +3713,17 @@
           <w:tab w:pos="9061" w:val="right" w:leader="dot"/>
         </w:tabs>
       </w:pPr>
-      <w:r>
-        <w:t>Hình 4.8: Median lương cao nhất ở United States (150.000 USD), thấp nhất ở Nigeria (3.874 USD); Việt Nam 11.464 USD.</w:t>
-        <w:tab/>
-        <w:t>24</w:t>
-      </w:r>
+      <w:hyperlink w:anchor="_Toc337426000" w:history="1">
+        <w:r>
+          <w:t xml:space="preserve">Hình 4.8: Median lương cao nhất ở United States (150.000 USD), thấp nhất ở Nigeria (3.874 USD); Việt Nam 11.464 USD.</w:t>
+        </w:r>
+        <w:r>
+          <w:tab/>
+        </w:r>
+        <w:r>
+          <w:t xml:space="preserve">24</w:t>
+        </w:r>
+      </w:hyperlink>
     </w:p>
     <w:p>
       <w:pPr>
@@ -3235,11 +3732,17 @@
           <w:tab w:pos="9061" w:val="right" w:leader="dot"/>
         </w:tabs>
       </w:pPr>
-      <w:r>
-        <w:t>Hình 4.9: Việt Nam xếp thứ 57/62 nước về median lương (11.464 USD), mẫu chỉ 31 người.</w:t>
-        <w:tab/>
-        <w:t>24</w:t>
-      </w:r>
+      <w:hyperlink w:anchor="_Toc961331276" w:history="1">
+        <w:r>
+          <w:t xml:space="preserve">Hình 4.9: Việt Nam xếp thứ 57/62 nước về median lương (11.464 USD), mẫu chỉ 31 người.</w:t>
+        </w:r>
+        <w:r>
+          <w:tab/>
+        </w:r>
+        <w:r>
+          <w:t xml:space="preserve">24</w:t>
+        </w:r>
+      </w:hyperlink>
     </w:p>
     <w:p>
       <w:pPr>
@@ -3248,11 +3751,17 @@
           <w:tab w:pos="9061" w:val="right" w:leader="dot"/>
         </w:tabs>
       </w:pPr>
-      <w:r>
-        <w:t>Hình 4.10: AI/ML engineer dùng AI hằng ngày nhiều nhất (74%), Engineering manager có lương cao nhất.</w:t>
-        <w:tab/>
-        <w:t>27</w:t>
-      </w:r>
+      <w:hyperlink w:anchor="_Toc1509602278" w:history="1">
+        <w:r>
+          <w:t xml:space="preserve">Hình 4.10: AI/ML engineer dùng AI hằng ngày nhiều nhất (74%), Engineering manager có lương cao nhất.</w:t>
+        </w:r>
+        <w:r>
+          <w:tab/>
+        </w:r>
+        <w:r>
+          <w:t xml:space="preserve">27</w:t>
+        </w:r>
+      </w:hyperlink>
     </w:p>
     <w:p>
       <w:pPr>
@@ -3261,11 +3770,17 @@
           <w:tab w:pos="9061" w:val="right" w:leader="dot"/>
         </w:tabs>
       </w:pPr>
-      <w:r>
-        <w:t>Hình 4.11: Giá trị thật của 4 chỉ số: vai trò tô màu là 3 vai trò trong spider.</w:t>
-        <w:tab/>
-        <w:t>27</w:t>
-      </w:r>
+      <w:hyperlink w:anchor="_Toc2568708478" w:history="1">
+        <w:r>
+          <w:t xml:space="preserve">Hình 4.11: Giá trị thật của 4 chỉ số: vai trò tô màu là 3 vai trò trong spider.</w:t>
+        </w:r>
+        <w:r>
+          <w:tab/>
+        </w:r>
+        <w:r>
+          <w:t xml:space="preserve">27</w:t>
+        </w:r>
+      </w:hyperlink>
     </w:p>
     <w:p>
       <w:pPr>
@@ -3274,11 +3789,17 @@
           <w:tab w:pos="9061" w:val="right" w:leader="dot"/>
         </w:tabs>
       </w:pPr>
-      <w:r>
-        <w:t>Hình 5.1: ai, problem, code là những từ được nhắc nhiều nhất khi nói về kỹ năng còn giá trị.</w:t>
-        <w:tab/>
-        <w:t>29</w:t>
-      </w:r>
+      <w:hyperlink w:anchor="_Toc4154492226" w:history="1">
+        <w:r>
+          <w:t xml:space="preserve">Hình 5.1: ai, problem, code là những từ được nhắc nhiều nhất khi nói về kỹ năng còn giá trị.</w:t>
+        </w:r>
+        <w:r>
+          <w:tab/>
+        </w:r>
+        <w:r>
+          <w:t xml:space="preserve">29</w:t>
+        </w:r>
+      </w:hyperlink>
     </w:p>
     <w:p>
       <w:pPr>
@@ -3287,10 +3808,19 @@
           <w:tab w:pos="9061" w:val="right" w:leader="dot"/>
         </w:tabs>
       </w:pPr>
-      <w:r>
-        <w:t>Hình 5.2: Top 20 từ khóa: ai, problem, code, understanding dẫn đầu.</w:t>
-        <w:tab/>
-        <w:t>30</w:t>
+      <w:hyperlink w:anchor="_Toc2827397134" w:history="1">
+        <w:r>
+          <w:t xml:space="preserve">Hình 5.2: Top 20 từ khóa: ai, problem, code, understanding dẫn đầu.</w:t>
+        </w:r>
+        <w:r>
+          <w:tab/>
+        </w:r>
+        <w:r>
+          <w:t xml:space="preserve">30</w:t>
+        </w:r>
+      </w:hyperlink>
+      <w:r>
+        <w:fldChar w:fldCharType="end"/>
       </w:r>
     </w:p>
     <w:p>
@@ -3298,10 +3828,12 @@
         <w:pStyle w:val="section"/>
         <w:pageBreakBefore/>
       </w:pPr>
+      <w:bookmarkStart w:id="4" w:name="_Toc3895705433"/>
       <w:r>
         <w:rPr/>
         <w:t>DANH SÁCH THUẬT NGỮ</w:t>
       </w:r>
+      <w:bookmarkEnd w:id="4"/>
     </w:p>
     <w:tbl>
       <w:tblPr>
@@ -3953,9 +4485,11 @@
         <w:pStyle w:val="section"/>
         <w:pageBreakBefore w:val="0"/>
       </w:pPr>
+      <w:bookmarkStart w:id="5" w:name="_Toc73744571"/>
       <w:r>
         <w:t>TÓM TẮT BÁO CÁO</w:t>
       </w:r>
+      <w:bookmarkEnd w:id="5"/>
     </w:p>
     <w:p>
       <w:r>
@@ -4071,9 +4605,11 @@
           <w:numId w:val="0"/>
         </w:numPr>
       </w:pPr>
+      <w:bookmarkStart w:id="6" w:name="_Toc3544288922"/>
       <w:r>
         <w:t>CHƯƠNG 1. GIỚI THIỆU</w:t>
       </w:r>
+      <w:bookmarkEnd w:id="6"/>
     </w:p>
     <w:p>
       <w:pPr>
@@ -4084,9 +4620,11 @@
           <w:numId w:val="0"/>
         </w:numPr>
       </w:pPr>
+      <w:bookmarkStart w:id="7" w:name="_Toc2615902355"/>
       <w:r>
         <w:t>1.1. Bối cảnh</w:t>
       </w:r>
+      <w:bookmarkEnd w:id="7"/>
     </w:p>
     <w:p>
       <w:r>
@@ -4113,9 +4651,11 @@
           <w:numId w:val="0"/>
         </w:numPr>
       </w:pPr>
+      <w:bookmarkStart w:id="8" w:name="_Toc3708436808"/>
       <w:r>
         <w:t>1.2. Mục tiêu và đối tượng</w:t>
       </w:r>
+      <w:bookmarkEnd w:id="8"/>
     </w:p>
     <w:p>
       <w:r>
@@ -4142,9 +4682,11 @@
           <w:numId w:val="0"/>
         </w:numPr>
       </w:pPr>
+      <w:bookmarkStart w:id="9" w:name="_Toc2781230238"/>
       <w:r>
         <w:t>1.3. Câu hỏi phân tích</w:t>
       </w:r>
+      <w:bookmarkEnd w:id="9"/>
     </w:p>
     <w:p>
       <w:pPr>
@@ -4290,9 +4832,11 @@
           <w:numId w:val="0"/>
         </w:numPr>
       </w:pPr>
+      <w:bookmarkStart w:id="10" w:name="_Toc4111894682"/>
       <w:r>
         <w:t>1.4. Phạm vi và cấu trúc báo cáo</w:t>
       </w:r>
+      <w:bookmarkEnd w:id="10"/>
     </w:p>
     <w:p>
       <w:r>
@@ -4319,9 +4863,11 @@
           <w:numId w:val="0"/>
         </w:numPr>
       </w:pPr>
+      <w:bookmarkStart w:id="11" w:name="_Toc2719321501"/>
       <w:r>
         <w:t>CHƯƠNG 2. DỮ LIỆU VÀ TIỀN XỬ LÝ</w:t>
       </w:r>
+      <w:bookmarkEnd w:id="11"/>
     </w:p>
     <w:p>
       <w:pPr>
@@ -4332,9 +4878,11 @@
           <w:numId w:val="0"/>
         </w:numPr>
       </w:pPr>
+      <w:bookmarkStart w:id="12" w:name="_Toc1014418225"/>
       <w:r>
         <w:t>2.1. Nguồn dữ liệu và cấu trúc</w:t>
       </w:r>
+      <w:bookmarkEnd w:id="12"/>
     </w:p>
     <w:p>
       <w:r>
@@ -4361,9 +4909,11 @@
           <w:numId w:val="0"/>
         </w:numPr>
       </w:pPr>
+      <w:bookmarkStart w:id="13" w:name="_Toc2106933653"/>
       <w:r>
         <w:t>2.2. Các biến được sử dụng</w:t>
       </w:r>
+      <w:bookmarkEnd w:id="13"/>
     </w:p>
     <w:p>
       <w:r>
@@ -4378,8 +4928,19 @@
         <w:pStyle w:val="Caption"/>
         <w:keepNext/>
       </w:pPr>
+      <w:bookmarkStart w:id="14" w:name="_Toc2854989561"/>
       <w:r>
         <w:t>Bảng 2.1: Các biến được sử dụng và tỷ lệ người có trả lời.</w:t>
+      </w:r>
+      <w:bookmarkEnd w:id="14"/>
+      <w:r>
+        <w:fldChar w:fldCharType="begin"/>
+      </w:r>
+      <w:r>
+        <w:instrText xml:space="preserve"> TC "Bảng 2.1: Các biến được sử dụng và tỷ lệ người có trả lời." \f T \l 1 </w:instrText>
+      </w:r>
+      <w:r>
+        <w:fldChar w:fldCharType="end"/>
       </w:r>
     </w:p>
     <w:tbl>
@@ -5305,9 +5866,11 @@
           <w:numId w:val="0"/>
         </w:numPr>
       </w:pPr>
+      <w:bookmarkStart w:id="15" w:name="_Toc1634008197"/>
       <w:r>
         <w:t>2.3. Dữ liệu thiếu</w:t>
       </w:r>
+      <w:bookmarkEnd w:id="15"/>
     </w:p>
     <w:p>
       <w:r>
@@ -5334,9 +5897,11 @@
           <w:numId w:val="0"/>
         </w:numPr>
       </w:pPr>
+      <w:bookmarkStart w:id="16" w:name="_Toc1932709038"/>
       <w:r>
         <w:t>2.4. Quy tắc làm sạch dữ liệu</w:t>
       </w:r>
+      <w:bookmarkEnd w:id="16"/>
     </w:p>
     <w:p>
       <w:r>
@@ -5351,8 +5916,19 @@
         <w:pStyle w:val="Caption"/>
         <w:keepNext/>
       </w:pPr>
+      <w:bookmarkStart w:id="17" w:name="_Toc4168080369"/>
       <w:r>
         <w:t>Bảng 2.2: Quy tắc làm sạch và số dòng còn lại.</w:t>
+      </w:r>
+      <w:bookmarkEnd w:id="17"/>
+      <w:r>
+        <w:fldChar w:fldCharType="begin"/>
+      </w:r>
+      <w:r>
+        <w:instrText xml:space="preserve"> TC "Bảng 2.2: Quy tắc làm sạch và số dòng còn lại." \f T \l 1 </w:instrText>
+      </w:r>
+      <w:r>
+        <w:fldChar w:fldCharType="end"/>
       </w:r>
     </w:p>
     <w:tbl>
@@ -5950,9 +6526,11 @@
           <w:numId w:val="0"/>
         </w:numPr>
       </w:pPr>
+      <w:bookmarkStart w:id="18" w:name="_Toc1204738964"/>
       <w:r>
         <w:t>2.5. Phương pháp</w:t>
       </w:r>
+      <w:bookmarkEnd w:id="18"/>
     </w:p>
     <w:p>
       <w:pPr>
@@ -6069,9 +6647,11 @@
           <w:numId w:val="0"/>
         </w:numPr>
       </w:pPr>
+      <w:bookmarkStart w:id="19" w:name="_Toc433832425"/>
       <w:r>
         <w:t>2.6. Hồ sơ người trả lời (Q1)</w:t>
       </w:r>
+      <w:bookmarkEnd w:id="19"/>
     </w:p>
     <w:p>
       <w:r>
@@ -6139,8 +6719,19 @@
       <w:pPr>
         <w:pStyle w:val="Caption"/>
       </w:pPr>
+      <w:bookmarkStart w:id="20" w:name="_Toc533178864"/>
       <w:r>
         <w:t>Hình 2.1: 76% người trả lời là lập trình viên chuyên nghiệp.</w:t>
+      </w:r>
+      <w:bookmarkEnd w:id="20"/>
+      <w:r>
+        <w:fldChar w:fldCharType="begin"/>
+      </w:r>
+      <w:r>
+        <w:instrText xml:space="preserve"> TC "Hình 2.1: 76% người trả lời là lập trình viên chuyên nghiệp." \f F \l 1 </w:instrText>
+      </w:r>
+      <w:r>
+        <w:fldChar w:fldCharType="end"/>
       </w:r>
     </w:p>
     <w:p>
@@ -6237,8 +6828,19 @@
       <w:pPr>
         <w:pStyle w:val="Caption"/>
       </w:pPr>
+      <w:bookmarkStart w:id="21" w:name="_Toc1842086776"/>
       <w:r>
         <w:t>Hình 2.2: Nhóm tuổi 25–34 chiếm 34% người trả lời.</w:t>
+      </w:r>
+      <w:bookmarkEnd w:id="21"/>
+      <w:r>
+        <w:fldChar w:fldCharType="begin"/>
+      </w:r>
+      <w:r>
+        <w:instrText xml:space="preserve"> TC "Hình 2.2: Nhóm tuổi 25–34 chiếm 34% người trả lời." \f F \l 1 </w:instrText>
+      </w:r>
+      <w:r>
+        <w:fldChar w:fldCharType="end"/>
       </w:r>
     </w:p>
     <w:p>
@@ -6335,8 +6937,19 @@
       <w:pPr>
         <w:pStyle w:val="Caption"/>
       </w:pPr>
+      <w:bookmarkStart w:id="22" w:name="_Toc3350291111"/>
       <w:r>
         <w:t>Hình 2.3: Mẫu lệch về United States, Germany, India; Việt Nam chỉ có 145 phản hồi.</w:t>
+      </w:r>
+      <w:bookmarkEnd w:id="22"/>
+      <w:r>
+        <w:fldChar w:fldCharType="begin"/>
+      </w:r>
+      <w:r>
+        <w:instrText xml:space="preserve"> TC "Hình 2.3: Mẫu lệch về United States, Germany, India; Việt Nam chỉ có 145 phản hồi." \f F \l 1 </w:instrText>
+      </w:r>
+      <w:r>
+        <w:fldChar w:fldCharType="end"/>
       </w:r>
     </w:p>
     <w:p>
@@ -6392,9 +7005,11 @@
           <w:numId w:val="0"/>
         </w:numPr>
       </w:pPr>
+      <w:bookmarkStart w:id="23" w:name="_Toc3846948962"/>
       <w:r>
         <w:t>CHƯƠNG 3. XU HƯỚNG CÔNG NGHỆ</w:t>
       </w:r>
+      <w:bookmarkEnd w:id="23"/>
     </w:p>
     <w:p>
       <w:r>
@@ -6421,9 +7036,11 @@
           <w:numId w:val="0"/>
         </w:numPr>
       </w:pPr>
+      <w:bookmarkStart w:id="24" w:name="_Toc3326192056"/>
       <w:r>
         <w:t>3.1. Công nghệ nào đang được dùng nhiều nhất (Q2)</w:t>
       </w:r>
+      <w:bookmarkEnd w:id="24"/>
     </w:p>
     <w:p>
       <w:r>
@@ -6483,8 +7100,19 @@
       <w:pPr>
         <w:pStyle w:val="Caption"/>
       </w:pPr>
+      <w:bookmarkStart w:id="25" w:name="_Toc646432681"/>
       <w:r>
         <w:t>Hình 3.1: JavaScript, HTML/CSS và SQL là ba ngôn ngữ được dùng nhiều nhất.</w:t>
+      </w:r>
+      <w:bookmarkEnd w:id="25"/>
+      <w:r>
+        <w:fldChar w:fldCharType="begin"/>
+      </w:r>
+      <w:r>
+        <w:instrText xml:space="preserve"> TC "Hình 3.1: JavaScript, HTML/CSS và SQL là ba ngôn ngữ được dùng nhiều nhất." \f F \l 1 </w:instrText>
+      </w:r>
+      <w:r>
+        <w:fldChar w:fldCharType="end"/>
       </w:r>
     </w:p>
     <w:p>
@@ -6589,8 +7217,19 @@
       <w:pPr>
         <w:pStyle w:val="Caption"/>
       </w:pPr>
+      <w:bookmarkStart w:id="26" w:name="_Toc2880975574"/>
       <w:r>
         <w:t>Hình 3.2: JavaScript, PostgreSQL, Docker và Node.js dẫn đầu từng nhóm công nghệ.</w:t>
+      </w:r>
+      <w:bookmarkEnd w:id="26"/>
+      <w:r>
+        <w:fldChar w:fldCharType="begin"/>
+      </w:r>
+      <w:r>
+        <w:instrText xml:space="preserve"> TC "Hình 3.2: JavaScript, PostgreSQL, Docker và Node.js dẫn đầu từng nhóm công nghệ." \f F \l 1 </w:instrText>
+      </w:r>
+      <w:r>
+        <w:fldChar w:fldCharType="end"/>
       </w:r>
     </w:p>
     <w:p>
@@ -6695,8 +7334,19 @@
       <w:pPr>
         <w:pStyle w:val="Caption"/>
       </w:pPr>
+      <w:bookmarkStart w:id="27" w:name="_Toc291862305"/>
       <w:r>
         <w:t>Hình 3.3: PostgreSQL, Docker và Node.js dẫn đầu CSDL, cloud và web framework.</w:t>
+      </w:r>
+      <w:bookmarkEnd w:id="27"/>
+      <w:r>
+        <w:fldChar w:fldCharType="begin"/>
+      </w:r>
+      <w:r>
+        <w:instrText xml:space="preserve"> TC "Hình 3.3: PostgreSQL, Docker và Node.js dẫn đầu CSDL, cloud và web framework." \f F \l 1 </w:instrText>
+      </w:r>
+      <w:r>
+        <w:fldChar w:fldCharType="end"/>
       </w:r>
     </w:p>
     <w:p>
@@ -6752,9 +7402,11 @@
           <w:numId w:val="0"/>
         </w:numPr>
       </w:pPr>
+      <w:bookmarkStart w:id="28" w:name="_Toc2418456719"/>
       <w:r>
         <w:t>3.2. Dùng nhiều có được ngưỡng mộ và muốn dùng nhiều không (Q3)</w:t>
       </w:r>
+      <w:bookmarkEnd w:id="28"/>
     </w:p>
     <w:p>
       <w:r>
@@ -6814,8 +7466,19 @@
       <w:pPr>
         <w:pStyle w:val="Caption"/>
       </w:pPr>
+      <w:bookmarkStart w:id="29" w:name="_Toc1502257151"/>
       <w:r>
         <w:t>Hình 3.4: JavaScript dùng nhiều nhất nhưng chỉ 64% ngưỡng mộ; Rust đạt 85%.</w:t>
+      </w:r>
+      <w:bookmarkEnd w:id="29"/>
+      <w:r>
+        <w:fldChar w:fldCharType="begin"/>
+      </w:r>
+      <w:r>
+        <w:instrText xml:space="preserve"> TC "Hình 3.4: JavaScript dùng nhiều nhất nhưng chỉ 64% ngưỡng mộ; Rust đạt 85%." \f F \l 1 </w:instrText>
+      </w:r>
+      <w:r>
+        <w:fldChar w:fldCharType="end"/>
       </w:r>
     </w:p>
     <w:p>
@@ -6920,8 +7583,19 @@
       <w:pPr>
         <w:pStyle w:val="Caption"/>
       </w:pPr>
+      <w:bookmarkStart w:id="30" w:name="_Toc2100187553"/>
       <w:r>
         <w:t>Hình 3.5: Rust được muốn dùng vượt mức đang dùng 19,3 điểm %, JavaScript thấp hơn 27,2 điểm %.</w:t>
+      </w:r>
+      <w:bookmarkEnd w:id="30"/>
+      <w:r>
+        <w:fldChar w:fldCharType="begin"/>
+      </w:r>
+      <w:r>
+        <w:instrText xml:space="preserve"> TC "Hình 3.5: Rust được muốn dùng vượt mức đang dùng 19,3 điểm %, JavaScript thấp hơn 27,2 điểm %." \f F \l 1 </w:instrText>
+      </w:r>
+      <w:r>
+        <w:fldChar w:fldCharType="end"/>
       </w:r>
     </w:p>
     <w:p>
@@ -6973,8 +7647,19 @@
         <w:pStyle w:val="Caption"/>
         <w:keepNext/>
       </w:pPr>
+      <w:bookmarkStart w:id="31" w:name="_Toc1381531766"/>
       <w:r>
         <w:t>Bảng 3.1: 12 ngôn ngữ phổ biến nhất: đang dùng, muốn dùng, ngưỡng mộ và chênh lệch (điểm %).</w:t>
+      </w:r>
+      <w:bookmarkEnd w:id="31"/>
+      <w:r>
+        <w:fldChar w:fldCharType="begin"/>
+      </w:r>
+      <w:r>
+        <w:instrText xml:space="preserve"> TC "Bảng 3.1: 12 ngôn ngữ phổ biến nhất: đang dùng, muốn dùng, ngưỡng mộ và chênh lệch (điểm %)." \f T \l 1 </w:instrText>
+      </w:r>
+      <w:r>
+        <w:fldChar w:fldCharType="end"/>
       </w:r>
     </w:p>
     <w:tbl>
@@ -8210,9 +8895,11 @@
           <w:numId w:val="0"/>
         </w:numPr>
       </w:pPr>
+      <w:bookmarkStart w:id="32" w:name="_Toc3827661762"/>
       <w:r>
         <w:t>3.3. Các ngôn ngữ đi cùng nhau thế nào (Q4)</w:t>
       </w:r>
+      <w:bookmarkEnd w:id="32"/>
     </w:p>
     <w:p>
       <w:r>
@@ -8272,8 +8959,19 @@
       <w:pPr>
         <w:pStyle w:val="Caption"/>
       </w:pPr>
+      <w:bookmarkStart w:id="33" w:name="_Toc2372507050"/>
       <w:r>
         <w:t>Hình 3.6: Có 5 cụm ngôn ngữ hay được dùng chung.</w:t>
+      </w:r>
+      <w:bookmarkEnd w:id="33"/>
+      <w:r>
+        <w:fldChar w:fldCharType="begin"/>
+      </w:r>
+      <w:r>
+        <w:instrText xml:space="preserve"> TC "Hình 3.6: Có 5 cụm ngôn ngữ hay được dùng chung." \f F \l 1 </w:instrText>
+      </w:r>
+      <w:r>
+        <w:fldChar w:fldCharType="end"/>
       </w:r>
     </w:p>
     <w:p>
@@ -8378,8 +9076,19 @@
       <w:pPr>
         <w:pStyle w:val="Caption"/>
       </w:pPr>
+      <w:bookmarkStart w:id="34" w:name="_Toc2136881815"/>
       <w:r>
         <w:t>Hình 3.7: Người dùng JavaScript thường muốn dùng thêm HTML/CSS (52%).</w:t>
+      </w:r>
+      <w:bookmarkEnd w:id="34"/>
+      <w:r>
+        <w:fldChar w:fldCharType="begin"/>
+      </w:r>
+      <w:r>
+        <w:instrText xml:space="preserve"> TC "Hình 3.7: Người dùng JavaScript thường muốn dùng thêm HTML/CSS (52%)." \f F \l 1 </w:instrText>
+      </w:r>
+      <w:r>
+        <w:fldChar w:fldCharType="end"/>
       </w:r>
     </w:p>
     <w:p>
@@ -8435,9 +9144,11 @@
           <w:numId w:val="0"/>
         </w:numPr>
       </w:pPr>
+      <w:bookmarkStart w:id="35" w:name="_Toc68325474"/>
       <w:r>
         <w:t>3.4. Tóm tắt chương</w:t>
       </w:r>
+      <w:bookmarkEnd w:id="35"/>
     </w:p>
     <w:p>
       <w:r>
@@ -8464,9 +9175,11 @@
           <w:numId w:val="0"/>
         </w:numPr>
       </w:pPr>
+      <w:bookmarkStart w:id="36" w:name="_Toc1088599849"/>
       <w:r>
         <w:t>CHƯƠNG 4. MỨC LƯƠNG</w:t>
       </w:r>
+      <w:bookmarkEnd w:id="36"/>
     </w:p>
     <w:p>
       <w:r>
@@ -8493,9 +9206,11 @@
           <w:numId w:val="0"/>
         </w:numPr>
       </w:pPr>
+      <w:bookmarkStart w:id="37" w:name="_Toc3002508662"/>
       <w:r>
         <w:t>4.1. Phân phối lương theo vai trò và kinh nghiệm (Q5)</w:t>
       </w:r>
+      <w:bookmarkEnd w:id="37"/>
     </w:p>
     <w:p>
       <w:r>
@@ -8555,8 +9270,19 @@
       <w:pPr>
         <w:pStyle w:val="Caption"/>
       </w:pPr>
+      <w:bookmarkStart w:id="38" w:name="_Toc1674276452"/>
       <w:r>
         <w:t>Hình 4.1: Median lương 79.578 USD thấp hơn mean 92.934 USD: phân phối lệch phải.</w:t>
+      </w:r>
+      <w:bookmarkEnd w:id="38"/>
+      <w:r>
+        <w:fldChar w:fldCharType="begin"/>
+      </w:r>
+      <w:r>
+        <w:instrText xml:space="preserve"> TC "Hình 4.1: Median lương 79.578 USD thấp hơn mean 92.934 USD: phân phối lệch phải." \f F \l 1 </w:instrText>
+      </w:r>
+      <w:r>
+        <w:fldChar w:fldCharType="end"/>
       </w:r>
     </w:p>
     <w:p>
@@ -8661,8 +9387,19 @@
       <w:pPr>
         <w:pStyle w:val="Caption"/>
       </w:pPr>
+      <w:bookmarkStart w:id="39" w:name="_Toc3463762891"/>
       <w:r>
         <w:t>Hình 4.2: Engineering manager có median lương cao nhất (133.417 USD), gấp 2,0 lần Front-end.</w:t>
+      </w:r>
+      <w:bookmarkEnd w:id="39"/>
+      <w:r>
+        <w:fldChar w:fldCharType="begin"/>
+      </w:r>
+      <w:r>
+        <w:instrText xml:space="preserve"> TC "Hình 4.2: Engineering manager có median lương cao nhất (133.417 USD), gấp 2,0 lần Front-end." \f F \l 1 </w:instrText>
+      </w:r>
+      <w:r>
+        <w:fldChar w:fldCharType="end"/>
       </w:r>
     </w:p>
     <w:p>
@@ -8714,8 +9451,19 @@
         <w:pStyle w:val="Caption"/>
         <w:keepNext/>
       </w:pPr>
+      <w:bookmarkStart w:id="40" w:name="_Toc2005663919"/>
       <w:r>
         <w:t>Bảng 4.1: Median lương và cỡ mẫu theo vai trò.</w:t>
+      </w:r>
+      <w:bookmarkEnd w:id="40"/>
+      <w:r>
+        <w:fldChar w:fldCharType="begin"/>
+      </w:r>
+      <w:r>
+        <w:instrText xml:space="preserve"> TC "Bảng 4.1: Median lương và cỡ mẫu theo vai trò." \f T \l 1 </w:instrText>
+      </w:r>
+      <w:r>
+        <w:fldChar w:fldCharType="end"/>
       </w:r>
     </w:p>
     <w:tbl>
@@ -9522,8 +10270,19 @@
       <w:pPr>
         <w:pStyle w:val="Caption"/>
       </w:pPr>
+      <w:bookmarkStart w:id="41" w:name="_Toc3735082485"/>
       <w:r>
         <w:t>Hình 4.3: Median lương tăng từ 28.083 USD (0–2 năm) lên 111.515 USD (21+ năm).</w:t>
+      </w:r>
+      <w:bookmarkEnd w:id="41"/>
+      <w:r>
+        <w:fldChar w:fldCharType="begin"/>
+      </w:r>
+      <w:r>
+        <w:instrText xml:space="preserve"> TC "Hình 4.3: Median lương tăng từ 28.083 USD (0–2 năm) lên 111.515 USD (21+ năm)." \f F \l 1 </w:instrText>
+      </w:r>
+      <w:r>
+        <w:fldChar w:fldCharType="end"/>
       </w:r>
     </w:p>
     <w:p>
@@ -9575,8 +10334,19 @@
         <w:pStyle w:val="Caption"/>
         <w:keepNext/>
       </w:pPr>
+      <w:bookmarkStart w:id="42" w:name="_Toc4029109411"/>
       <w:r>
         <w:t>Bảng 4.2: Median lương theo nhóm năm kinh nghiệm (WorkExp).</w:t>
+      </w:r>
+      <w:bookmarkEnd w:id="42"/>
+      <w:r>
+        <w:fldChar w:fldCharType="begin"/>
+      </w:r>
+      <w:r>
+        <w:instrText xml:space="preserve"> TC "Bảng 4.2: Median lương theo nhóm năm kinh nghiệm (WorkExp)." \f T \l 1 </w:instrText>
+      </w:r>
+      <w:r>
+        <w:fldChar w:fldCharType="end"/>
       </w:r>
     </w:p>
     <w:tbl>
@@ -10051,9 +10821,11 @@
           <w:numId w:val="0"/>
         </w:numPr>
       </w:pPr>
+      <w:bookmarkStart w:id="43" w:name="_Toc2168904604"/>
       <w:r>
         <w:t>4.2. Công nghệ nào đi cùng mức lương cao (Q6)</w:t>
       </w:r>
+      <w:bookmarkEnd w:id="43"/>
     </w:p>
     <w:p>
       <w:r>
@@ -10113,8 +10885,19 @@
       <w:pPr>
         <w:pStyle w:val="Caption"/>
       </w:pPr>
+      <w:bookmarkStart w:id="44" w:name="_Toc935326842"/>
       <w:r>
         <w:t>Hình 4.4: Giữa 15 ngôn ngữ phổ biến, median lương chênh 49%: từ PHP đến Go.</w:t>
+      </w:r>
+      <w:bookmarkEnd w:id="44"/>
+      <w:r>
+        <w:fldChar w:fldCharType="begin"/>
+      </w:r>
+      <w:r>
+        <w:instrText xml:space="preserve"> TC "Hình 4.4: Giữa 15 ngôn ngữ phổ biến, median lương chênh 49%: từ PHP đến Go." \f F \l 1 </w:instrText>
+      </w:r>
+      <w:r>
+        <w:fldChar w:fldCharType="end"/>
       </w:r>
     </w:p>
     <w:p>
@@ -10219,8 +11002,19 @@
       <w:pPr>
         <w:pStyle w:val="Caption"/>
       </w:pPr>
+      <w:bookmarkStart w:id="45" w:name="_Toc2984389420"/>
       <w:r>
         <w:t>Hình 4.5: Architect có median lương cao nhất ở 10/10 ngôn ngữ được so sánh.</w:t>
+      </w:r>
+      <w:bookmarkEnd w:id="45"/>
+      <w:r>
+        <w:fldChar w:fldCharType="begin"/>
+      </w:r>
+      <w:r>
+        <w:instrText xml:space="preserve"> TC "Hình 4.5: Architect có median lương cao nhất ở 10/10 ngôn ngữ được so sánh." \f F \l 1 </w:instrText>
+      </w:r>
+      <w:r>
+        <w:fldChar w:fldCharType="end"/>
       </w:r>
     </w:p>
     <w:p>
@@ -10325,8 +11119,19 @@
       <w:pPr>
         <w:pStyle w:val="Caption"/>
       </w:pPr>
+      <w:bookmarkStart w:id="46" w:name="_Toc1012992342"/>
       <w:r>
         <w:t>Hình 4.6: Quốc gia một mình giải thích 45% biến thiên lương; thêm 15 ngôn ngữ chỉ cộng 2,6 điểm phần trăm.</w:t>
+      </w:r>
+      <w:bookmarkEnd w:id="46"/>
+      <w:r>
+        <w:fldChar w:fldCharType="begin"/>
+      </w:r>
+      <w:r>
+        <w:instrText xml:space="preserve"> TC "Hình 4.6: Quốc gia một mình giải thích 45% biến thiên lương; thêm 15 ngôn ngữ chỉ cộng 2,6 điểm phần trăm." \f F \l 1 </w:instrText>
+      </w:r>
+      <w:r>
+        <w:fldChar w:fldCharType="end"/>
       </w:r>
     </w:p>
     <w:p>
@@ -10370,8 +11175,19 @@
         <w:pStyle w:val="Caption"/>
         <w:keepNext/>
       </w:pPr>
+      <w:bookmarkStart w:id="47" w:name="_Toc703461009"/>
       <w:r>
         <w:t>Bảng 4.3: R² của các mô hình hồi quy log(lương) và phần tăng thêm.</w:t>
+      </w:r>
+      <w:bookmarkEnd w:id="47"/>
+      <w:r>
+        <w:fldChar w:fldCharType="begin"/>
+      </w:r>
+      <w:r>
+        <w:instrText xml:space="preserve"> TC "Bảng 4.3: R² của các mô hình hồi quy log(lương) và phần tăng thêm." \f T \l 1 </w:instrText>
+      </w:r>
+      <w:r>
+        <w:fldChar w:fldCharType="end"/>
       </w:r>
     </w:p>
     <w:tbl>
@@ -10794,8 +11610,19 @@
       <w:pPr>
         <w:pStyle w:val="Caption"/>
       </w:pPr>
+      <w:bookmarkStart w:id="48" w:name="_Toc1305277471"/>
       <w:r>
         <w:t>Hình 4.7: Sau khi cố định nước và kinh nghiệm, chênh lệch lương theo ngôn ngữ chỉ từ −21% đến 14%.</w:t>
+      </w:r>
+      <w:bookmarkEnd w:id="48"/>
+      <w:r>
+        <w:fldChar w:fldCharType="begin"/>
+      </w:r>
+      <w:r>
+        <w:instrText xml:space="preserve"> TC "Hình 4.7: Sau khi cố định nước và kinh nghiệm, chênh lệch lương theo ngôn ngữ chỉ từ −21% đến 14%." \f F \l 1 </w:instrText>
+      </w:r>
+      <w:r>
+        <w:fldChar w:fldCharType="end"/>
       </w:r>
     </w:p>
     <w:p>
@@ -10859,9 +11686,11 @@
           <w:numId w:val="0"/>
         </w:numPr>
       </w:pPr>
+      <w:bookmarkStart w:id="49" w:name="_Toc2214735358"/>
       <w:r>
         <w:t>4.3. Lương theo nước và vị trí của Việt Nam (Q7)</w:t>
       </w:r>
+      <w:bookmarkEnd w:id="49"/>
     </w:p>
     <w:p>
       <w:r>
@@ -10921,8 +11750,19 @@
       <w:pPr>
         <w:pStyle w:val="Caption"/>
       </w:pPr>
+      <w:bookmarkStart w:id="50" w:name="_Toc337426000"/>
       <w:r>
         <w:t>Hình 4.8: Median lương cao nhất ở United States (150.000 USD), thấp nhất ở Nigeria (3.874 USD); Việt Nam 11.464 USD.</w:t>
+      </w:r>
+      <w:bookmarkEnd w:id="50"/>
+      <w:r>
+        <w:fldChar w:fldCharType="begin"/>
+      </w:r>
+      <w:r>
+        <w:instrText xml:space="preserve"> TC "Hình 4.8: Median lương cao nhất ở United States (150.000 USD), thấp nhất ở Nigeria (3.874 USD); Việt Nam 11.464 USD." \f F \l 1 </w:instrText>
+      </w:r>
+      <w:r>
+        <w:fldChar w:fldCharType="end"/>
       </w:r>
     </w:p>
     <w:p>
@@ -11019,8 +11859,19 @@
       <w:pPr>
         <w:pStyle w:val="Caption"/>
       </w:pPr>
+      <w:bookmarkStart w:id="51" w:name="_Toc961331276"/>
       <w:r>
         <w:t>Hình 4.9: Việt Nam xếp thứ 57/62 nước về median lương (11.464 USD), mẫu chỉ 31 người.</w:t>
+      </w:r>
+      <w:bookmarkEnd w:id="51"/>
+      <w:r>
+        <w:fldChar w:fldCharType="begin"/>
+      </w:r>
+      <w:r>
+        <w:instrText xml:space="preserve"> TC "Hình 4.9: Việt Nam xếp thứ 57/62 nước về median lương (11.464 USD), mẫu chỉ 31 người." \f F \l 1 </w:instrText>
+      </w:r>
+      <w:r>
+        <w:fldChar w:fldCharType="end"/>
       </w:r>
     </w:p>
     <w:p>
@@ -11064,8 +11915,19 @@
         <w:pStyle w:val="Caption"/>
         <w:keepNext/>
       </w:pPr>
+      <w:bookmarkStart w:id="52" w:name="_Toc1447259553"/>
       <w:r>
         <w:t>Bảng 4.4: 10 nước có median cao nhất và 10 nước thấp nhất.</w:t>
+      </w:r>
+      <w:bookmarkEnd w:id="52"/>
+      <w:r>
+        <w:fldChar w:fldCharType="begin"/>
+      </w:r>
+      <w:r>
+        <w:instrText xml:space="preserve"> TC "Bảng 4.4: 10 nước có median cao nhất và 10 nước thấp nhất." \f T \l 1 </w:instrText>
+      </w:r>
+      <w:r>
+        <w:fldChar w:fldCharType="end"/>
       </w:r>
     </w:p>
     <w:tbl>
@@ -12646,8 +13508,19 @@
         <w:pStyle w:val="Caption"/>
         <w:keepNext/>
       </w:pPr>
+      <w:bookmarkStart w:id="53" w:name="_Toc3729208642"/>
       <w:r>
         <w:t>Bảng 4.5: Việt Nam và một số nước chọn để so sánh (đủ 30 dòng lương).</w:t>
+      </w:r>
+      <w:bookmarkEnd w:id="53"/>
+      <w:r>
+        <w:fldChar w:fldCharType="begin"/>
+      </w:r>
+      <w:r>
+        <w:instrText xml:space="preserve"> TC "Bảng 4.5: Việt Nam và một số nước chọn để so sánh (đủ 30 dòng lương)." \f T \l 1 </w:instrText>
+      </w:r>
+      <w:r>
+        <w:fldChar w:fldCharType="end"/>
       </w:r>
     </w:p>
     <w:tbl>
@@ -13870,9 +14743,11 @@
           <w:numId w:val="0"/>
         </w:numPr>
       </w:pPr>
+      <w:bookmarkStart w:id="54" w:name="_Toc2518512753"/>
       <w:r>
         <w:t>4.4. So sánh các vai trò (Q8)</w:t>
       </w:r>
+      <w:bookmarkEnd w:id="54"/>
     </w:p>
     <w:p>
       <w:r>
@@ -13932,8 +14807,19 @@
       <w:pPr>
         <w:pStyle w:val="Caption"/>
       </w:pPr>
+      <w:bookmarkStart w:id="55" w:name="_Toc1509602278"/>
       <w:r>
         <w:t>Hình 4.10: AI/ML engineer dùng AI hằng ngày nhiều nhất (74%), Engineering manager có lương cao nhất.</w:t>
+      </w:r>
+      <w:bookmarkEnd w:id="55"/>
+      <w:r>
+        <w:fldChar w:fldCharType="begin"/>
+      </w:r>
+      <w:r>
+        <w:instrText xml:space="preserve"> TC "Hình 4.10: AI/ML engineer dùng AI hằng ngày nhiều nhất (74%), Engineering manager có lương cao nhất." \f F \l 1 </w:instrText>
+      </w:r>
+      <w:r>
+        <w:fldChar w:fldCharType="end"/>
       </w:r>
     </w:p>
     <w:p>
@@ -14030,8 +14916,19 @@
       <w:pPr>
         <w:pStyle w:val="Caption"/>
       </w:pPr>
+      <w:bookmarkStart w:id="56" w:name="_Toc2568708478"/>
       <w:r>
         <w:t>Hình 4.11: Giá trị thật của 4 chỉ số: vai trò tô màu là 3 vai trò trong spider.</w:t>
+      </w:r>
+      <w:bookmarkEnd w:id="56"/>
+      <w:r>
+        <w:fldChar w:fldCharType="begin"/>
+      </w:r>
+      <w:r>
+        <w:instrText xml:space="preserve"> TC "Hình 4.11: Giá trị thật của 4 chỉ số: vai trò tô màu là 3 vai trò trong spider." \f F \l 1 </w:instrText>
+      </w:r>
+      <w:r>
+        <w:fldChar w:fldCharType="end"/>
       </w:r>
     </w:p>
     <w:p>
@@ -14075,8 +14972,19 @@
         <w:pStyle w:val="Caption"/>
         <w:keepNext/>
       </w:pPr>
+      <w:bookmarkStart w:id="57" w:name="_Toc3569865858"/>
       <w:r>
         <w:t>Bảng 4.6: Hồ sơ 12 vai trò: lương, kinh nghiệm, dùng AI hằng ngày và hài lòng công việc.</w:t>
+      </w:r>
+      <w:bookmarkEnd w:id="57"/>
+      <w:r>
+        <w:fldChar w:fldCharType="begin"/>
+      </w:r>
+      <w:r>
+        <w:instrText xml:space="preserve"> TC "Bảng 4.6: Hồ sơ 12 vai trò: lương, kinh nghiệm, dùng AI hằng ngày và hài lòng công việc." \f T \l 1 </w:instrText>
+      </w:r>
+      <w:r>
+        <w:fldChar w:fldCharType="end"/>
       </w:r>
     </w:p>
     <w:tbl>
@@ -15547,9 +16455,11 @@
           <w:numId w:val="0"/>
         </w:numPr>
       </w:pPr>
+      <w:bookmarkStart w:id="58" w:name="_Toc572703701"/>
       <w:r>
         <w:t>4.5. Tóm tắt chương</w:t>
       </w:r>
+      <w:bookmarkEnd w:id="58"/>
     </w:p>
     <w:p>
       <w:r>
@@ -15568,9 +16478,11 @@
           <w:numId w:val="0"/>
         </w:numPr>
       </w:pPr>
+      <w:bookmarkStart w:id="59" w:name="_Toc2010487642"/>
       <w:r>
         <w:t>CHƯƠNG 5. AI VÀ KỸ NĂNG CÒN GIÁ TRỊ, CÂU CHUYỆN DỮ LIỆU TỔNG HỢP</w:t>
       </w:r>
+      <w:bookmarkEnd w:id="59"/>
     </w:p>
     <w:p>
       <w:pPr>
@@ -15581,9 +16493,11 @@
           <w:numId w:val="0"/>
         </w:numPr>
       </w:pPr>
+      <w:bookmarkStart w:id="60" w:name="_Toc2491379647"/>
       <w:r>
         <w:t>5.1. AI trong công việc của lập trình viên</w:t>
       </w:r>
+      <w:bookmarkEnd w:id="60"/>
     </w:p>
     <w:p>
       <w:r>
@@ -15602,9 +16516,11 @@
           <w:numId w:val="0"/>
         </w:numPr>
       </w:pPr>
+      <w:bookmarkStart w:id="61" w:name="_Toc2896829126"/>
       <w:r>
         <w:t>5.2. Kỹ năng nào còn giá trị trong 3–5 năm tới (Q9)</w:t>
       </w:r>
+      <w:bookmarkEnd w:id="61"/>
     </w:p>
     <w:p>
       <w:r>
@@ -15672,8 +16588,19 @@
       <w:pPr>
         <w:pStyle w:val="Caption"/>
       </w:pPr>
+      <w:bookmarkStart w:id="62" w:name="_Toc4154492226"/>
       <w:r>
         <w:t>Hình 5.1: ai, problem, code là những từ được nhắc nhiều nhất khi nói về kỹ năng còn giá trị.</w:t>
+      </w:r>
+      <w:bookmarkEnd w:id="62"/>
+      <w:r>
+        <w:fldChar w:fldCharType="begin"/>
+      </w:r>
+      <w:r>
+        <w:instrText xml:space="preserve"> TC "Hình 5.1: ai, problem, code là những từ được nhắc nhiều nhất khi nói về kỹ năng còn giá trị." \f F \l 1 </w:instrText>
+      </w:r>
+      <w:r>
+        <w:fldChar w:fldCharType="end"/>
       </w:r>
     </w:p>
     <w:p>
@@ -15770,8 +16697,19 @@
       <w:pPr>
         <w:pStyle w:val="Caption"/>
       </w:pPr>
+      <w:bookmarkStart w:id="63" w:name="_Toc2827397134"/>
       <w:r>
         <w:t>Hình 5.2: Top 20 từ khóa: ai, problem, code, understanding dẫn đầu.</w:t>
+      </w:r>
+      <w:bookmarkEnd w:id="63"/>
+      <w:r>
+        <w:fldChar w:fldCharType="begin"/>
+      </w:r>
+      <w:r>
+        <w:instrText xml:space="preserve"> TC "Hình 5.2: Top 20 từ khóa: ai, problem, code, understanding dẫn đầu." \f F \l 1 </w:instrText>
+      </w:r>
+      <w:r>
+        <w:fldChar w:fldCharType="end"/>
       </w:r>
     </w:p>
     <w:p>
@@ -15815,8 +16753,19 @@
         <w:pStyle w:val="Caption"/>
         <w:keepNext/>
       </w:pPr>
+      <w:bookmarkStart w:id="64" w:name="_Toc805354525"/>
       <w:r>
         <w:t>Bảng 5.1: 15 từ khóa xuất hiện nhiều nhất trong câu trả lời về kỹ năng.</w:t>
+      </w:r>
+      <w:bookmarkEnd w:id="64"/>
+      <w:r>
+        <w:fldChar w:fldCharType="begin"/>
+      </w:r>
+      <w:r>
+        <w:instrText xml:space="preserve"> TC "Bảng 5.1: 15 từ khóa xuất hiện nhiều nhất trong câu trả lời về kỹ năng." \f T \l 1 </w:instrText>
+      </w:r>
+      <w:r>
+        <w:fldChar w:fldCharType="end"/>
       </w:r>
     </w:p>
     <w:tbl>
@@ -16750,9 +17699,11 @@
           <w:numId w:val="0"/>
         </w:numPr>
       </w:pPr>
+      <w:bookmarkStart w:id="65" w:name="_Toc4264006660"/>
       <w:r>
         <w:t>5.3. Câu chuyện dữ liệu tổng hợp</w:t>
       </w:r>
+      <w:bookmarkEnd w:id="65"/>
     </w:p>
     <w:p>
       <w:r>
@@ -16917,9 +17868,11 @@
           <w:numId w:val="0"/>
         </w:numPr>
       </w:pPr>
+      <w:bookmarkStart w:id="66" w:name="_Toc3623029765"/>
       <w:r>
         <w:t>CHƯƠNG 6. KẾT LUẬN VÀ HẠN CHẾ</w:t>
       </w:r>
+      <w:bookmarkEnd w:id="66"/>
     </w:p>
     <w:p>
       <w:pPr>
@@ -16930,9 +17883,11 @@
           <w:numId w:val="0"/>
         </w:numPr>
       </w:pPr>
+      <w:bookmarkStart w:id="67" w:name="_Toc3070284381"/>
       <w:r>
         <w:t>6.1. Kết luận</w:t>
       </w:r>
+      <w:bookmarkEnd w:id="67"/>
     </w:p>
     <w:p>
       <w:r>
@@ -16951,9 +17906,11 @@
           <w:numId w:val="0"/>
         </w:numPr>
       </w:pPr>
+      <w:bookmarkStart w:id="68" w:name="_Toc1338042166"/>
       <w:r>
         <w:t>6.2. Khuyến nghị cho sinh viên và lập trình viên mới ở Việt Nam</w:t>
       </w:r>
+      <w:bookmarkEnd w:id="68"/>
     </w:p>
     <w:p>
       <w:pPr>
@@ -17024,9 +17981,11 @@
           <w:numId w:val="0"/>
         </w:numPr>
       </w:pPr>
+      <w:bookmarkStart w:id="69" w:name="_Toc3010280920"/>
       <w:r>
         <w:t>6.3. Hạn chế</w:t>
       </w:r>
+      <w:bookmarkEnd w:id="69"/>
     </w:p>
     <w:p>
       <w:pPr>
@@ -17142,9 +18101,11 @@
           <w:numId w:val="0"/>
         </w:numPr>
       </w:pPr>
+      <w:bookmarkStart w:id="70" w:name="_Toc2224724612"/>
       <w:r>
         <w:t>6.4. Hướng phát triển</w:t>
       </w:r>
+      <w:bookmarkEnd w:id="70"/>
     </w:p>
     <w:p>
       <w:pPr>
@@ -17211,9 +18172,11 @@
         <w:pStyle w:val="section"/>
         <w:pageBreakBefore/>
       </w:pPr>
+      <w:bookmarkStart w:id="71" w:name="_Toc1238319245"/>
       <w:r>
         <w:t>TÀI LIỆU THAM KHẢO</w:t>
       </w:r>
+      <w:bookmarkEnd w:id="71"/>
     </w:p>
     <w:p>
       <w:pPr>
@@ -17325,9 +18288,11 @@
         <w:pStyle w:val="section"/>
         <w:pageBreakBefore/>
       </w:pPr>
+      <w:bookmarkStart w:id="72" w:name="_Toc2478337453"/>
       <w:r>
         <w:t>PHỤ LỤC</w:t>
       </w:r>
+      <w:bookmarkEnd w:id="72"/>
     </w:p>
     <w:p>
       <w:pPr>
@@ -17338,9 +18303,11 @@
           <w:numId w:val="0"/>
         </w:numPr>
       </w:pPr>
+      <w:bookmarkStart w:id="73" w:name="_Toc1798744690"/>
       <w:r>
         <w:t>Phụ lục A. Bảng đầy đủ các ngôn ngữ</w:t>
       </w:r>
+      <w:bookmarkEnd w:id="73"/>
     </w:p>
     <w:p>
       <w:r>
@@ -17355,8 +18322,19 @@
         <w:pStyle w:val="Caption"/>
         <w:keepNext/>
       </w:pPr>
+      <w:bookmarkStart w:id="74" w:name="_Toc3304300766"/>
       <w:r>
         <w:t>Bảng PL.1: 42 ngôn ngữ: đang dùng, muốn dùng, ngưỡng mộ.</w:t>
+      </w:r>
+      <w:bookmarkEnd w:id="74"/>
+      <w:r>
+        <w:fldChar w:fldCharType="begin"/>
+      </w:r>
+      <w:r>
+        <w:instrText xml:space="preserve"> TC "Bảng PL.1: 42 ngôn ngữ: đang dùng, muốn dùng, ngưỡng mộ." \f T \l 1 </w:instrText>
+      </w:r>
+      <w:r>
+        <w:fldChar w:fldCharType="end"/>
       </w:r>
     </w:p>
     <w:tbl>
@@ -21344,9 +22322,11 @@
           <w:numId w:val="0"/>
         </w:numPr>
       </w:pPr>
+      <w:bookmarkStart w:id="75" w:name="_Toc1026530522"/>
       <w:r>
         <w:t>Phụ lục B. Median lương theo nước</w:t>
       </w:r>
+      <w:bookmarkEnd w:id="75"/>
     </w:p>
     <w:p>
       <w:r>
@@ -21361,8 +22341,19 @@
         <w:pStyle w:val="Caption"/>
         <w:keepNext/>
       </w:pPr>
+      <w:bookmarkStart w:id="76" w:name="_Toc3985055823"/>
       <w:r>
         <w:t>Bảng PL.2: Median lương của 62 nước.</w:t>
+      </w:r>
+      <w:bookmarkEnd w:id="76"/>
+      <w:r>
+        <w:fldChar w:fldCharType="begin"/>
+      </w:r>
+      <w:r>
+        <w:instrText xml:space="preserve"> TC "Bảng PL.2: Median lương của 62 nước." \f T \l 1 </w:instrText>
+      </w:r>
+      <w:r>
+        <w:fldChar w:fldCharType="end"/>
       </w:r>
     </w:p>
     <w:tbl>
@@ -26055,9 +27046,11 @@
           <w:numId w:val="0"/>
         </w:numPr>
       </w:pPr>
+      <w:bookmarkStart w:id="77" w:name="_Toc256363759"/>
       <w:r>
         <w:t>Phụ lục C. Hệ số hồi quy theo ngôn ngữ</w:t>
       </w:r>
+      <w:bookmarkEnd w:id="77"/>
     </w:p>
     <w:p>
       <w:r>
@@ -26072,8 +27065,19 @@
         <w:pStyle w:val="Caption"/>
         <w:keepNext/>
       </w:pPr>
+      <w:bookmarkStart w:id="78" w:name="_Toc3253213675"/>
       <w:r>
         <w:t>Bảng PL.3: Chênh lệch lương (%) đi cùng việc dùng ngôn ngữ, đã kiểm soát nước và kinh nghiệm.</w:t>
+      </w:r>
+      <w:bookmarkEnd w:id="78"/>
+      <w:r>
+        <w:fldChar w:fldCharType="begin"/>
+      </w:r>
+      <w:r>
+        <w:instrText xml:space="preserve"> TC "Bảng PL.3: Chênh lệch lương (%) đi cùng việc dùng ngôn ngữ, đã kiểm soát nước và kinh nghiệm." \f T \l 1 </w:instrText>
+      </w:r>
+      <w:r>
+        <w:fldChar w:fldCharType="end"/>
       </w:r>
     </w:p>
     <w:tbl>
@@ -26999,9 +28003,11 @@
           <w:numId w:val="0"/>
         </w:numPr>
       </w:pPr>
+      <w:bookmarkStart w:id="79" w:name="_Toc4199523761"/>
       <w:r>
         <w:t>Phụ lục D. Từ khóa trong câu trả lời về kỹ năng</w:t>
       </w:r>
+      <w:bookmarkEnd w:id="79"/>
     </w:p>
     <w:p>
       <w:r>
@@ -27016,8 +28022,19 @@
         <w:pStyle w:val="Caption"/>
         <w:keepNext/>
       </w:pPr>
+      <w:bookmarkStart w:id="80" w:name="_Toc1033398168"/>
       <w:r>
         <w:t>Bảng PL.4: 30 từ khóa xuất hiện nhiều nhất.</w:t>
+      </w:r>
+      <w:bookmarkEnd w:id="80"/>
+      <w:r>
+        <w:fldChar w:fldCharType="begin"/>
+      </w:r>
+      <w:r>
+        <w:instrText xml:space="preserve"> TC "Bảng PL.4: 30 từ khóa xuất hiện nhiều nhất." \f T \l 1 </w:instrText>
+      </w:r>
+      <w:r>
+        <w:fldChar w:fldCharType="end"/>
       </w:r>
     </w:p>
     <w:tbl>

</xml_diff>

<commit_message>
fix(report): refer to the work as an assignment instead of a project
</commit_message>
<xml_diff>
--- a/deliverables/report.docx
+++ b/deliverables/report.docx
@@ -4662,7 +4662,7 @@
         <w:rPr>
           <w:i w:val="0"/>
         </w:rPr>
-        <w:t>Đồ án có ba mục tiêu: (1) mô tả xu hướng công nghệ qua ba chỉ số là đang dùng, muốn dùng và được ngưỡng mộ; (2) mô tả mức lương và các yếu tố đi cùng mức lương; (3) kiểm chứng bằng một mô hình định lượng đơn giản xem yếu tố nào giải thích lương nhiều nhất.</w:t>
+        <w:t>Bài tập lớn có ba mục tiêu: (1) mô tả xu hướng công nghệ qua ba chỉ số là đang dùng, muốn dùng và được ngưỡng mộ; (2) mô tả mức lương và các yếu tố đi cùng mức lương; (3) kiểm chứng bằng một mô hình định lượng đơn giản xem yếu tố nào giải thích lương nhiều nhất.</w:t>
       </w:r>
     </w:p>
     <w:p>
@@ -4843,7 +4843,7 @@
         <w:rPr>
           <w:i w:val="0"/>
         </w:rPr>
-        <w:t>Phạm vi chỉ gồm dữ liệu khảo sát năm 2025 nên không đo được thay đổi theo thời gian; vì vậy khái niệm xu hướng được thay bằng ba chỉ số nói trên. Đồ án không xây dashboard tương tác mà tập trung vào ba sản phẩm: notebook phân tích, bộ slide thuyết trình và báo cáo này.</w:t>
+        <w:t>Phạm vi chỉ gồm dữ liệu khảo sát năm 2025 nên không đo được thay đổi theo thời gian; vì vậy khái niệm xu hướng được thay bằng ba chỉ số nói trên. Bài tập lớn không xây dashboard tương tác mà tập trung vào ba sản phẩm: notebook phân tích, bộ slide thuyết trình và báo cáo này.</w:t>
       </w:r>
     </w:p>
     <w:p>
@@ -17894,7 +17894,7 @@
         <w:rPr>
           <w:i w:val="0"/>
         </w:rPr>
-        <w:t>Đồ án đã trả lời chín câu hỏi bằng 23 biểu đồ, gồm các dạng bar, histogram, line, scatter, treemap, heatmap, ridgeline, spider, wordcloud, choropleth, network và Sankey. Ba kết luận chính: (1) công nghệ phổ biến không đồng nghĩa với được ngưỡng mộ; (2) lương lệch phải mạnh nên cần dùng median; (3) quốc gia và kinh nghiệm giải thích biến thiên của lương nhiều hơn hẳn ngôn ngữ lập trình.</w:t>
+        <w:t>Bài tập lớn đã trả lời chín câu hỏi bằng 23 biểu đồ, gồm các dạng bar, histogram, line, scatter, treemap, heatmap, ridgeline, spider, wordcloud, choropleth, network và Sankey. Ba kết luận chính: (1) công nghệ phổ biến không đồng nghĩa với được ngưỡng mộ; (2) lương lệch phải mạnh nên cần dùng median; (3) quốc gia và kinh nghiệm giải thích biến thiên của lương nhiều hơn hẳn ngôn ngữ lập trình.</w:t>
       </w:r>
     </w:p>
     <w:p>

</xml_diff>

<commit_message>
fix(report): drop chapter numbers from introduction and conclusion
Co-Authored-By: Claude Fable 5.1 <noreply@anthropic.com>
</commit_message>
<xml_diff>
--- a/deliverables/report.docx
+++ b/deliverables/report.docx
@@ -2354,9 +2354,9 @@
           <w:tab w:pos="9061" w:val="right" w:leader="dot"/>
         </w:tabs>
       </w:pPr>
-      <w:hyperlink w:anchor="_Toc3544288922" w:history="1">
+      <w:hyperlink w:anchor="_Toc2380338264" w:history="1">
         <w:r>
-          <w:t xml:space="preserve">CHƯƠNG 1. GIỚI THIỆU</w:t>
+          <w:t xml:space="preserve">GIỚI THIỆU</w:t>
         </w:r>
         <w:r>
           <w:tab/>
@@ -2373,9 +2373,9 @@
           <w:tab w:pos="9061" w:val="right" w:leader="dot"/>
         </w:tabs>
       </w:pPr>
-      <w:hyperlink w:anchor="_Toc2615902355" w:history="1">
+      <w:hyperlink w:anchor="_Toc1625638599" w:history="1">
         <w:r>
-          <w:t xml:space="preserve">1.1. Bối cảnh</w:t>
+          <w:t xml:space="preserve">Bối cảnh</w:t>
         </w:r>
         <w:r>
           <w:tab/>
@@ -2392,9 +2392,9 @@
           <w:tab w:pos="9061" w:val="right" w:leader="dot"/>
         </w:tabs>
       </w:pPr>
-      <w:hyperlink w:anchor="_Toc3708436808" w:history="1">
+      <w:hyperlink w:anchor="_Toc2236665712" w:history="1">
         <w:r>
-          <w:t xml:space="preserve">1.2. Mục tiêu và đối tượng</w:t>
+          <w:t xml:space="preserve">Mục tiêu và đối tượng</w:t>
         </w:r>
         <w:r>
           <w:tab/>
@@ -2411,9 +2411,9 @@
           <w:tab w:pos="9061" w:val="right" w:leader="dot"/>
         </w:tabs>
       </w:pPr>
-      <w:hyperlink w:anchor="_Toc2781230238" w:history="1">
+      <w:hyperlink w:anchor="_Toc1030828578" w:history="1">
         <w:r>
-          <w:t xml:space="preserve">1.3. Câu hỏi phân tích</w:t>
+          <w:t xml:space="preserve">Câu hỏi phân tích</w:t>
         </w:r>
         <w:r>
           <w:tab/>
@@ -2430,9 +2430,9 @@
           <w:tab w:pos="9061" w:val="right" w:leader="dot"/>
         </w:tabs>
       </w:pPr>
-      <w:hyperlink w:anchor="_Toc4111894682" w:history="1">
+      <w:hyperlink w:anchor="_Toc2501247624" w:history="1">
         <w:r>
-          <w:t xml:space="preserve">1.4. Phạm vi và cấu trúc báo cáo</w:t>
+          <w:t xml:space="preserve">Phạm vi và cấu trúc báo cáo</w:t>
         </w:r>
         <w:r>
           <w:tab/>
@@ -2449,9 +2449,9 @@
           <w:tab w:pos="9061" w:val="right" w:leader="dot"/>
         </w:tabs>
       </w:pPr>
-      <w:hyperlink w:anchor="_Toc2719321501" w:history="1">
+      <w:hyperlink w:anchor="_Toc3482549959" w:history="1">
         <w:r>
-          <w:t xml:space="preserve">CHƯƠNG 2. DỮ LIỆU VÀ TIỀN XỬ LÝ</w:t>
+          <w:t xml:space="preserve">CHƯƠNG 1. DỮ LIỆU VÀ TIỀN XỬ LÝ</w:t>
         </w:r>
         <w:r>
           <w:tab/>
@@ -2468,9 +2468,9 @@
           <w:tab w:pos="9061" w:val="right" w:leader="dot"/>
         </w:tabs>
       </w:pPr>
-      <w:hyperlink w:anchor="_Toc1014418225" w:history="1">
+      <w:hyperlink w:anchor="_Toc382368697" w:history="1">
         <w:r>
-          <w:t xml:space="preserve">2.1. Nguồn dữ liệu và cấu trúc</w:t>
+          <w:t xml:space="preserve">1.1. Nguồn dữ liệu và cấu trúc</w:t>
         </w:r>
         <w:r>
           <w:tab/>
@@ -2487,9 +2487,9 @@
           <w:tab w:pos="9061" w:val="right" w:leader="dot"/>
         </w:tabs>
       </w:pPr>
-      <w:hyperlink w:anchor="_Toc2106933653" w:history="1">
+      <w:hyperlink w:anchor="_Toc670334709" w:history="1">
         <w:r>
-          <w:t xml:space="preserve">2.2. Các biến được sử dụng</w:t>
+          <w:t xml:space="preserve">1.2. Các biến được sử dụng</w:t>
         </w:r>
         <w:r>
           <w:tab/>
@@ -2506,9 +2506,9 @@
           <w:tab w:pos="9061" w:val="right" w:leader="dot"/>
         </w:tabs>
       </w:pPr>
-      <w:hyperlink w:anchor="_Toc1634008197" w:history="1">
+      <w:hyperlink w:anchor="_Toc964318637" w:history="1">
         <w:r>
-          <w:t xml:space="preserve">2.3. Dữ liệu thiếu</w:t>
+          <w:t xml:space="preserve">1.3. Dữ liệu thiếu</w:t>
         </w:r>
         <w:r>
           <w:tab/>
@@ -2525,9 +2525,9 @@
           <w:tab w:pos="9061" w:val="right" w:leader="dot"/>
         </w:tabs>
       </w:pPr>
-      <w:hyperlink w:anchor="_Toc1932709038" w:history="1">
+      <w:hyperlink w:anchor="_Toc1054526665" w:history="1">
         <w:r>
-          <w:t xml:space="preserve">2.4. Quy tắc làm sạch dữ liệu</w:t>
+          <w:t xml:space="preserve">1.4. Quy tắc làm sạch dữ liệu</w:t>
         </w:r>
         <w:r>
           <w:tab/>
@@ -2544,9 +2544,9 @@
           <w:tab w:pos="9061" w:val="right" w:leader="dot"/>
         </w:tabs>
       </w:pPr>
-      <w:hyperlink w:anchor="_Toc1204738964" w:history="1">
+      <w:hyperlink w:anchor="_Toc3835190589" w:history="1">
         <w:r>
-          <w:t xml:space="preserve">2.5. Phương pháp</w:t>
+          <w:t xml:space="preserve">1.5. Phương pháp</w:t>
         </w:r>
         <w:r>
           <w:tab/>
@@ -2563,9 +2563,9 @@
           <w:tab w:pos="9061" w:val="right" w:leader="dot"/>
         </w:tabs>
       </w:pPr>
-      <w:hyperlink w:anchor="_Toc433832425" w:history="1">
+      <w:hyperlink w:anchor="_Toc3393248530" w:history="1">
         <w:r>
-          <w:t xml:space="preserve">2.6. Hồ sơ người trả lời (Q1)</w:t>
+          <w:t xml:space="preserve">1.6. Hồ sơ người trả lời (Q1)</w:t>
         </w:r>
         <w:r>
           <w:tab/>
@@ -2582,9 +2582,9 @@
           <w:tab w:pos="9061" w:val="right" w:leader="dot"/>
         </w:tabs>
       </w:pPr>
-      <w:hyperlink w:anchor="_Toc3846948962" w:history="1">
+      <w:hyperlink w:anchor="_Toc2345128739" w:history="1">
         <w:r>
-          <w:t xml:space="preserve">CHƯƠNG 3. XU HƯỚNG CÔNG NGHỆ</w:t>
+          <w:t xml:space="preserve">CHƯƠNG 2. XU HƯỚNG CÔNG NGHỆ</w:t>
         </w:r>
         <w:r>
           <w:tab/>
@@ -2601,9 +2601,9 @@
           <w:tab w:pos="9061" w:val="right" w:leader="dot"/>
         </w:tabs>
       </w:pPr>
-      <w:hyperlink w:anchor="_Toc3326192056" w:history="1">
+      <w:hyperlink w:anchor="_Toc2532492132" w:history="1">
         <w:r>
-          <w:t xml:space="preserve">3.1. Công nghệ nào đang được dùng nhiều nhất (Q2)</w:t>
+          <w:t xml:space="preserve">2.1. Công nghệ nào đang được dùng nhiều nhất (Q2)</w:t>
         </w:r>
         <w:r>
           <w:tab/>
@@ -2620,9 +2620,9 @@
           <w:tab w:pos="9061" w:val="right" w:leader="dot"/>
         </w:tabs>
       </w:pPr>
-      <w:hyperlink w:anchor="_Toc2418456719" w:history="1">
+      <w:hyperlink w:anchor="_Toc2522442865" w:history="1">
         <w:r>
-          <w:t xml:space="preserve">3.2. Dùng nhiều có được ngưỡng mộ và muốn dùng nhiều không (Q3)</w:t>
+          <w:t xml:space="preserve">2.2. Dùng nhiều có được ngưỡng mộ và muốn dùng nhiều không (Q3)</w:t>
         </w:r>
         <w:r>
           <w:tab/>
@@ -2639,9 +2639,9 @@
           <w:tab w:pos="9061" w:val="right" w:leader="dot"/>
         </w:tabs>
       </w:pPr>
-      <w:hyperlink w:anchor="_Toc3827661762" w:history="1">
+      <w:hyperlink w:anchor="_Toc2380892111" w:history="1">
         <w:r>
-          <w:t xml:space="preserve">3.3. Các ngôn ngữ đi cùng nhau thế nào (Q4)</w:t>
+          <w:t xml:space="preserve">2.3. Các ngôn ngữ đi cùng nhau thế nào (Q4)</w:t>
         </w:r>
         <w:r>
           <w:tab/>
@@ -2658,9 +2658,9 @@
           <w:tab w:pos="9061" w:val="right" w:leader="dot"/>
         </w:tabs>
       </w:pPr>
-      <w:hyperlink w:anchor="_Toc68325474" w:history="1">
+      <w:hyperlink w:anchor="_Toc2235036997" w:history="1">
         <w:r>
-          <w:t xml:space="preserve">3.4. Tóm tắt chương</w:t>
+          <w:t xml:space="preserve">2.4. Tóm tắt chương</w:t>
         </w:r>
         <w:r>
           <w:tab/>
@@ -2677,9 +2677,9 @@
           <w:tab w:pos="9061" w:val="right" w:leader="dot"/>
         </w:tabs>
       </w:pPr>
-      <w:hyperlink w:anchor="_Toc1088599849" w:history="1">
+      <w:hyperlink w:anchor="_Toc3172683612" w:history="1">
         <w:r>
-          <w:t xml:space="preserve">CHƯƠNG 4. MỨC LƯƠNG</w:t>
+          <w:t xml:space="preserve">CHƯƠNG 3. MỨC LƯƠNG</w:t>
         </w:r>
         <w:r>
           <w:tab/>
@@ -2696,9 +2696,9 @@
           <w:tab w:pos="9061" w:val="right" w:leader="dot"/>
         </w:tabs>
       </w:pPr>
-      <w:hyperlink w:anchor="_Toc3002508662" w:history="1">
+      <w:hyperlink w:anchor="_Toc106367140" w:history="1">
         <w:r>
-          <w:t xml:space="preserve">4.1. Phân phối lương theo vai trò và kinh nghiệm (Q5)</w:t>
+          <w:t xml:space="preserve">3.1. Phân phối lương theo vai trò và kinh nghiệm (Q5)</w:t>
         </w:r>
         <w:r>
           <w:tab/>
@@ -2715,9 +2715,9 @@
           <w:tab w:pos="9061" w:val="right" w:leader="dot"/>
         </w:tabs>
       </w:pPr>
-      <w:hyperlink w:anchor="_Toc2168904604" w:history="1">
+      <w:hyperlink w:anchor="_Toc1867301612" w:history="1">
         <w:r>
-          <w:t xml:space="preserve">4.2. Công nghệ nào đi cùng mức lương cao (Q6)</w:t>
+          <w:t xml:space="preserve">3.2. Công nghệ nào đi cùng mức lương cao (Q6)</w:t>
         </w:r>
         <w:r>
           <w:tab/>
@@ -2734,9 +2734,9 @@
           <w:tab w:pos="9061" w:val="right" w:leader="dot"/>
         </w:tabs>
       </w:pPr>
-      <w:hyperlink w:anchor="_Toc2214735358" w:history="1">
+      <w:hyperlink w:anchor="_Toc772917250" w:history="1">
         <w:r>
-          <w:t xml:space="preserve">4.3. Lương theo nước và vị trí của Việt Nam (Q7)</w:t>
+          <w:t xml:space="preserve">3.3. Lương theo nước và vị trí của Việt Nam (Q7)</w:t>
         </w:r>
         <w:r>
           <w:tab/>
@@ -2753,9 +2753,9 @@
           <w:tab w:pos="9061" w:val="right" w:leader="dot"/>
         </w:tabs>
       </w:pPr>
-      <w:hyperlink w:anchor="_Toc2518512753" w:history="1">
+      <w:hyperlink w:anchor="_Toc780691172" w:history="1">
         <w:r>
-          <w:t xml:space="preserve">4.4. So sánh các vai trò (Q8)</w:t>
+          <w:t xml:space="preserve">3.4. So sánh các vai trò (Q8)</w:t>
         </w:r>
         <w:r>
           <w:tab/>
@@ -2772,9 +2772,9 @@
           <w:tab w:pos="9061" w:val="right" w:leader="dot"/>
         </w:tabs>
       </w:pPr>
-      <w:hyperlink w:anchor="_Toc572703701" w:history="1">
+      <w:hyperlink w:anchor="_Toc322630818" w:history="1">
         <w:r>
-          <w:t xml:space="preserve">4.5. Tóm tắt chương</w:t>
+          <w:t xml:space="preserve">3.5. Tóm tắt chương</w:t>
         </w:r>
         <w:r>
           <w:tab/>
@@ -2791,9 +2791,9 @@
           <w:tab w:pos="9061" w:val="right" w:leader="dot"/>
         </w:tabs>
       </w:pPr>
-      <w:hyperlink w:anchor="_Toc2010487642" w:history="1">
+      <w:hyperlink w:anchor="_Toc4187433572" w:history="1">
         <w:r>
-          <w:t xml:space="preserve">CHƯƠNG 5. AI VÀ KỸ NĂNG CÒN GIÁ TRỊ, CÂU CHUYỆN DỮ LIỆU TỔNG HỢP</w:t>
+          <w:t xml:space="preserve">CHƯƠNG 4. AI VÀ KỸ NĂNG CÒN GIÁ TRỊ, CÂU CHUYỆN DỮ LIỆU TỔNG HỢP</w:t>
         </w:r>
         <w:r>
           <w:tab/>
@@ -2810,9 +2810,9 @@
           <w:tab w:pos="9061" w:val="right" w:leader="dot"/>
         </w:tabs>
       </w:pPr>
-      <w:hyperlink w:anchor="_Toc2491379647" w:history="1">
+      <w:hyperlink w:anchor="_Toc1581358124" w:history="1">
         <w:r>
-          <w:t xml:space="preserve">5.1. AI trong công việc của lập trình viên</w:t>
+          <w:t xml:space="preserve">4.1. AI trong công việc của lập trình viên</w:t>
         </w:r>
         <w:r>
           <w:tab/>
@@ -2829,9 +2829,9 @@
           <w:tab w:pos="9061" w:val="right" w:leader="dot"/>
         </w:tabs>
       </w:pPr>
-      <w:hyperlink w:anchor="_Toc2896829126" w:history="1">
+      <w:hyperlink w:anchor="_Toc597636947" w:history="1">
         <w:r>
-          <w:t xml:space="preserve">5.2. Kỹ năng nào còn giá trị trong 3–5 năm tới (Q9)</w:t>
+          <w:t xml:space="preserve">4.2. Kỹ năng nào còn giá trị trong 3–5 năm tới (Q9)</w:t>
         </w:r>
         <w:r>
           <w:tab/>
@@ -2848,9 +2848,9 @@
           <w:tab w:pos="9061" w:val="right" w:leader="dot"/>
         </w:tabs>
       </w:pPr>
-      <w:hyperlink w:anchor="_Toc4264006660" w:history="1">
+      <w:hyperlink w:anchor="_Toc3107218175" w:history="1">
         <w:r>
-          <w:t xml:space="preserve">5.3. Câu chuyện dữ liệu tổng hợp</w:t>
+          <w:t xml:space="preserve">4.3. Câu chuyện dữ liệu tổng hợp</w:t>
         </w:r>
         <w:r>
           <w:tab/>
@@ -2867,9 +2867,9 @@
           <w:tab w:pos="9061" w:val="right" w:leader="dot"/>
         </w:tabs>
       </w:pPr>
-      <w:hyperlink w:anchor="_Toc3623029765" w:history="1">
+      <w:hyperlink w:anchor="_Toc2699881821" w:history="1">
         <w:r>
-          <w:t xml:space="preserve">CHƯƠNG 6. KẾT LUẬN VÀ HẠN CHẾ</w:t>
+          <w:t xml:space="preserve">KẾT LUẬN VÀ HẠN CHẾ</w:t>
         </w:r>
         <w:r>
           <w:tab/>
@@ -2886,9 +2886,9 @@
           <w:tab w:pos="9061" w:val="right" w:leader="dot"/>
         </w:tabs>
       </w:pPr>
-      <w:hyperlink w:anchor="_Toc3070284381" w:history="1">
+      <w:hyperlink w:anchor="_Toc1822189634" w:history="1">
         <w:r>
-          <w:t xml:space="preserve">6.1. Kết luận</w:t>
+          <w:t xml:space="preserve">Kết luận</w:t>
         </w:r>
         <w:r>
           <w:tab/>
@@ -2905,9 +2905,9 @@
           <w:tab w:pos="9061" w:val="right" w:leader="dot"/>
         </w:tabs>
       </w:pPr>
-      <w:hyperlink w:anchor="_Toc1338042166" w:history="1">
+      <w:hyperlink w:anchor="_Toc3504217516" w:history="1">
         <w:r>
-          <w:t xml:space="preserve">6.2. Khuyến nghị cho sinh viên và lập trình viên mới ở Việt Nam</w:t>
+          <w:t xml:space="preserve">Khuyến nghị cho sinh viên và lập trình viên mới ở Việt Nam</w:t>
         </w:r>
         <w:r>
           <w:tab/>
@@ -2924,9 +2924,9 @@
           <w:tab w:pos="9061" w:val="right" w:leader="dot"/>
         </w:tabs>
       </w:pPr>
-      <w:hyperlink w:anchor="_Toc3010280920" w:history="1">
+      <w:hyperlink w:anchor="_Toc1970286687" w:history="1">
         <w:r>
-          <w:t xml:space="preserve">6.3. Hạn chế</w:t>
+          <w:t xml:space="preserve">Hạn chế</w:t>
         </w:r>
         <w:r>
           <w:tab/>
@@ -2943,9 +2943,9 @@
           <w:tab w:pos="9061" w:val="right" w:leader="dot"/>
         </w:tabs>
       </w:pPr>
-      <w:hyperlink w:anchor="_Toc2224724612" w:history="1">
+      <w:hyperlink w:anchor="_Toc11019798" w:history="1">
         <w:r>
-          <w:t xml:space="preserve">6.4. Hướng phát triển</w:t>
+          <w:t xml:space="preserve">Hướng phát triển</w:t>
         </w:r>
         <w:r>
           <w:tab/>
@@ -3100,9 +3100,9 @@
       <w:r>
         <w:fldChar w:fldCharType="separate"/>
       </w:r>
-      <w:hyperlink w:anchor="_Toc2854989561" w:history="1">
+      <w:hyperlink w:anchor="_Toc862669206" w:history="1">
         <w:r>
-          <w:t xml:space="preserve">Bảng 2.1: Các biến được sử dụng và tỷ lệ người có trả lời.</w:t>
+          <w:t xml:space="preserve">Bảng 1.1: Các biến được sử dụng và tỷ lệ người có trả lời.</w:t>
         </w:r>
         <w:r>
           <w:tab/>
@@ -3119,9 +3119,9 @@
           <w:tab w:pos="9061" w:val="right" w:leader="dot"/>
         </w:tabs>
       </w:pPr>
-      <w:hyperlink w:anchor="_Toc4168080369" w:history="1">
+      <w:hyperlink w:anchor="_Toc2063993650" w:history="1">
         <w:r>
-          <w:t xml:space="preserve">Bảng 2.2: Quy tắc làm sạch và số dòng còn lại.</w:t>
+          <w:t xml:space="preserve">Bảng 1.2: Quy tắc làm sạch và số dòng còn lại.</w:t>
         </w:r>
         <w:r>
           <w:tab/>
@@ -3138,9 +3138,9 @@
           <w:tab w:pos="9061" w:val="right" w:leader="dot"/>
         </w:tabs>
       </w:pPr>
-      <w:hyperlink w:anchor="_Toc1381531766" w:history="1">
+      <w:hyperlink w:anchor="_Toc3826210171" w:history="1">
         <w:r>
-          <w:t xml:space="preserve">Bảng 3.1: 12 ngôn ngữ phổ biến nhất: đang dùng, muốn dùng, ngưỡng mộ và chênh lệch (điểm %).</w:t>
+          <w:t xml:space="preserve">Bảng 2.1: 12 ngôn ngữ phổ biến nhất: đang dùng, muốn dùng, ngưỡng mộ và chênh lệch (điểm %).</w:t>
         </w:r>
         <w:r>
           <w:tab/>
@@ -3157,9 +3157,9 @@
           <w:tab w:pos="9061" w:val="right" w:leader="dot"/>
         </w:tabs>
       </w:pPr>
-      <w:hyperlink w:anchor="_Toc2005663919" w:history="1">
+      <w:hyperlink w:anchor="_Toc1843839316" w:history="1">
         <w:r>
-          <w:t xml:space="preserve">Bảng 4.1: Median lương và cỡ mẫu theo vai trò.</w:t>
+          <w:t xml:space="preserve">Bảng 3.1: Median lương và cỡ mẫu theo vai trò.</w:t>
         </w:r>
         <w:r>
           <w:tab/>
@@ -3176,9 +3176,9 @@
           <w:tab w:pos="9061" w:val="right" w:leader="dot"/>
         </w:tabs>
       </w:pPr>
-      <w:hyperlink w:anchor="_Toc4029109411" w:history="1">
+      <w:hyperlink w:anchor="_Toc3918460877" w:history="1">
         <w:r>
-          <w:t xml:space="preserve">Bảng 4.2: Median lương theo nhóm năm kinh nghiệm (WorkExp).</w:t>
+          <w:t xml:space="preserve">Bảng 3.2: Median lương theo nhóm năm kinh nghiệm (WorkExp).</w:t>
         </w:r>
         <w:r>
           <w:tab/>
@@ -3195,9 +3195,9 @@
           <w:tab w:pos="9061" w:val="right" w:leader="dot"/>
         </w:tabs>
       </w:pPr>
-      <w:hyperlink w:anchor="_Toc703461009" w:history="1">
+      <w:hyperlink w:anchor="_Toc885190057" w:history="1">
         <w:r>
-          <w:t xml:space="preserve">Bảng 4.3: R² của các mô hình hồi quy log(lương) và phần tăng thêm.</w:t>
+          <w:t xml:space="preserve">Bảng 3.3: R² của các mô hình hồi quy log(lương) và phần tăng thêm.</w:t>
         </w:r>
         <w:r>
           <w:tab/>
@@ -3214,9 +3214,9 @@
           <w:tab w:pos="9061" w:val="right" w:leader="dot"/>
         </w:tabs>
       </w:pPr>
-      <w:hyperlink w:anchor="_Toc1447259553" w:history="1">
+      <w:hyperlink w:anchor="_Toc1113906347" w:history="1">
         <w:r>
-          <w:t xml:space="preserve">Bảng 4.4: 10 nước có median cao nhất và 10 nước thấp nhất.</w:t>
+          <w:t xml:space="preserve">Bảng 3.4: 10 nước có median cao nhất và 10 nước thấp nhất.</w:t>
         </w:r>
         <w:r>
           <w:tab/>
@@ -3233,9 +3233,9 @@
           <w:tab w:pos="9061" w:val="right" w:leader="dot"/>
         </w:tabs>
       </w:pPr>
-      <w:hyperlink w:anchor="_Toc3729208642" w:history="1">
+      <w:hyperlink w:anchor="_Toc2913576662" w:history="1">
         <w:r>
-          <w:t xml:space="preserve">Bảng 4.5: Việt Nam và một số nước chọn để so sánh (đủ 30 dòng lương).</w:t>
+          <w:t xml:space="preserve">Bảng 3.5: Việt Nam và một số nước chọn để so sánh (đủ 30 dòng lương).</w:t>
         </w:r>
         <w:r>
           <w:tab/>
@@ -3252,9 +3252,9 @@
           <w:tab w:pos="9061" w:val="right" w:leader="dot"/>
         </w:tabs>
       </w:pPr>
-      <w:hyperlink w:anchor="_Toc3569865858" w:history="1">
+      <w:hyperlink w:anchor="_Toc3394603197" w:history="1">
         <w:r>
-          <w:t xml:space="preserve">Bảng 4.6: Hồ sơ 12 vai trò: lương, kinh nghiệm, dùng AI hằng ngày và hài lòng công việc.</w:t>
+          <w:t xml:space="preserve">Bảng 3.6: Hồ sơ 12 vai trò: lương, kinh nghiệm, dùng AI hằng ngày và hài lòng công việc.</w:t>
         </w:r>
         <w:r>
           <w:tab/>
@@ -3271,9 +3271,9 @@
           <w:tab w:pos="9061" w:val="right" w:leader="dot"/>
         </w:tabs>
       </w:pPr>
-      <w:hyperlink w:anchor="_Toc805354525" w:history="1">
+      <w:hyperlink w:anchor="_Toc2650636393" w:history="1">
         <w:r>
-          <w:t xml:space="preserve">Bảng 5.1: 15 từ khóa xuất hiện nhiều nhất trong câu trả lời về kỹ năng.</w:t>
+          <w:t xml:space="preserve">Bảng 4.1: 15 từ khóa xuất hiện nhiều nhất trong câu trả lời về kỹ năng.</w:t>
         </w:r>
         <w:r>
           <w:tab/>
@@ -3390,9 +3390,9 @@
       <w:r>
         <w:fldChar w:fldCharType="separate"/>
       </w:r>
-      <w:hyperlink w:anchor="_Toc533178864" w:history="1">
+      <w:hyperlink w:anchor="_Toc4100841805" w:history="1">
         <w:r>
-          <w:t xml:space="preserve">Hình 2.1: 76% người trả lời là lập trình viên chuyên nghiệp.</w:t>
+          <w:t xml:space="preserve">Hình 1.1: 76% người trả lời là lập trình viên chuyên nghiệp.</w:t>
         </w:r>
         <w:r>
           <w:tab/>
@@ -3409,9 +3409,9 @@
           <w:tab w:pos="9061" w:val="right" w:leader="dot"/>
         </w:tabs>
       </w:pPr>
-      <w:hyperlink w:anchor="_Toc1842086776" w:history="1">
+      <w:hyperlink w:anchor="_Toc3591900523" w:history="1">
         <w:r>
-          <w:t xml:space="preserve">Hình 2.2: Nhóm tuổi 25–34 chiếm 34% người trả lời.</w:t>
+          <w:t xml:space="preserve">Hình 1.2: Nhóm tuổi 25–34 chiếm 34% người trả lời.</w:t>
         </w:r>
         <w:r>
           <w:tab/>
@@ -3428,9 +3428,9 @@
           <w:tab w:pos="9061" w:val="right" w:leader="dot"/>
         </w:tabs>
       </w:pPr>
-      <w:hyperlink w:anchor="_Toc3350291111" w:history="1">
+      <w:hyperlink w:anchor="_Toc4154394612" w:history="1">
         <w:r>
-          <w:t xml:space="preserve">Hình 2.3: Mẫu lệch về United States, Germany, India; Việt Nam chỉ có 145 phản hồi.</w:t>
+          <w:t xml:space="preserve">Hình 1.3: Mẫu lệch về United States, Germany, India; Việt Nam chỉ có 145 phản hồi.</w:t>
         </w:r>
         <w:r>
           <w:tab/>
@@ -3447,9 +3447,9 @@
           <w:tab w:pos="9061" w:val="right" w:leader="dot"/>
         </w:tabs>
       </w:pPr>
-      <w:hyperlink w:anchor="_Toc646432681" w:history="1">
+      <w:hyperlink w:anchor="_Toc553128791" w:history="1">
         <w:r>
-          <w:t xml:space="preserve">Hình 3.1: JavaScript, HTML/CSS và SQL là ba ngôn ngữ được dùng nhiều nhất.</w:t>
+          <w:t xml:space="preserve">Hình 2.1: JavaScript, HTML/CSS và SQL là ba ngôn ngữ được dùng nhiều nhất.</w:t>
         </w:r>
         <w:r>
           <w:tab/>
@@ -3466,9 +3466,9 @@
           <w:tab w:pos="9061" w:val="right" w:leader="dot"/>
         </w:tabs>
       </w:pPr>
-      <w:hyperlink w:anchor="_Toc2880975574" w:history="1">
+      <w:hyperlink w:anchor="_Toc105189026" w:history="1">
         <w:r>
-          <w:t xml:space="preserve">Hình 3.2: JavaScript, PostgreSQL, Docker và Node.js dẫn đầu từng nhóm công nghệ.</w:t>
+          <w:t xml:space="preserve">Hình 2.2: JavaScript, PostgreSQL, Docker và Node.js dẫn đầu từng nhóm công nghệ.</w:t>
         </w:r>
         <w:r>
           <w:tab/>
@@ -3485,9 +3485,9 @@
           <w:tab w:pos="9061" w:val="right" w:leader="dot"/>
         </w:tabs>
       </w:pPr>
-      <w:hyperlink w:anchor="_Toc291862305" w:history="1">
+      <w:hyperlink w:anchor="_Toc1520173168" w:history="1">
         <w:r>
-          <w:t xml:space="preserve">Hình 3.3: PostgreSQL, Docker và Node.js dẫn đầu CSDL, cloud và web framework.</w:t>
+          <w:t xml:space="preserve">Hình 2.3: PostgreSQL, Docker và Node.js dẫn đầu CSDL, cloud và web framework.</w:t>
         </w:r>
         <w:r>
           <w:tab/>
@@ -3504,9 +3504,9 @@
           <w:tab w:pos="9061" w:val="right" w:leader="dot"/>
         </w:tabs>
       </w:pPr>
-      <w:hyperlink w:anchor="_Toc1502257151" w:history="1">
+      <w:hyperlink w:anchor="_Toc3275664789" w:history="1">
         <w:r>
-          <w:t xml:space="preserve">Hình 3.4: JavaScript dùng nhiều nhất nhưng chỉ 64% ngưỡng mộ; Rust đạt 85%.</w:t>
+          <w:t xml:space="preserve">Hình 2.4: JavaScript dùng nhiều nhất nhưng chỉ 64% ngưỡng mộ; Rust đạt 85%.</w:t>
         </w:r>
         <w:r>
           <w:tab/>
@@ -3523,9 +3523,9 @@
           <w:tab w:pos="9061" w:val="right" w:leader="dot"/>
         </w:tabs>
       </w:pPr>
-      <w:hyperlink w:anchor="_Toc2100187553" w:history="1">
+      <w:hyperlink w:anchor="_Toc1289118110" w:history="1">
         <w:r>
-          <w:t xml:space="preserve">Hình 3.5: Rust được muốn dùng vượt mức đang dùng 19,3 điểm %, JavaScript thấp hơn 27,2 điểm %.</w:t>
+          <w:t xml:space="preserve">Hình 2.5: Rust được muốn dùng vượt mức đang dùng 19,3 điểm %, JavaScript thấp hơn 27,2 điểm %.</w:t>
         </w:r>
         <w:r>
           <w:tab/>
@@ -3542,9 +3542,9 @@
           <w:tab w:pos="9061" w:val="right" w:leader="dot"/>
         </w:tabs>
       </w:pPr>
-      <w:hyperlink w:anchor="_Toc2372507050" w:history="1">
+      <w:hyperlink w:anchor="_Toc2362194972" w:history="1">
         <w:r>
-          <w:t xml:space="preserve">Hình 3.6: Có 5 cụm ngôn ngữ hay được dùng chung.</w:t>
+          <w:t xml:space="preserve">Hình 2.6: Có 5 cụm ngôn ngữ hay được dùng chung.</w:t>
         </w:r>
         <w:r>
           <w:tab/>
@@ -3561,9 +3561,9 @@
           <w:tab w:pos="9061" w:val="right" w:leader="dot"/>
         </w:tabs>
       </w:pPr>
-      <w:hyperlink w:anchor="_Toc2136881815" w:history="1">
+      <w:hyperlink w:anchor="_Toc2197880074" w:history="1">
         <w:r>
-          <w:t xml:space="preserve">Hình 3.7: Người dùng JavaScript thường muốn dùng thêm HTML/CSS (52%).</w:t>
+          <w:t xml:space="preserve">Hình 2.7: Người dùng JavaScript thường muốn dùng thêm HTML/CSS (52%).</w:t>
         </w:r>
         <w:r>
           <w:tab/>
@@ -3580,9 +3580,9 @@
           <w:tab w:pos="9061" w:val="right" w:leader="dot"/>
         </w:tabs>
       </w:pPr>
-      <w:hyperlink w:anchor="_Toc1674276452" w:history="1">
+      <w:hyperlink w:anchor="_Toc2497370026" w:history="1">
         <w:r>
-          <w:t xml:space="preserve">Hình 4.1: Median lương 79.578 USD thấp hơn mean 92.934 USD: phân phối lệch phải.</w:t>
+          <w:t xml:space="preserve">Hình 3.1: Median lương 79.578 USD thấp hơn mean 92.934 USD: phân phối lệch phải.</w:t>
         </w:r>
         <w:r>
           <w:tab/>
@@ -3599,9 +3599,9 @@
           <w:tab w:pos="9061" w:val="right" w:leader="dot"/>
         </w:tabs>
       </w:pPr>
-      <w:hyperlink w:anchor="_Toc3463762891" w:history="1">
+      <w:hyperlink w:anchor="_Toc3203823686" w:history="1">
         <w:r>
-          <w:t xml:space="preserve">Hình 4.2: Engineering manager có median lương cao nhất (133.417 USD), gấp 2,0 lần Front-end.</w:t>
+          <w:t xml:space="preserve">Hình 3.2: Engineering manager có median lương cao nhất (133.417 USD), gấp 2,0 lần Front-end.</w:t>
         </w:r>
         <w:r>
           <w:tab/>
@@ -3618,9 +3618,9 @@
           <w:tab w:pos="9061" w:val="right" w:leader="dot"/>
         </w:tabs>
       </w:pPr>
-      <w:hyperlink w:anchor="_Toc3735082485" w:history="1">
+      <w:hyperlink w:anchor="_Toc3454008079" w:history="1">
         <w:r>
-          <w:t xml:space="preserve">Hình 4.3: Median lương tăng từ 28.083 USD (0–2 năm) lên 111.515 USD (21+ năm).</w:t>
+          <w:t xml:space="preserve">Hình 3.3: Median lương tăng từ 28.083 USD (0–2 năm) lên 111.515 USD (21+ năm).</w:t>
         </w:r>
         <w:r>
           <w:tab/>
@@ -3637,9 +3637,9 @@
           <w:tab w:pos="9061" w:val="right" w:leader="dot"/>
         </w:tabs>
       </w:pPr>
-      <w:hyperlink w:anchor="_Toc935326842" w:history="1">
+      <w:hyperlink w:anchor="_Toc3232648628" w:history="1">
         <w:r>
-          <w:t xml:space="preserve">Hình 4.4: Giữa 15 ngôn ngữ phổ biến, median lương chênh 49%: từ PHP đến Go.</w:t>
+          <w:t xml:space="preserve">Hình 3.4: Giữa 15 ngôn ngữ phổ biến, median lương chênh 49%: từ PHP đến Go.</w:t>
         </w:r>
         <w:r>
           <w:tab/>
@@ -3656,9 +3656,9 @@
           <w:tab w:pos="9061" w:val="right" w:leader="dot"/>
         </w:tabs>
       </w:pPr>
-      <w:hyperlink w:anchor="_Toc2984389420" w:history="1">
+      <w:hyperlink w:anchor="_Toc2204581035" w:history="1">
         <w:r>
-          <w:t xml:space="preserve">Hình 4.5: Architect có median lương cao nhất ở 10/10 ngôn ngữ được so sánh.</w:t>
+          <w:t xml:space="preserve">Hình 3.5: Architect có median lương cao nhất ở 10/10 ngôn ngữ được so sánh.</w:t>
         </w:r>
         <w:r>
           <w:tab/>
@@ -3675,9 +3675,9 @@
           <w:tab w:pos="9061" w:val="right" w:leader="dot"/>
         </w:tabs>
       </w:pPr>
-      <w:hyperlink w:anchor="_Toc1012992342" w:history="1">
+      <w:hyperlink w:anchor="_Toc2812199631" w:history="1">
         <w:r>
-          <w:t xml:space="preserve">Hình 4.6: Quốc gia một mình giải thích 45% biến thiên lương; thêm 15 ngôn ngữ chỉ cộng 2,6 điểm phần trăm.</w:t>
+          <w:t xml:space="preserve">Hình 3.6: Quốc gia một mình giải thích 45% biến thiên lương; thêm 15 ngôn ngữ chỉ cộng 2,6 điểm phần trăm.</w:t>
         </w:r>
         <w:r>
           <w:tab/>
@@ -3694,9 +3694,9 @@
           <w:tab w:pos="9061" w:val="right" w:leader="dot"/>
         </w:tabs>
       </w:pPr>
-      <w:hyperlink w:anchor="_Toc1305277471" w:history="1">
+      <w:hyperlink w:anchor="_Toc2793605284" w:history="1">
         <w:r>
-          <w:t xml:space="preserve">Hình 4.7: Sau khi cố định nước và kinh nghiệm, chênh lệch lương theo ngôn ngữ chỉ từ −21% đến 14%.</w:t>
+          <w:t xml:space="preserve">Hình 3.7: Sau khi cố định nước và kinh nghiệm, chênh lệch lương theo ngôn ngữ chỉ từ −21% đến 14%.</w:t>
         </w:r>
         <w:r>
           <w:tab/>
@@ -3713,9 +3713,9 @@
           <w:tab w:pos="9061" w:val="right" w:leader="dot"/>
         </w:tabs>
       </w:pPr>
-      <w:hyperlink w:anchor="_Toc337426000" w:history="1">
+      <w:hyperlink w:anchor="_Toc579378501" w:history="1">
         <w:r>
-          <w:t xml:space="preserve">Hình 4.8: Median lương cao nhất ở United States (150.000 USD), thấp nhất ở Nigeria (3.874 USD); Việt Nam 11.464 USD.</w:t>
+          <w:t xml:space="preserve">Hình 3.8: Median lương cao nhất ở United States (150.000 USD), thấp nhất ở Nigeria (3.874 USD); Việt Nam 11.464 USD.</w:t>
         </w:r>
         <w:r>
           <w:tab/>
@@ -3732,9 +3732,9 @@
           <w:tab w:pos="9061" w:val="right" w:leader="dot"/>
         </w:tabs>
       </w:pPr>
-      <w:hyperlink w:anchor="_Toc961331276" w:history="1">
+      <w:hyperlink w:anchor="_Toc2866976734" w:history="1">
         <w:r>
-          <w:t xml:space="preserve">Hình 4.9: Việt Nam xếp thứ 57/62 nước về median lương (11.464 USD), mẫu chỉ 31 người.</w:t>
+          <w:t xml:space="preserve">Hình 3.9: Việt Nam xếp thứ 57/62 nước về median lương (11.464 USD), mẫu chỉ 31 người.</w:t>
         </w:r>
         <w:r>
           <w:tab/>
@@ -3751,9 +3751,9 @@
           <w:tab w:pos="9061" w:val="right" w:leader="dot"/>
         </w:tabs>
       </w:pPr>
-      <w:hyperlink w:anchor="_Toc1509602278" w:history="1">
+      <w:hyperlink w:anchor="_Toc1738406413" w:history="1">
         <w:r>
-          <w:t xml:space="preserve">Hình 4.10: AI/ML engineer dùng AI hằng ngày nhiều nhất (74%), Engineering manager có lương cao nhất.</w:t>
+          <w:t xml:space="preserve">Hình 3.10: AI/ML engineer dùng AI hằng ngày nhiều nhất (74%), Engineering manager có lương cao nhất.</w:t>
         </w:r>
         <w:r>
           <w:tab/>
@@ -3770,9 +3770,9 @@
           <w:tab w:pos="9061" w:val="right" w:leader="dot"/>
         </w:tabs>
       </w:pPr>
-      <w:hyperlink w:anchor="_Toc2568708478" w:history="1">
+      <w:hyperlink w:anchor="_Toc1570631616" w:history="1">
         <w:r>
-          <w:t xml:space="preserve">Hình 4.11: Giá trị thật của 4 chỉ số: vai trò tô màu là 3 vai trò trong spider.</w:t>
+          <w:t xml:space="preserve">Hình 3.11: Giá trị thật của 4 chỉ số: vai trò tô màu là 3 vai trò trong spider.</w:t>
         </w:r>
         <w:r>
           <w:tab/>
@@ -3789,9 +3789,9 @@
           <w:tab w:pos="9061" w:val="right" w:leader="dot"/>
         </w:tabs>
       </w:pPr>
-      <w:hyperlink w:anchor="_Toc4154492226" w:history="1">
+      <w:hyperlink w:anchor="_Toc3327702397" w:history="1">
         <w:r>
-          <w:t xml:space="preserve">Hình 5.1: ai, problem, code là những từ được nhắc nhiều nhất khi nói về kỹ năng còn giá trị.</w:t>
+          <w:t xml:space="preserve">Hình 4.1: ai, problem, code là những từ được nhắc nhiều nhất khi nói về kỹ năng còn giá trị.</w:t>
         </w:r>
         <w:r>
           <w:tab/>
@@ -3808,9 +3808,9 @@
           <w:tab w:pos="9061" w:val="right" w:leader="dot"/>
         </w:tabs>
       </w:pPr>
-      <w:hyperlink w:anchor="_Toc2827397134" w:history="1">
+      <w:hyperlink w:anchor="_Toc4058026085" w:history="1">
         <w:r>
-          <w:t xml:space="preserve">Hình 5.2: Top 20 từ khóa: ai, problem, code, understanding dẫn đầu.</w:t>
+          <w:t xml:space="preserve">Hình 4.2: Top 20 từ khóa: ai, problem, code, understanding dẫn đầu.</w:t>
         </w:r>
         <w:r>
           <w:tab/>
@@ -4598,6 +4598,260 @@
     </w:p>
     <w:p>
       <w:pPr>
+        <w:pStyle w:val="section"/>
+        <w:pageBreakBefore/>
+      </w:pPr>
+      <w:bookmarkStart w:id="6" w:name="_Toc2380338264"/>
+      <w:r>
+        <w:t>GIỚI THIỆU</w:t>
+      </w:r>
+      <w:bookmarkEnd w:id="6"/>
+    </w:p>
+    <w:p>
+      <w:pPr>
+        <w:pStyle w:val="Heading2"/>
+        <w:pageBreakBefore w:val="0"/>
+        <w:numPr>
+          <w:ilvl w:val="0"/>
+          <w:numId w:val="0"/>
+        </w:numPr>
+      </w:pPr>
+      <w:bookmarkStart w:id="7" w:name="_Toc1625638599"/>
+      <w:r>
+        <w:t>Bối cảnh</w:t>
+      </w:r>
+      <w:bookmarkEnd w:id="7"/>
+    </w:p>
+    <w:p>
+      <w:r>
+        <w:rPr>
+          <w:i w:val="0"/>
+        </w:rPr>
+        <w:t>Mỗi năm, Stack Overflow thực hiện một cuộc khảo sát lớn với cộng đồng lập trình viên trên toàn thế giới về công nghệ họ sử dụng, công cụ họ yêu thích, công việc và thu nhập. Bộ dữ liệu năm 2025 gồm 49.191 phản hồi, trong đó 76% là lập trình viên chuyên nghiệp. Đây là một trong những nguồn dữ liệu công khai lớn nhất về hệ sinh thái lập trình và là nguồn tham khảo quen thuộc của sinh viên, nhà tuyển dụng và các nhóm kỹ thuật.</w:t>
+      </w:r>
+    </w:p>
+    <w:p>
+      <w:r>
+        <w:rPr>
+          <w:i w:val="0"/>
+        </w:rPr>
+        <w:t>Với sinh viên và lập trình viên mới, hai câu hỏi thực tế nhất là nên học công nghệ nào và có thể kỳ vọng mức lương ra sao. Hai câu hỏi này thường được trả lời bằng ý kiến cá nhân hoặc các bảng xếp hạng đơn giản. Dữ liệu khảo sát cho phép trả lời có bằng chứng hơn, nhưng cần trực quan hóa cẩn thận vì dữ liệu lớn, nhiều cột chọn nhiều đáp án, lương lệch rất mạnh và mẫu không đồng đều giữa các nước.</w:t>
+      </w:r>
+    </w:p>
+    <w:p>
+      <w:pPr>
+        <w:pStyle w:val="Heading2"/>
+        <w:pageBreakBefore w:val="0"/>
+        <w:numPr>
+          <w:ilvl w:val="0"/>
+          <w:numId w:val="0"/>
+        </w:numPr>
+      </w:pPr>
+      <w:bookmarkStart w:id="8" w:name="_Toc2236665712"/>
+      <w:r>
+        <w:t>Mục tiêu và đối tượng</w:t>
+      </w:r>
+      <w:bookmarkEnd w:id="8"/>
+    </w:p>
+    <w:p>
+      <w:r>
+        <w:rPr>
+          <w:i w:val="0"/>
+        </w:rPr>
+        <w:t>Bài tập lớn có ba mục tiêu: (1) mô tả xu hướng công nghệ qua ba chỉ số là đang dùng, muốn dùng và được ngưỡng mộ; (2) mô tả mức lương và các yếu tố đi cùng mức lương; (3) kiểm chứng bằng một mô hình định lượng đơn giản xem yếu tố nào giải thích lương nhiều nhất.</w:t>
+      </w:r>
+    </w:p>
+    <w:p>
+      <w:r>
+        <w:rPr>
+          <w:i/>
+        </w:rPr>
+        <w:t>Theo cách đặt mục tiêu giao tiếp của bài giảng Data Storytelling, đối tượng của sản phẩm là sinh viên và lập trình viên mới ở Việt Nam. Mục tiêu giao tiếp: sau khi xem, họ sẽ hiểu công nghệ nào đang được dùng và ngưỡng mộ, mức lương đi cùng những yếu tố nào, từ đó có thể chọn công nghệ để học và đặt kỳ vọng lương hợp lý.</w:t>
+      </w:r>
+    </w:p>
+    <w:p>
+      <w:pPr>
+        <w:pStyle w:val="Heading2"/>
+        <w:pageBreakBefore w:val="0"/>
+        <w:numPr>
+          <w:ilvl w:val="0"/>
+          <w:numId w:val="0"/>
+        </w:numPr>
+      </w:pPr>
+      <w:bookmarkStart w:id="9" w:name="_Toc1030828578"/>
+      <w:r>
+        <w:t>Câu hỏi phân tích</w:t>
+      </w:r>
+      <w:bookmarkEnd w:id="9"/>
+    </w:p>
+    <w:p>
+      <w:pPr>
+        <w:numPr>
+          <w:ilvl w:val="0"/>
+          <w:numId w:val="2"/>
+        </w:numPr>
+        <w:tabs>
+          <w:tab w:pos="210" w:val="left"/>
+        </w:tabs>
+        <w:spacing w:line="264" w:lineRule="auto"/>
+      </w:pPr>
+      <w:r>
+        <w:t>Q1. Ai là người trả lời khảo sát, và mẫu có lệch không?</w:t>
+      </w:r>
+    </w:p>
+    <w:p>
+      <w:pPr>
+        <w:numPr>
+          <w:ilvl w:val="0"/>
+          <w:numId w:val="2"/>
+        </w:numPr>
+        <w:tabs>
+          <w:tab w:pos="210" w:val="left"/>
+        </w:tabs>
+        <w:spacing w:line="264" w:lineRule="auto"/>
+      </w:pPr>
+      <w:r>
+        <w:t>Q2. Công nghệ nào (ngôn ngữ, cơ sở dữ liệu, cloud, web framework) đang được dùng nhiều nhất?</w:t>
+      </w:r>
+    </w:p>
+    <w:p>
+      <w:pPr>
+        <w:numPr>
+          <w:ilvl w:val="0"/>
+          <w:numId w:val="2"/>
+        </w:numPr>
+        <w:tabs>
+          <w:tab w:pos="210" w:val="left"/>
+        </w:tabs>
+        <w:spacing w:line="264" w:lineRule="auto"/>
+      </w:pPr>
+      <w:r>
+        <w:t>Q3. Công nghệ dùng nhiều có được ngưỡng mộ và muốn dùng nhiều không?</w:t>
+      </w:r>
+    </w:p>
+    <w:p>
+      <w:pPr>
+        <w:numPr>
+          <w:ilvl w:val="0"/>
+          <w:numId w:val="2"/>
+        </w:numPr>
+        <w:tabs>
+          <w:tab w:pos="210" w:val="left"/>
+        </w:tabs>
+        <w:spacing w:line="264" w:lineRule="auto"/>
+      </w:pPr>
+      <w:r>
+        <w:t>Q4. Các ngôn ngữ đi cùng nhau thế nào, và người đang dùng ngôn ngữ này muốn dùng thêm ngôn ngữ nào?</w:t>
+      </w:r>
+    </w:p>
+    <w:p>
+      <w:pPr>
+        <w:numPr>
+          <w:ilvl w:val="0"/>
+          <w:numId w:val="2"/>
+        </w:numPr>
+        <w:tabs>
+          <w:tab w:pos="210" w:val="left"/>
+        </w:tabs>
+        <w:spacing w:line="264" w:lineRule="auto"/>
+      </w:pPr>
+      <w:r>
+        <w:t>Q5. Phân phối lương theo vai trò và theo số năm kinh nghiệm ra sao?</w:t>
+      </w:r>
+    </w:p>
+    <w:p>
+      <w:pPr>
+        <w:numPr>
+          <w:ilvl w:val="0"/>
+          <w:numId w:val="2"/>
+        </w:numPr>
+        <w:tabs>
+          <w:tab w:pos="210" w:val="left"/>
+        </w:tabs>
+        <w:spacing w:line="264" w:lineRule="auto"/>
+      </w:pPr>
+      <w:r>
+        <w:t>Q6. Công nghệ nào đi cùng mức lương cao, sau khi tách ảnh hưởng của quốc gia và kinh nghiệm?</w:t>
+      </w:r>
+    </w:p>
+    <w:p>
+      <w:pPr>
+        <w:numPr>
+          <w:ilvl w:val="0"/>
+          <w:numId w:val="2"/>
+        </w:numPr>
+        <w:tabs>
+          <w:tab w:pos="210" w:val="left"/>
+        </w:tabs>
+        <w:spacing w:line="264" w:lineRule="auto"/>
+      </w:pPr>
+      <w:r>
+        <w:t>Q7. Lương khác nhau thế nào giữa các nước, và Việt Nam đứng ở đâu?</w:t>
+      </w:r>
+    </w:p>
+    <w:p>
+      <w:pPr>
+        <w:numPr>
+          <w:ilvl w:val="0"/>
+          <w:numId w:val="2"/>
+        </w:numPr>
+        <w:tabs>
+          <w:tab w:pos="210" w:val="left"/>
+        </w:tabs>
+        <w:spacing w:line="264" w:lineRule="auto"/>
+      </w:pPr>
+      <w:r>
+        <w:t>Q8. Các vai trò khác nhau thế nào về lương, kinh nghiệm, mức dùng AI và mức hài lòng?</w:t>
+      </w:r>
+    </w:p>
+    <w:p>
+      <w:pPr>
+        <w:numPr>
+          <w:ilvl w:val="0"/>
+          <w:numId w:val="2"/>
+        </w:numPr>
+        <w:tabs>
+          <w:tab w:pos="210" w:val="left"/>
+        </w:tabs>
+        <w:spacing w:line="264" w:lineRule="auto"/>
+      </w:pPr>
+      <w:r>
+        <w:t>Q9. Người trả lời cho rằng kỹ năng nào còn giá trị trong 3–5 năm tới?</w:t>
+      </w:r>
+    </w:p>
+    <w:p>
+      <w:pPr>
+        <w:pStyle w:val="Heading2"/>
+        <w:pageBreakBefore w:val="0"/>
+        <w:numPr>
+          <w:ilvl w:val="0"/>
+          <w:numId w:val="0"/>
+        </w:numPr>
+      </w:pPr>
+      <w:bookmarkStart w:id="10" w:name="_Toc2501247624"/>
+      <w:r>
+        <w:t>Phạm vi và cấu trúc báo cáo</w:t>
+      </w:r>
+      <w:bookmarkEnd w:id="10"/>
+    </w:p>
+    <w:p>
+      <w:r>
+        <w:rPr>
+          <w:i w:val="0"/>
+        </w:rPr>
+        <w:t>Phạm vi chỉ gồm dữ liệu khảo sát năm 2025 nên không đo được thay đổi theo thời gian; vì vậy khái niệm xu hướng được thay bằng ba chỉ số nói trên. Bài tập lớn không xây dashboard tương tác mà tập trung vào ba sản phẩm: notebook phân tích, bộ slide thuyết trình và báo cáo này.</w:t>
+      </w:r>
+    </w:p>
+    <w:p>
+      <w:r>
+        <w:rPr>
+          <w:i w:val="0"/>
+        </w:rPr>
+        <w:t>Báo cáo gồm phần giới thiệu, bốn chương và phần kết luận. Chương 1 mô tả dữ liệu và cách tiền xử lý. Chương 2 phân tích xu hướng công nghệ. Chương 3 phân tích mức lương, gồm cả mô hình hồi quy kiểm chứng. Chương 4 bàn về AI và kỹ năng tương lai rồi kể lại câu chuyện dữ liệu hoàn chỉnh. Phần kết luận nêu kết luận, khuyến nghị, hạn chế và hướng phát triển. Mỗi biểu đồ có ba phần: cách đọc, nhận xét và insight.</w:t>
+      </w:r>
+    </w:p>
+    <w:p>
+      <w:pPr>
         <w:pStyle w:val="Heading1"/>
         <w:pageBreakBefore/>
         <w:numPr>
@@ -4605,11 +4859,11 @@
           <w:numId w:val="0"/>
         </w:numPr>
       </w:pPr>
-      <w:bookmarkStart w:id="6" w:name="_Toc3544288922"/>
-      <w:r>
-        <w:t>CHƯƠNG 1. GIỚI THIỆU</w:t>
-      </w:r>
-      <w:bookmarkEnd w:id="6"/>
+      <w:bookmarkStart w:id="11" w:name="_Toc3482549959"/>
+      <w:r>
+        <w:t>CHƯƠNG 1. DỮ LIỆU VÀ TIỀN XỬ LÝ</w:t>
+      </w:r>
+      <w:bookmarkEnd w:id="11"/>
     </w:p>
     <w:p>
       <w:pPr>
@@ -4620,18 +4874,18 @@
           <w:numId w:val="0"/>
         </w:numPr>
       </w:pPr>
-      <w:bookmarkStart w:id="7" w:name="_Toc2615902355"/>
-      <w:r>
-        <w:t>1.1. Bối cảnh</w:t>
-      </w:r>
-      <w:bookmarkEnd w:id="7"/>
+      <w:bookmarkStart w:id="12" w:name="_Toc382368697"/>
+      <w:r>
+        <w:t>1.1. Nguồn dữ liệu và cấu trúc</w:t>
+      </w:r>
+      <w:bookmarkEnd w:id="12"/>
     </w:p>
     <w:p>
       <w:r>
         <w:rPr>
           <w:i w:val="0"/>
         </w:rPr>
-        <w:t>Mỗi năm, Stack Overflow thực hiện một cuộc khảo sát lớn với cộng đồng lập trình viên trên toàn thế giới về công nghệ họ sử dụng, công cụ họ yêu thích, công việc và thu nhập. Bộ dữ liệu năm 2025 gồm 49.191 phản hồi, trong đó 76% là lập trình viên chuyên nghiệp. Đây là một trong những nguồn dữ liệu công khai lớn nhất về hệ sinh thái lập trình và là nguồn tham khảo quen thuộc của sinh viên, nhà tuyển dụng và các nhóm kỹ thuật.</w:t>
+        <w:t>Dữ liệu lấy từ kho lưu trữ chính thức của Stack Overflow trên GitHub, gồm hai tệp: results.csv (câu trả lời) và schema.csv (mô tả câu hỏi). Dữ liệu được công bố công khai theo [1]. Tệp results.csv có 49.191 dòng và 172 cột, mỗi dòng là một người trả lời với mã ResponseId không trùng lặp. Tệp schema.csv có 139 dòng mô tả câu hỏi, gồm bốn kiểu: xếp hạng (49 dòng), chọn một hoặc nhiều đáp án (48), văn bản tự do (29) và ma trận (13).</w:t>
       </w:r>
     </w:p>
     <w:p>
@@ -4639,7 +4893,7 @@
         <w:rPr>
           <w:i w:val="0"/>
         </w:rPr>
-        <w:t>Với sinh viên và lập trình viên mới, hai câu hỏi thực tế nhất là nên học công nghệ nào và có thể kỳ vọng mức lương ra sao. Hai câu hỏi này thường được trả lời bằng ý kiến cá nhân hoặc các bảng xếp hạng đơn giản. Dữ liệu khảo sát cho phép trả lời có bằng chứng hơn, nhưng cần trực quan hóa cẩn thận vì dữ liệu lớn, nhiều cột chọn nhiều đáp án, lương lệch rất mạnh và mẫu không đồng đều giữa các nước.</w:t>
+        <w:t>Các cột thuộc ba nhóm. Nhóm thông tin nhân khẩu và công việc (tuổi, nước, vai trò, kinh nghiệm, thu nhập) có dạng số hoặc phân loại. Nhóm công nghệ (ngôn ngữ, cơ sở dữ liệu, cloud, web framework…) là các cột chọn nhiều đáp án, các đáp án nối nhau bằng dấu chấm phẩy, ví dụ 'Dart;HTML/CSS;JavaScript;TypeScript'. Nhóm câu hỏi mở chứa văn bản tự do. Cột ConvertedCompYearly là lương đã được quy đổi sang USD: trong 8.780 dòng có đơn vị tiền là USD, có 6.319 dòng có cả giá trị khai báo và giá trị quy đổi, và hai giá trị bằng nhau ở cả 6.319 dòng; các tiền tệ khác (EUR, UAH…) đã được quy đổi sẵn.</w:t>
       </w:r>
     </w:p>
     <w:p>
@@ -4651,293 +4905,35 @@
           <w:numId w:val="0"/>
         </w:numPr>
       </w:pPr>
-      <w:bookmarkStart w:id="8" w:name="_Toc3708436808"/>
-      <w:r>
-        <w:t>1.2. Mục tiêu và đối tượng</w:t>
-      </w:r>
-      <w:bookmarkEnd w:id="8"/>
+      <w:bookmarkStart w:id="13" w:name="_Toc670334709"/>
+      <w:r>
+        <w:t>1.2. Các biến được sử dụng</w:t>
+      </w:r>
+      <w:bookmarkEnd w:id="13"/>
     </w:p>
     <w:p>
       <w:r>
         <w:rPr>
           <w:i w:val="0"/>
         </w:rPr>
-        <w:t>Bài tập lớn có ba mục tiêu: (1) mô tả xu hướng công nghệ qua ba chỉ số là đang dùng, muốn dùng và được ngưỡng mộ; (2) mô tả mức lương và các yếu tố đi cùng mức lương; (3) kiểm chứng bằng một mô hình định lượng đơn giản xem yếu tố nào giải thích lương nhiều nhất.</w:t>
+        <w:t>Trong 172 cột, báo cáo chỉ dùng 15 biến liên quan trực tiếp tới các câu hỏi phân tích, liệt kê ở Bảng 1.1 cùng tỷ lệ người có trả lời mỗi biến.</w:t>
       </w:r>
     </w:p>
     <w:p>
-      <w:r>
-        <w:rPr>
-          <w:i/>
-        </w:rPr>
-        <w:t>Theo cách đặt mục tiêu giao tiếp của bài giảng Data Storytelling, đối tượng của sản phẩm là sinh viên và lập trình viên mới ở Việt Nam. Mục tiêu giao tiếp: sau khi xem, họ sẽ hiểu công nghệ nào đang được dùng và ngưỡng mộ, mức lương đi cùng những yếu tố nào, từ đó có thể chọn công nghệ để học và đặt kỳ vọng lương hợp lý.</w:t>
-      </w:r>
-    </w:p>
-    <w:p>
-      <w:pPr>
-        <w:pStyle w:val="Heading2"/>
-        <w:pageBreakBefore w:val="0"/>
-        <w:numPr>
-          <w:ilvl w:val="0"/>
-          <w:numId w:val="0"/>
-        </w:numPr>
-      </w:pPr>
-      <w:bookmarkStart w:id="9" w:name="_Toc2781230238"/>
-      <w:r>
-        <w:t>1.3. Câu hỏi phân tích</w:t>
-      </w:r>
-      <w:bookmarkEnd w:id="9"/>
-    </w:p>
-    <w:p>
-      <w:pPr>
-        <w:numPr>
-          <w:ilvl w:val="0"/>
-          <w:numId w:val="2"/>
-        </w:numPr>
-        <w:tabs>
-          <w:tab w:pos="210" w:val="left"/>
-        </w:tabs>
-        <w:spacing w:line="264" w:lineRule="auto"/>
-      </w:pPr>
-      <w:r>
-        <w:t>Q1. Ai là người trả lời khảo sát, và mẫu có lệch không?</w:t>
-      </w:r>
-    </w:p>
-    <w:p>
-      <w:pPr>
-        <w:numPr>
-          <w:ilvl w:val="0"/>
-          <w:numId w:val="2"/>
-        </w:numPr>
-        <w:tabs>
-          <w:tab w:pos="210" w:val="left"/>
-        </w:tabs>
-        <w:spacing w:line="264" w:lineRule="auto"/>
-      </w:pPr>
-      <w:r>
-        <w:t>Q2. Công nghệ nào (ngôn ngữ, cơ sở dữ liệu, cloud, web framework) đang được dùng nhiều nhất?</w:t>
-      </w:r>
-    </w:p>
-    <w:p>
-      <w:pPr>
-        <w:numPr>
-          <w:ilvl w:val="0"/>
-          <w:numId w:val="2"/>
-        </w:numPr>
-        <w:tabs>
-          <w:tab w:pos="210" w:val="left"/>
-        </w:tabs>
-        <w:spacing w:line="264" w:lineRule="auto"/>
-      </w:pPr>
-      <w:r>
-        <w:t>Q3. Công nghệ dùng nhiều có được ngưỡng mộ và muốn dùng nhiều không?</w:t>
-      </w:r>
-    </w:p>
-    <w:p>
-      <w:pPr>
-        <w:numPr>
-          <w:ilvl w:val="0"/>
-          <w:numId w:val="2"/>
-        </w:numPr>
-        <w:tabs>
-          <w:tab w:pos="210" w:val="left"/>
-        </w:tabs>
-        <w:spacing w:line="264" w:lineRule="auto"/>
-      </w:pPr>
-      <w:r>
-        <w:t>Q4. Các ngôn ngữ đi cùng nhau thế nào, và người đang dùng ngôn ngữ này muốn dùng thêm ngôn ngữ nào?</w:t>
-      </w:r>
-    </w:p>
-    <w:p>
-      <w:pPr>
-        <w:numPr>
-          <w:ilvl w:val="0"/>
-          <w:numId w:val="2"/>
-        </w:numPr>
-        <w:tabs>
-          <w:tab w:pos="210" w:val="left"/>
-        </w:tabs>
-        <w:spacing w:line="264" w:lineRule="auto"/>
-      </w:pPr>
-      <w:r>
-        <w:t>Q5. Phân phối lương theo vai trò và theo số năm kinh nghiệm ra sao?</w:t>
-      </w:r>
-    </w:p>
-    <w:p>
-      <w:pPr>
-        <w:numPr>
-          <w:ilvl w:val="0"/>
-          <w:numId w:val="2"/>
-        </w:numPr>
-        <w:tabs>
-          <w:tab w:pos="210" w:val="left"/>
-        </w:tabs>
-        <w:spacing w:line="264" w:lineRule="auto"/>
-      </w:pPr>
-      <w:r>
-        <w:t>Q6. Công nghệ nào đi cùng mức lương cao, sau khi tách ảnh hưởng của quốc gia và kinh nghiệm?</w:t>
-      </w:r>
-    </w:p>
-    <w:p>
-      <w:pPr>
-        <w:numPr>
-          <w:ilvl w:val="0"/>
-          <w:numId w:val="2"/>
-        </w:numPr>
-        <w:tabs>
-          <w:tab w:pos="210" w:val="left"/>
-        </w:tabs>
-        <w:spacing w:line="264" w:lineRule="auto"/>
-      </w:pPr>
-      <w:r>
-        <w:t>Q7. Lương khác nhau thế nào giữa các nước, và Việt Nam đứng ở đâu?</w:t>
-      </w:r>
-    </w:p>
-    <w:p>
-      <w:pPr>
-        <w:numPr>
-          <w:ilvl w:val="0"/>
-          <w:numId w:val="2"/>
-        </w:numPr>
-        <w:tabs>
-          <w:tab w:pos="210" w:val="left"/>
-        </w:tabs>
-        <w:spacing w:line="264" w:lineRule="auto"/>
-      </w:pPr>
-      <w:r>
-        <w:t>Q8. Các vai trò khác nhau thế nào về lương, kinh nghiệm, mức dùng AI và mức hài lòng?</w:t>
-      </w:r>
-    </w:p>
-    <w:p>
-      <w:pPr>
-        <w:numPr>
-          <w:ilvl w:val="0"/>
-          <w:numId w:val="2"/>
-        </w:numPr>
-        <w:tabs>
-          <w:tab w:pos="210" w:val="left"/>
-        </w:tabs>
-        <w:spacing w:line="264" w:lineRule="auto"/>
-      </w:pPr>
-      <w:r>
-        <w:t>Q9. Người trả lời cho rằng kỹ năng nào còn giá trị trong 3–5 năm tới?</w:t>
-      </w:r>
-    </w:p>
-    <w:p>
-      <w:pPr>
-        <w:pStyle w:val="Heading2"/>
-        <w:pageBreakBefore w:val="0"/>
-        <w:numPr>
-          <w:ilvl w:val="0"/>
-          <w:numId w:val="0"/>
-        </w:numPr>
-      </w:pPr>
-      <w:bookmarkStart w:id="10" w:name="_Toc4111894682"/>
-      <w:r>
-        <w:t>1.4. Phạm vi và cấu trúc báo cáo</w:t>
-      </w:r>
-      <w:bookmarkEnd w:id="10"/>
-    </w:p>
-    <w:p>
-      <w:r>
-        <w:rPr>
-          <w:i w:val="0"/>
-        </w:rPr>
-        <w:t>Phạm vi chỉ gồm dữ liệu khảo sát năm 2025 nên không đo được thay đổi theo thời gian; vì vậy khái niệm xu hướng được thay bằng ba chỉ số nói trên. Bài tập lớn không xây dashboard tương tác mà tập trung vào ba sản phẩm: notebook phân tích, bộ slide thuyết trình và báo cáo này.</w:t>
-      </w:r>
-    </w:p>
-    <w:p>
-      <w:r>
-        <w:rPr>
-          <w:i w:val="0"/>
-        </w:rPr>
-        <w:t>Báo cáo gồm sáu chương. Chương 2 mô tả dữ liệu và cách tiền xử lý. Chương 3 phân tích xu hướng công nghệ. Chương 4 phân tích mức lương, gồm cả mô hình hồi quy kiểm chứng. Chương 5 bàn về AI và kỹ năng tương lai rồi kể lại câu chuyện dữ liệu hoàn chỉnh. Chương 6 nêu kết luận, khuyến nghị, hạn chế và hướng phát triển. Mỗi biểu đồ có ba phần: cách đọc, nhận xét và insight.</w:t>
-      </w:r>
-    </w:p>
-    <w:p>
-      <w:pPr>
-        <w:pStyle w:val="Heading1"/>
-        <w:pageBreakBefore/>
-        <w:numPr>
-          <w:ilvl w:val="0"/>
-          <w:numId w:val="0"/>
-        </w:numPr>
-      </w:pPr>
-      <w:bookmarkStart w:id="11" w:name="_Toc2719321501"/>
-      <w:r>
-        <w:t>CHƯƠNG 2. DỮ LIỆU VÀ TIỀN XỬ LÝ</w:t>
-      </w:r>
-      <w:bookmarkEnd w:id="11"/>
-    </w:p>
-    <w:p>
-      <w:pPr>
-        <w:pStyle w:val="Heading2"/>
-        <w:pageBreakBefore w:val="0"/>
-        <w:numPr>
-          <w:ilvl w:val="0"/>
-          <w:numId w:val="0"/>
-        </w:numPr>
-      </w:pPr>
-      <w:bookmarkStart w:id="12" w:name="_Toc1014418225"/>
-      <w:r>
-        <w:t>2.1. Nguồn dữ liệu và cấu trúc</w:t>
-      </w:r>
-      <w:bookmarkEnd w:id="12"/>
-    </w:p>
-    <w:p>
-      <w:r>
-        <w:rPr>
-          <w:i w:val="0"/>
-        </w:rPr>
-        <w:t>Dữ liệu lấy từ kho lưu trữ chính thức của Stack Overflow trên GitHub, gồm hai tệp: results.csv (câu trả lời) và schema.csv (mô tả câu hỏi). Dữ liệu được công bố công khai theo [1]. Tệp results.csv có 49.191 dòng và 172 cột, mỗi dòng là một người trả lời với mã ResponseId không trùng lặp. Tệp schema.csv có 139 dòng mô tả câu hỏi, gồm bốn kiểu: xếp hạng (49 dòng), chọn một hoặc nhiều đáp án (48), văn bản tự do (29) và ma trận (13).</w:t>
-      </w:r>
-    </w:p>
-    <w:p>
-      <w:r>
-        <w:rPr>
-          <w:i w:val="0"/>
-        </w:rPr>
-        <w:t>Các cột thuộc ba nhóm. Nhóm thông tin nhân khẩu và công việc (tuổi, nước, vai trò, kinh nghiệm, thu nhập) có dạng số hoặc phân loại. Nhóm công nghệ (ngôn ngữ, cơ sở dữ liệu, cloud, web framework…) là các cột chọn nhiều đáp án, các đáp án nối nhau bằng dấu chấm phẩy, ví dụ 'Dart;HTML/CSS;JavaScript;TypeScript'. Nhóm câu hỏi mở chứa văn bản tự do. Cột ConvertedCompYearly là lương đã được quy đổi sang USD: trong 8.780 dòng có đơn vị tiền là USD, có 6.319 dòng có cả giá trị khai báo và giá trị quy đổi, và hai giá trị bằng nhau ở cả 6.319 dòng; các tiền tệ khác (EUR, UAH…) đã được quy đổi sẵn.</w:t>
-      </w:r>
-    </w:p>
-    <w:p>
-      <w:pPr>
-        <w:pStyle w:val="Heading2"/>
-        <w:pageBreakBefore w:val="0"/>
-        <w:numPr>
-          <w:ilvl w:val="0"/>
-          <w:numId w:val="0"/>
-        </w:numPr>
-      </w:pPr>
-      <w:bookmarkStart w:id="13" w:name="_Toc2106933653"/>
-      <w:r>
-        <w:t>2.2. Các biến được sử dụng</w:t>
-      </w:r>
-      <w:bookmarkEnd w:id="13"/>
-    </w:p>
-    <w:p>
-      <w:r>
-        <w:rPr>
-          <w:i w:val="0"/>
-        </w:rPr>
-        <w:t>Trong 172 cột, báo cáo chỉ dùng 15 biến liên quan trực tiếp tới các câu hỏi phân tích, liệt kê ở Bảng 2.1 cùng tỷ lệ người có trả lời mỗi biến.</w:t>
-      </w:r>
-    </w:p>
-    <w:p>
       <w:pPr>
         <w:pStyle w:val="Caption"/>
         <w:keepNext/>
       </w:pPr>
-      <w:bookmarkStart w:id="14" w:name="_Toc2854989561"/>
-      <w:r>
-        <w:t>Bảng 2.1: Các biến được sử dụng và tỷ lệ người có trả lời.</w:t>
+      <w:bookmarkStart w:id="14" w:name="_Toc862669206"/>
+      <w:r>
+        <w:t>Bảng 1.1: Các biến được sử dụng và tỷ lệ người có trả lời.</w:t>
       </w:r>
       <w:bookmarkEnd w:id="14"/>
       <w:r>
         <w:fldChar w:fldCharType="begin"/>
       </w:r>
       <w:r>
-        <w:instrText xml:space="preserve"> TC "Bảng 2.1: Các biến được sử dụng và tỷ lệ người có trả lời." \f T \l 1 </w:instrText>
+        <w:instrText xml:space="preserve"> TC "Bảng 1.1: Các biến được sử dụng và tỷ lệ người có trả lời." \f T \l 1 </w:instrText>
       </w:r>
       <w:r>
         <w:fldChar w:fldCharType="end"/>
@@ -5866,9 +5862,9 @@
           <w:numId w:val="0"/>
         </w:numPr>
       </w:pPr>
-      <w:bookmarkStart w:id="15" w:name="_Toc1634008197"/>
-      <w:r>
-        <w:t>2.3. Dữ liệu thiếu</w:t>
+      <w:bookmarkStart w:id="15" w:name="_Toc964318637"/>
+      <w:r>
+        <w:t>1.3. Dữ liệu thiếu</w:t>
       </w:r>
       <w:bookmarkEnd w:id="15"/>
     </w:p>
@@ -5897,9 +5893,9 @@
           <w:numId w:val="0"/>
         </w:numPr>
       </w:pPr>
-      <w:bookmarkStart w:id="16" w:name="_Toc1932709038"/>
-      <w:r>
-        <w:t>2.4. Quy tắc làm sạch dữ liệu</w:t>
+      <w:bookmarkStart w:id="16" w:name="_Toc1054526665"/>
+      <w:r>
+        <w:t>1.4. Quy tắc làm sạch dữ liệu</w:t>
       </w:r>
       <w:bookmarkEnd w:id="16"/>
     </w:p>
@@ -5908,7 +5904,7 @@
         <w:rPr>
           <w:i w:val="0"/>
         </w:rPr>
-        <w:t>Các quy tắc ở Bảng 2.2 được cố định ngay từ đầu để notebook, slide và báo cáo dùng cùng một bộ số liệu. Ngưỡng 30 dòng cho mỗi nước và 200 dòng cho mỗi vai trò là lựa chọn của nhóm nhằm tránh kết luận từ mẫu quá nhỏ; ngưỡng lương 1.000–500.000 USD giữ lại 96,2% số dòng có lương.</w:t>
+        <w:t>Các quy tắc ở Bảng 1.2 được cố định ngay từ đầu để notebook, slide và báo cáo dùng cùng một bộ số liệu. Ngưỡng 30 dòng cho mỗi nước và 200 dòng cho mỗi vai trò là lựa chọn của nhóm nhằm tránh kết luận từ mẫu quá nhỏ; ngưỡng lương 1.000–500.000 USD giữ lại 96,2% số dòng có lương.</w:t>
       </w:r>
     </w:p>
     <w:p>
@@ -5916,16 +5912,16 @@
         <w:pStyle w:val="Caption"/>
         <w:keepNext/>
       </w:pPr>
-      <w:bookmarkStart w:id="17" w:name="_Toc4168080369"/>
-      <w:r>
-        <w:t>Bảng 2.2: Quy tắc làm sạch và số dòng còn lại.</w:t>
+      <w:bookmarkStart w:id="17" w:name="_Toc2063993650"/>
+      <w:r>
+        <w:t>Bảng 1.2: Quy tắc làm sạch và số dòng còn lại.</w:t>
       </w:r>
       <w:bookmarkEnd w:id="17"/>
       <w:r>
         <w:fldChar w:fldCharType="begin"/>
       </w:r>
       <w:r>
-        <w:instrText xml:space="preserve"> TC "Bảng 2.2: Quy tắc làm sạch và số dòng còn lại." \f T \l 1 </w:instrText>
+        <w:instrText xml:space="preserve"> TC "Bảng 1.2: Quy tắc làm sạch và số dòng còn lại." \f T \l 1 </w:instrText>
       </w:r>
       <w:r>
         <w:fldChar w:fldCharType="end"/>
@@ -6526,9 +6522,9 @@
           <w:numId w:val="0"/>
         </w:numPr>
       </w:pPr>
-      <w:bookmarkStart w:id="18" w:name="_Toc1204738964"/>
-      <w:r>
-        <w:t>2.5. Phương pháp</w:t>
+      <w:bookmarkStart w:id="18" w:name="_Toc3835190589"/>
+      <w:r>
+        <w:t>1.5. Phương pháp</w:t>
       </w:r>
       <w:bookmarkEnd w:id="18"/>
     </w:p>
@@ -6647,9 +6643,9 @@
           <w:numId w:val="0"/>
         </w:numPr>
       </w:pPr>
-      <w:bookmarkStart w:id="19" w:name="_Toc433832425"/>
-      <w:r>
-        <w:t>2.6. Hồ sơ người trả lời (Q1)</w:t>
+      <w:bookmarkStart w:id="19" w:name="_Toc3393248530"/>
+      <w:r>
+        <w:t>1.6. Hồ sơ người trả lời (Q1)</w:t>
       </w:r>
       <w:bookmarkEnd w:id="19"/>
     </w:p>
@@ -6672,7 +6668,7 @@
         <w:rPr>
           <w:i w:val="0"/>
         </w:rPr>
-        <w:t>Hình 2.1 là biểu đồ cột (bar chart) so sánh giá trị giữa các nhóm; chiều dài cột tỷ lệ với giá trị nên dễ so sánh và xếp hạng. Biểu đồ không thể hiện xu hướng theo thời gian hay phân bố bên trong mỗi nhóm.</w:t>
+        <w:t>Hình 1.1 là biểu đồ cột (bar chart) so sánh giá trị giữa các nhóm; chiều dài cột tỷ lệ với giá trị nên dễ so sánh và xếp hạng. Biểu đồ không thể hiện xu hướng theo thời gian hay phân bố bên trong mỗi nhóm.</w:t>
       </w:r>
     </w:p>
     <w:p>
@@ -6719,16 +6715,16 @@
       <w:pPr>
         <w:pStyle w:val="Caption"/>
       </w:pPr>
-      <w:bookmarkStart w:id="20" w:name="_Toc533178864"/>
-      <w:r>
-        <w:t>Hình 2.1: 76% người trả lời là lập trình viên chuyên nghiệp.</w:t>
+      <w:bookmarkStart w:id="20" w:name="_Toc4100841805"/>
+      <w:r>
+        <w:t>Hình 1.1: 76% người trả lời là lập trình viên chuyên nghiệp.</w:t>
       </w:r>
       <w:bookmarkEnd w:id="20"/>
       <w:r>
         <w:fldChar w:fldCharType="begin"/>
       </w:r>
       <w:r>
-        <w:instrText xml:space="preserve"> TC "Hình 2.1: 76% người trả lời là lập trình viên chuyên nghiệp." \f F \l 1 </w:instrText>
+        <w:instrText xml:space="preserve"> TC "Hình 1.1: 76% người trả lời là lập trình viên chuyên nghiệp." \f F \l 1 </w:instrText>
       </w:r>
       <w:r>
         <w:fldChar w:fldCharType="end"/>
@@ -6781,7 +6777,7 @@
         <w:rPr>
           <w:i w:val="0"/>
         </w:rPr>
-        <w:t>Hình 2.2 là biểu đồ cột như ở hình trước: chiều dài cột tỷ lệ với giá trị, số ghi ở cuối mỗi cột.</w:t>
+        <w:t>Hình 1.2 là biểu đồ cột như ở hình trước: chiều dài cột tỷ lệ với giá trị, số ghi ở cuối mỗi cột.</w:t>
       </w:r>
     </w:p>
     <w:p>
@@ -6828,16 +6824,16 @@
       <w:pPr>
         <w:pStyle w:val="Caption"/>
       </w:pPr>
-      <w:bookmarkStart w:id="21" w:name="_Toc1842086776"/>
-      <w:r>
-        <w:t>Hình 2.2: Nhóm tuổi 25–34 chiếm 34% người trả lời.</w:t>
+      <w:bookmarkStart w:id="21" w:name="_Toc3591900523"/>
+      <w:r>
+        <w:t>Hình 1.2: Nhóm tuổi 25–34 chiếm 34% người trả lời.</w:t>
       </w:r>
       <w:bookmarkEnd w:id="21"/>
       <w:r>
         <w:fldChar w:fldCharType="begin"/>
       </w:r>
       <w:r>
-        <w:instrText xml:space="preserve"> TC "Hình 2.2: Nhóm tuổi 25–34 chiếm 34% người trả lời." \f F \l 1 </w:instrText>
+        <w:instrText xml:space="preserve"> TC "Hình 1.2: Nhóm tuổi 25–34 chiếm 34% người trả lời." \f F \l 1 </w:instrText>
       </w:r>
       <w:r>
         <w:fldChar w:fldCharType="end"/>
@@ -6890,7 +6886,7 @@
         <w:rPr>
           <w:i w:val="0"/>
         </w:rPr>
-        <w:t>Hình 2.3 là biểu đồ cột như ở hình trước: chiều dài cột tỷ lệ với giá trị, số ghi ở cuối mỗi cột.</w:t>
+        <w:t>Hình 1.3 là biểu đồ cột như ở hình trước: chiều dài cột tỷ lệ với giá trị, số ghi ở cuối mỗi cột.</w:t>
       </w:r>
     </w:p>
     <w:p>
@@ -6937,16 +6933,16 @@
       <w:pPr>
         <w:pStyle w:val="Caption"/>
       </w:pPr>
-      <w:bookmarkStart w:id="22" w:name="_Toc3350291111"/>
-      <w:r>
-        <w:t>Hình 2.3: Mẫu lệch về United States, Germany, India; Việt Nam chỉ có 145 phản hồi.</w:t>
+      <w:bookmarkStart w:id="22" w:name="_Toc4154394612"/>
+      <w:r>
+        <w:t>Hình 1.3: Mẫu lệch về United States, Germany, India; Việt Nam chỉ có 145 phản hồi.</w:t>
       </w:r>
       <w:bookmarkEnd w:id="22"/>
       <w:r>
         <w:fldChar w:fldCharType="begin"/>
       </w:r>
       <w:r>
-        <w:instrText xml:space="preserve"> TC "Hình 2.3: Mẫu lệch về United States, Germany, India; Việt Nam chỉ có 145 phản hồi." \f F \l 1 </w:instrText>
+        <w:instrText xml:space="preserve"> TC "Hình 1.3: Mẫu lệch về United States, Germany, India; Việt Nam chỉ có 145 phản hồi." \f F \l 1 </w:instrText>
       </w:r>
       <w:r>
         <w:fldChar w:fldCharType="end"/>
@@ -7005,9 +7001,9 @@
           <w:numId w:val="0"/>
         </w:numPr>
       </w:pPr>
-      <w:bookmarkStart w:id="23" w:name="_Toc3846948962"/>
-      <w:r>
-        <w:t>CHƯƠNG 3. XU HƯỚNG CÔNG NGHỆ</w:t>
+      <w:bookmarkStart w:id="23" w:name="_Toc2345128739"/>
+      <w:r>
+        <w:t>CHƯƠNG 2. XU HƯỚNG CÔNG NGHỆ</w:t>
       </w:r>
       <w:bookmarkEnd w:id="23"/>
     </w:p>
@@ -7036,9 +7032,9 @@
           <w:numId w:val="0"/>
         </w:numPr>
       </w:pPr>
-      <w:bookmarkStart w:id="24" w:name="_Toc3326192056"/>
-      <w:r>
-        <w:t>3.1. Công nghệ nào đang được dùng nhiều nhất (Q2)</w:t>
+      <w:bookmarkStart w:id="24" w:name="_Toc2532492132"/>
+      <w:r>
+        <w:t>2.1. Công nghệ nào đang được dùng nhiều nhất (Q2)</w:t>
       </w:r>
       <w:bookmarkEnd w:id="24"/>
     </w:p>
@@ -7053,7 +7049,7 @@
         <w:rPr>
           <w:i w:val="0"/>
         </w:rPr>
-        <w:t>Hình 3.1 là biểu đồ cột như ở hình trước: chiều dài cột tỷ lệ với giá trị, số ghi ở cuối mỗi cột.</w:t>
+        <w:t>Hình 2.1 là biểu đồ cột như ở hình trước: chiều dài cột tỷ lệ với giá trị, số ghi ở cuối mỗi cột.</w:t>
       </w:r>
     </w:p>
     <w:p>
@@ -7100,16 +7096,16 @@
       <w:pPr>
         <w:pStyle w:val="Caption"/>
       </w:pPr>
-      <w:bookmarkStart w:id="25" w:name="_Toc646432681"/>
-      <w:r>
-        <w:t>Hình 3.1: JavaScript, HTML/CSS và SQL là ba ngôn ngữ được dùng nhiều nhất.</w:t>
+      <w:bookmarkStart w:id="25" w:name="_Toc553128791"/>
+      <w:r>
+        <w:t>Hình 2.1: JavaScript, HTML/CSS và SQL là ba ngôn ngữ được dùng nhiều nhất.</w:t>
       </w:r>
       <w:bookmarkEnd w:id="25"/>
       <w:r>
         <w:fldChar w:fldCharType="begin"/>
       </w:r>
       <w:r>
-        <w:instrText xml:space="preserve"> TC "Hình 3.1: JavaScript, HTML/CSS và SQL là ba ngôn ngữ được dùng nhiều nhất." \f F \l 1 </w:instrText>
+        <w:instrText xml:space="preserve"> TC "Hình 2.1: JavaScript, HTML/CSS và SQL là ba ngôn ngữ được dùng nhiều nhất." \f F \l 1 </w:instrText>
       </w:r>
       <w:r>
         <w:fldChar w:fldCharType="end"/>
@@ -7170,7 +7166,7 @@
         <w:rPr>
           <w:i w:val="0"/>
         </w:rPr>
-        <w:t>Hình 3.2 là treemap biểu diễn quan hệ phần và tổng thể trong cấu trúc phân cấp (nhóm công nghệ rồi tới từng công nghệ); diện tích mỗi ô tỷ lệ với số người dùng, màu phân biệt nhóm. Treemap không phù hợp để đọc số chính xác, vì vậy số người dùng được ghi ngay trong ô.</w:t>
+        <w:t>Hình 2.2 là treemap biểu diễn quan hệ phần và tổng thể trong cấu trúc phân cấp (nhóm công nghệ rồi tới từng công nghệ); diện tích mỗi ô tỷ lệ với số người dùng, màu phân biệt nhóm. Treemap không phù hợp để đọc số chính xác, vì vậy số người dùng được ghi ngay trong ô.</w:t>
       </w:r>
     </w:p>
     <w:p>
@@ -7217,16 +7213,16 @@
       <w:pPr>
         <w:pStyle w:val="Caption"/>
       </w:pPr>
-      <w:bookmarkStart w:id="26" w:name="_Toc2880975574"/>
-      <w:r>
-        <w:t>Hình 3.2: JavaScript, PostgreSQL, Docker và Node.js dẫn đầu từng nhóm công nghệ.</w:t>
+      <w:bookmarkStart w:id="26" w:name="_Toc105189026"/>
+      <w:r>
+        <w:t>Hình 2.2: JavaScript, PostgreSQL, Docker và Node.js dẫn đầu từng nhóm công nghệ.</w:t>
       </w:r>
       <w:bookmarkEnd w:id="26"/>
       <w:r>
         <w:fldChar w:fldCharType="begin"/>
       </w:r>
       <w:r>
-        <w:instrText xml:space="preserve"> TC "Hình 3.2: JavaScript, PostgreSQL, Docker và Node.js dẫn đầu từng nhóm công nghệ." \f F \l 1 </w:instrText>
+        <w:instrText xml:space="preserve"> TC "Hình 2.2: JavaScript, PostgreSQL, Docker và Node.js dẫn đầu từng nhóm công nghệ." \f F \l 1 </w:instrText>
       </w:r>
       <w:r>
         <w:fldChar w:fldCharType="end"/>
@@ -7287,7 +7283,7 @@
         <w:rPr>
           <w:i w:val="0"/>
         </w:rPr>
-        <w:t>Hình 3.3 là các biểu đồ cột nhỏ lặp lại (small multiples) đặt cạnh nhau cùng một thang để so sánh nhiều nhóm mà không làm một biểu đồ quá tải. Mỗi ô con là một nhóm công nghệ với cùng cách đọc như biểu đồ cột.</w:t>
+        <w:t>Hình 2.3 là các biểu đồ cột nhỏ lặp lại (small multiples) đặt cạnh nhau cùng một thang để so sánh nhiều nhóm mà không làm một biểu đồ quá tải. Mỗi ô con là một nhóm công nghệ với cùng cách đọc như biểu đồ cột.</w:t>
       </w:r>
     </w:p>
     <w:p>
@@ -7334,16 +7330,16 @@
       <w:pPr>
         <w:pStyle w:val="Caption"/>
       </w:pPr>
-      <w:bookmarkStart w:id="27" w:name="_Toc291862305"/>
-      <w:r>
-        <w:t>Hình 3.3: PostgreSQL, Docker và Node.js dẫn đầu CSDL, cloud và web framework.</w:t>
+      <w:bookmarkStart w:id="27" w:name="_Toc1520173168"/>
+      <w:r>
+        <w:t>Hình 2.3: PostgreSQL, Docker và Node.js dẫn đầu CSDL, cloud và web framework.</w:t>
       </w:r>
       <w:bookmarkEnd w:id="27"/>
       <w:r>
         <w:fldChar w:fldCharType="begin"/>
       </w:r>
       <w:r>
-        <w:instrText xml:space="preserve"> TC "Hình 3.3: PostgreSQL, Docker và Node.js dẫn đầu CSDL, cloud và web framework." \f F \l 1 </w:instrText>
+        <w:instrText xml:space="preserve"> TC "Hình 2.3: PostgreSQL, Docker và Node.js dẫn đầu CSDL, cloud và web framework." \f F \l 1 </w:instrText>
       </w:r>
       <w:r>
         <w:fldChar w:fldCharType="end"/>
@@ -7402,9 +7398,9 @@
           <w:numId w:val="0"/>
         </w:numPr>
       </w:pPr>
-      <w:bookmarkStart w:id="28" w:name="_Toc2418456719"/>
-      <w:r>
-        <w:t>3.2. Dùng nhiều có được ngưỡng mộ và muốn dùng nhiều không (Q3)</w:t>
+      <w:bookmarkStart w:id="28" w:name="_Toc2522442865"/>
+      <w:r>
+        <w:t>2.2. Dùng nhiều có được ngưỡng mộ và muốn dùng nhiều không (Q3)</w:t>
       </w:r>
       <w:bookmarkEnd w:id="28"/>
     </w:p>
@@ -7419,7 +7415,7 @@
         <w:rPr>
           <w:i w:val="0"/>
         </w:rPr>
-        <w:t>Hình 3.4 là biểu đồ phân tán (scatter plot) cho thấy quan hệ giữa hai biến số; mỗi điểm là một ngôn ngữ lập trình. Hai đường nét đứt là median của từng trục, chia mặt phẳng thành bốn góc phần tư để nhận ra nhóm phổ biến và nhóm được ngưỡng mộ.</w:t>
+        <w:t>Hình 2.4 là biểu đồ phân tán (scatter plot) cho thấy quan hệ giữa hai biến số; mỗi điểm là một ngôn ngữ lập trình. Hai đường nét đứt là median của từng trục, chia mặt phẳng thành bốn góc phần tư để nhận ra nhóm phổ biến và nhóm được ngưỡng mộ.</w:t>
       </w:r>
     </w:p>
     <w:p>
@@ -7466,16 +7462,16 @@
       <w:pPr>
         <w:pStyle w:val="Caption"/>
       </w:pPr>
-      <w:bookmarkStart w:id="29" w:name="_Toc1502257151"/>
-      <w:r>
-        <w:t>Hình 3.4: JavaScript dùng nhiều nhất nhưng chỉ 64% ngưỡng mộ; Rust đạt 85%.</w:t>
+      <w:bookmarkStart w:id="29" w:name="_Toc3275664789"/>
+      <w:r>
+        <w:t>Hình 2.4: JavaScript dùng nhiều nhất nhưng chỉ 64% ngưỡng mộ; Rust đạt 85%.</w:t>
       </w:r>
       <w:bookmarkEnd w:id="29"/>
       <w:r>
         <w:fldChar w:fldCharType="begin"/>
       </w:r>
       <w:r>
-        <w:instrText xml:space="preserve"> TC "Hình 3.4: JavaScript dùng nhiều nhất nhưng chỉ 64% ngưỡng mộ; Rust đạt 85%." \f F \l 1 </w:instrText>
+        <w:instrText xml:space="preserve"> TC "Hình 2.4: JavaScript dùng nhiều nhất nhưng chỉ 64% ngưỡng mộ; Rust đạt 85%." \f F \l 1 </w:instrText>
       </w:r>
       <w:r>
         <w:fldChar w:fldCharType="end"/>
@@ -7536,7 +7532,7 @@
         <w:rPr>
           <w:i w:val="0"/>
         </w:rPr>
-        <w:t>Hình 3.5 là biểu đồ cột phân kỳ đặt giá trị 0 ở giữa: cột sang phải (xanh) là mức muốn dùng cao hơn mức đang dùng, cột sang trái (cam) là thấp hơn. Chiều dài cột thể hiện độ lớn chênh lệch tính bằng điểm phần trăm.</w:t>
+        <w:t>Hình 2.5 là biểu đồ cột phân kỳ đặt giá trị 0 ở giữa: cột sang phải (xanh) là mức muốn dùng cao hơn mức đang dùng, cột sang trái (cam) là thấp hơn. Chiều dài cột thể hiện độ lớn chênh lệch tính bằng điểm phần trăm.</w:t>
       </w:r>
     </w:p>
     <w:p>
@@ -7583,16 +7579,16 @@
       <w:pPr>
         <w:pStyle w:val="Caption"/>
       </w:pPr>
-      <w:bookmarkStart w:id="30" w:name="_Toc2100187553"/>
-      <w:r>
-        <w:t>Hình 3.5: Rust được muốn dùng vượt mức đang dùng 19,3 điểm %, JavaScript thấp hơn 27,2 điểm %.</w:t>
+      <w:bookmarkStart w:id="30" w:name="_Toc1289118110"/>
+      <w:r>
+        <w:t>Hình 2.5: Rust được muốn dùng vượt mức đang dùng 19,3 điểm %, JavaScript thấp hơn 27,2 điểm %.</w:t>
       </w:r>
       <w:bookmarkEnd w:id="30"/>
       <w:r>
         <w:fldChar w:fldCharType="begin"/>
       </w:r>
       <w:r>
-        <w:instrText xml:space="preserve"> TC "Hình 3.5: Rust được muốn dùng vượt mức đang dùng 19,3 điểm %, JavaScript thấp hơn 27,2 điểm %." \f F \l 1 </w:instrText>
+        <w:instrText xml:space="preserve"> TC "Hình 2.5: Rust được muốn dùng vượt mức đang dùng 19,3 điểm %, JavaScript thấp hơn 27,2 điểm %." \f F \l 1 </w:instrText>
       </w:r>
       <w:r>
         <w:fldChar w:fldCharType="end"/>
@@ -7647,16 +7643,16 @@
         <w:pStyle w:val="Caption"/>
         <w:keepNext/>
       </w:pPr>
-      <w:bookmarkStart w:id="31" w:name="_Toc1381531766"/>
-      <w:r>
-        <w:t>Bảng 3.1: 12 ngôn ngữ phổ biến nhất: đang dùng, muốn dùng, ngưỡng mộ và chênh lệch (điểm %).</w:t>
+      <w:bookmarkStart w:id="31" w:name="_Toc3826210171"/>
+      <w:r>
+        <w:t>Bảng 2.1: 12 ngôn ngữ phổ biến nhất: đang dùng, muốn dùng, ngưỡng mộ và chênh lệch (điểm %).</w:t>
       </w:r>
       <w:bookmarkEnd w:id="31"/>
       <w:r>
         <w:fldChar w:fldCharType="begin"/>
       </w:r>
       <w:r>
-        <w:instrText xml:space="preserve"> TC "Bảng 3.1: 12 ngôn ngữ phổ biến nhất: đang dùng, muốn dùng, ngưỡng mộ và chênh lệch (điểm %)." \f T \l 1 </w:instrText>
+        <w:instrText xml:space="preserve"> TC "Bảng 2.1: 12 ngôn ngữ phổ biến nhất: đang dùng, muốn dùng, ngưỡng mộ và chênh lệch (điểm %)." \f T \l 1 </w:instrText>
       </w:r>
       <w:r>
         <w:fldChar w:fldCharType="end"/>
@@ -8883,7 +8879,7 @@
         <w:rPr>
           <w:i w:val="0"/>
         </w:rPr>
-        <w:t>Bảng 3.1 (cột Muốn − dùng tính từ số chưa làm tròn nên có thể lệch 0,1 so với hiệu hai cột bên cạnh) cho thấy ba mức đo không đồng nhất: ngôn ngữ phổ biến nhất không phải là ngôn ngữ được ngưỡng mộ nhất, và ngôn ngữ được muốn dùng thêm nhiều nhất (Rust, Go, Zig) có mức dùng hiện tại thấp (xem Bảng PL.1 ở phụ lục). Với người mới học, điều này gợi ý một lộ trình hai bước: nắm vững nhóm ngôn ngữ phổ biến, rồi chọn thêm một ngôn ngữ đang được muốn dùng nhiều để mở rộng.</w:t>
+        <w:t>Bảng 2.1 (cột Muốn − dùng tính từ số chưa làm tròn nên có thể lệch 0,1 so với hiệu hai cột bên cạnh) cho thấy ba mức đo không đồng nhất: ngôn ngữ phổ biến nhất không phải là ngôn ngữ được ngưỡng mộ nhất, và ngôn ngữ được muốn dùng thêm nhiều nhất (Rust, Go, Zig) có mức dùng hiện tại thấp (xem Bảng PL.1 ở phụ lục). Với người mới học, điều này gợi ý một lộ trình hai bước: nắm vững nhóm ngôn ngữ phổ biến, rồi chọn thêm một ngôn ngữ đang được muốn dùng nhiều để mở rộng.</w:t>
       </w:r>
     </w:p>
     <w:p>
@@ -8895,9 +8891,9 @@
           <w:numId w:val="0"/>
         </w:numPr>
       </w:pPr>
-      <w:bookmarkStart w:id="32" w:name="_Toc3827661762"/>
-      <w:r>
-        <w:t>3.3. Các ngôn ngữ đi cùng nhau thế nào (Q4)</w:t>
+      <w:bookmarkStart w:id="32" w:name="_Toc2380892111"/>
+      <w:r>
+        <w:t>2.3. Các ngôn ngữ đi cùng nhau thế nào (Q4)</w:t>
       </w:r>
       <w:bookmarkEnd w:id="32"/>
     </w:p>
@@ -8912,7 +8908,7 @@
         <w:rPr>
           <w:i w:val="0"/>
         </w:rPr>
-        <w:t>Hình 3.6 là biểu đồ mạng (node-link) gồm các nút là ngôn ngữ và các cạnh là cặp ngôn ngữ thường được dùng chung. Kích thước nút tỷ lệ với số người dùng, độ dày cạnh tỷ lệ với chỉ số lift, màu là cụm cộng đồng do thuật toán phát hiện. Vị trí nút chỉ phục vụ quan sát, không có ý nghĩa đo lường.</w:t>
+        <w:t>Hình 2.6 là biểu đồ mạng (node-link) gồm các nút là ngôn ngữ và các cạnh là cặp ngôn ngữ thường được dùng chung. Kích thước nút tỷ lệ với số người dùng, độ dày cạnh tỷ lệ với chỉ số lift, màu là cụm cộng đồng do thuật toán phát hiện. Vị trí nút chỉ phục vụ quan sát, không có ý nghĩa đo lường.</w:t>
       </w:r>
     </w:p>
     <w:p>
@@ -8959,16 +8955,16 @@
       <w:pPr>
         <w:pStyle w:val="Caption"/>
       </w:pPr>
-      <w:bookmarkStart w:id="33" w:name="_Toc2372507050"/>
-      <w:r>
-        <w:t>Hình 3.6: Có 5 cụm ngôn ngữ hay được dùng chung.</w:t>
+      <w:bookmarkStart w:id="33" w:name="_Toc2362194972"/>
+      <w:r>
+        <w:t>Hình 2.6: Có 5 cụm ngôn ngữ hay được dùng chung.</w:t>
       </w:r>
       <w:bookmarkEnd w:id="33"/>
       <w:r>
         <w:fldChar w:fldCharType="begin"/>
       </w:r>
       <w:r>
-        <w:instrText xml:space="preserve"> TC "Hình 3.6: Có 5 cụm ngôn ngữ hay được dùng chung." \f F \l 1 </w:instrText>
+        <w:instrText xml:space="preserve"> TC "Hình 2.6: Có 5 cụm ngôn ngữ hay được dùng chung." \f F \l 1 </w:instrText>
       </w:r>
       <w:r>
         <w:fldChar w:fldCharType="end"/>
@@ -9029,7 +9025,7 @@
         <w:rPr>
           <w:i w:val="0"/>
         </w:rPr>
-        <w:t>Hình 3.7 là biểu đồ Sankey thể hiện luồng giữa hai tập nút: bên trái là ngôn ngữ người trả lời đang dùng, bên phải là ngôn ngữ họ muốn dùng; độ dày dải tỷ lệ với số người. Biểu đồ không dùng để đọc số chính xác nên các tỷ lệ cụ thể được nêu trong phần nhận xét.</w:t>
+        <w:t>Hình 2.7 là biểu đồ Sankey thể hiện luồng giữa hai tập nút: bên trái là ngôn ngữ người trả lời đang dùng, bên phải là ngôn ngữ họ muốn dùng; độ dày dải tỷ lệ với số người. Biểu đồ không dùng để đọc số chính xác nên các tỷ lệ cụ thể được nêu trong phần nhận xét.</w:t>
       </w:r>
     </w:p>
     <w:p>
@@ -9076,16 +9072,16 @@
       <w:pPr>
         <w:pStyle w:val="Caption"/>
       </w:pPr>
-      <w:bookmarkStart w:id="34" w:name="_Toc2136881815"/>
-      <w:r>
-        <w:t>Hình 3.7: Người dùng JavaScript thường muốn dùng thêm HTML/CSS (52%).</w:t>
+      <w:bookmarkStart w:id="34" w:name="_Toc2197880074"/>
+      <w:r>
+        <w:t>Hình 2.7: Người dùng JavaScript thường muốn dùng thêm HTML/CSS (52%).</w:t>
       </w:r>
       <w:bookmarkEnd w:id="34"/>
       <w:r>
         <w:fldChar w:fldCharType="begin"/>
       </w:r>
       <w:r>
-        <w:instrText xml:space="preserve"> TC "Hình 3.7: Người dùng JavaScript thường muốn dùng thêm HTML/CSS (52%)." \f F \l 1 </w:instrText>
+        <w:instrText xml:space="preserve"> TC "Hình 2.7: Người dùng JavaScript thường muốn dùng thêm HTML/CSS (52%)." \f F \l 1 </w:instrText>
       </w:r>
       <w:r>
         <w:fldChar w:fldCharType="end"/>
@@ -9144,9 +9140,9 @@
           <w:numId w:val="0"/>
         </w:numPr>
       </w:pPr>
-      <w:bookmarkStart w:id="35" w:name="_Toc68325474"/>
-      <w:r>
-        <w:t>3.4. Tóm tắt chương</w:t>
+      <w:bookmarkStart w:id="35" w:name="_Toc2235036997"/>
+      <w:r>
+        <w:t>2.4. Tóm tắt chương</w:t>
       </w:r>
       <w:bookmarkEnd w:id="35"/>
     </w:p>
@@ -9175,9 +9171,9 @@
           <w:numId w:val="0"/>
         </w:numPr>
       </w:pPr>
-      <w:bookmarkStart w:id="36" w:name="_Toc1088599849"/>
-      <w:r>
-        <w:t>CHƯƠNG 4. MỨC LƯƠNG</w:t>
+      <w:bookmarkStart w:id="36" w:name="_Toc3172683612"/>
+      <w:r>
+        <w:t>CHƯƠNG 3. MỨC LƯƠNG</w:t>
       </w:r>
       <w:bookmarkEnd w:id="36"/>
     </w:p>
@@ -9206,9 +9202,9 @@
           <w:numId w:val="0"/>
         </w:numPr>
       </w:pPr>
-      <w:bookmarkStart w:id="37" w:name="_Toc3002508662"/>
-      <w:r>
-        <w:t>4.1. Phân phối lương theo vai trò và kinh nghiệm (Q5)</w:t>
+      <w:bookmarkStart w:id="37" w:name="_Toc106367140"/>
+      <w:r>
+        <w:t>3.1. Phân phối lương theo vai trò và kinh nghiệm (Q5)</w:t>
       </w:r>
       <w:bookmarkEnd w:id="37"/>
     </w:p>
@@ -9223,7 +9219,7 @@
         <w:rPr>
           <w:i w:val="0"/>
         </w:rPr>
-        <w:t>Hình 4.1 là histogram cho thấy phân bố của một biến số; trục ngang chia thành các khoảng, chiều cao cột là số người trong khoảng đó. Trục ngang dùng thang log vì lương trải rộng trên nhiều bậc độ lớn; hai vạch đứng đánh dấu median và mean.</w:t>
+        <w:t>Hình 3.1 là histogram cho thấy phân bố của một biến số; trục ngang chia thành các khoảng, chiều cao cột là số người trong khoảng đó. Trục ngang dùng thang log vì lương trải rộng trên nhiều bậc độ lớn; hai vạch đứng đánh dấu median và mean.</w:t>
       </w:r>
     </w:p>
     <w:p>
@@ -9270,16 +9266,16 @@
       <w:pPr>
         <w:pStyle w:val="Caption"/>
       </w:pPr>
-      <w:bookmarkStart w:id="38" w:name="_Toc1674276452"/>
-      <w:r>
-        <w:t>Hình 4.1: Median lương 79.578 USD thấp hơn mean 92.934 USD: phân phối lệch phải.</w:t>
+      <w:bookmarkStart w:id="38" w:name="_Toc2497370026"/>
+      <w:r>
+        <w:t>Hình 3.1: Median lương 79.578 USD thấp hơn mean 92.934 USD: phân phối lệch phải.</w:t>
       </w:r>
       <w:bookmarkEnd w:id="38"/>
       <w:r>
         <w:fldChar w:fldCharType="begin"/>
       </w:r>
       <w:r>
-        <w:instrText xml:space="preserve"> TC "Hình 4.1: Median lương 79.578 USD thấp hơn mean 92.934 USD: phân phối lệch phải." \f F \l 1 </w:instrText>
+        <w:instrText xml:space="preserve"> TC "Hình 3.1: Median lương 79.578 USD thấp hơn mean 92.934 USD: phân phối lệch phải." \f F \l 1 </w:instrText>
       </w:r>
       <w:r>
         <w:fldChar w:fldCharType="end"/>
@@ -9340,7 +9336,7 @@
         <w:rPr>
           <w:i w:val="0"/>
         </w:rPr>
-        <w:t>Hình 4.2 là biểu đồ ridgeline xếp chồng nhẹ các đường mật độ (KDE) của nhiều nhóm trên cùng một trục để so sánh hình dạng phân bố: vị trí đỉnh cho biết mức lương điển hình, độ rộng cho biết mức phân tán. Vạch cam là median của từng vai trò.</w:t>
+        <w:t>Hình 3.2 là biểu đồ ridgeline xếp chồng nhẹ các đường mật độ (KDE) của nhiều nhóm trên cùng một trục để so sánh hình dạng phân bố: vị trí đỉnh cho biết mức lương điển hình, độ rộng cho biết mức phân tán. Vạch cam là median của từng vai trò.</w:t>
       </w:r>
     </w:p>
     <w:p>
@@ -9387,16 +9383,16 @@
       <w:pPr>
         <w:pStyle w:val="Caption"/>
       </w:pPr>
-      <w:bookmarkStart w:id="39" w:name="_Toc3463762891"/>
-      <w:r>
-        <w:t>Hình 4.2: Engineering manager có median lương cao nhất (133.417 USD), gấp 2,0 lần Front-end.</w:t>
+      <w:bookmarkStart w:id="39" w:name="_Toc3203823686"/>
+      <w:r>
+        <w:t>Hình 3.2: Engineering manager có median lương cao nhất (133.417 USD), gấp 2,0 lần Front-end.</w:t>
       </w:r>
       <w:bookmarkEnd w:id="39"/>
       <w:r>
         <w:fldChar w:fldCharType="begin"/>
       </w:r>
       <w:r>
-        <w:instrText xml:space="preserve"> TC "Hình 4.2: Engineering manager có median lương cao nhất (133.417 USD), gấp 2,0 lần Front-end." \f F \l 1 </w:instrText>
+        <w:instrText xml:space="preserve"> TC "Hình 3.2: Engineering manager có median lương cao nhất (133.417 USD), gấp 2,0 lần Front-end." \f F \l 1 </w:instrText>
       </w:r>
       <w:r>
         <w:fldChar w:fldCharType="end"/>
@@ -9429,7 +9425,7 @@
         <w:rPr>
           <w:i w:val="0"/>
         </w:rPr>
-        <w:t>Chi tiết median và cỡ mẫu từng vai trò ở Bảng 4.1.</w:t>
+        <w:t>Chi tiết median và cỡ mẫu từng vai trò ở Bảng 3.1.</w:t>
       </w:r>
     </w:p>
     <w:p>
@@ -9451,16 +9447,16 @@
         <w:pStyle w:val="Caption"/>
         <w:keepNext/>
       </w:pPr>
-      <w:bookmarkStart w:id="40" w:name="_Toc2005663919"/>
-      <w:r>
-        <w:t>Bảng 4.1: Median lương và cỡ mẫu theo vai trò.</w:t>
+      <w:bookmarkStart w:id="40" w:name="_Toc1843839316"/>
+      <w:r>
+        <w:t>Bảng 3.1: Median lương và cỡ mẫu theo vai trò.</w:t>
       </w:r>
       <w:bookmarkEnd w:id="40"/>
       <w:r>
         <w:fldChar w:fldCharType="begin"/>
       </w:r>
       <w:r>
-        <w:instrText xml:space="preserve"> TC "Bảng 4.1: Median lương và cỡ mẫu theo vai trò." \f T \l 1 </w:instrText>
+        <w:instrText xml:space="preserve"> TC "Bảng 3.1: Median lương và cỡ mẫu theo vai trò." \f T \l 1 </w:instrText>
       </w:r>
       <w:r>
         <w:fldChar w:fldCharType="end"/>
@@ -10223,7 +10219,7 @@
         <w:rPr>
           <w:i w:val="0"/>
         </w:rPr>
-        <w:t>Hình 4.3 là biểu đồ đường nối median lương theo từng nhóm kinh nghiệm theo thứ tự tăng dần; vùng tô nhạt là khoảng tin cậy 95% bằng bootstrap, số dưới mỗi điểm là cỡ mẫu.</w:t>
+        <w:t>Hình 3.3 là biểu đồ đường nối median lương theo từng nhóm kinh nghiệm theo thứ tự tăng dần; vùng tô nhạt là khoảng tin cậy 95% bằng bootstrap, số dưới mỗi điểm là cỡ mẫu.</w:t>
       </w:r>
     </w:p>
     <w:p>
@@ -10270,16 +10266,16 @@
       <w:pPr>
         <w:pStyle w:val="Caption"/>
       </w:pPr>
-      <w:bookmarkStart w:id="41" w:name="_Toc3735082485"/>
-      <w:r>
-        <w:t>Hình 4.3: Median lương tăng từ 28.083 USD (0–2 năm) lên 111.515 USD (21+ năm).</w:t>
+      <w:bookmarkStart w:id="41" w:name="_Toc3454008079"/>
+      <w:r>
+        <w:t>Hình 3.3: Median lương tăng từ 28.083 USD (0–2 năm) lên 111.515 USD (21+ năm).</w:t>
       </w:r>
       <w:bookmarkEnd w:id="41"/>
       <w:r>
         <w:fldChar w:fldCharType="begin"/>
       </w:r>
       <w:r>
-        <w:instrText xml:space="preserve"> TC "Hình 4.3: Median lương tăng từ 28.083 USD (0–2 năm) lên 111.515 USD (21+ năm)." \f F \l 1 </w:instrText>
+        <w:instrText xml:space="preserve"> TC "Hình 3.3: Median lương tăng từ 28.083 USD (0–2 năm) lên 111.515 USD (21+ năm)." \f F \l 1 </w:instrText>
       </w:r>
       <w:r>
         <w:fldChar w:fldCharType="end"/>
@@ -10304,7 +10300,7 @@
         <w:rPr>
           <w:i w:val="0"/>
         </w:rPr>
-        <w:t>Bảng 4.2 cho thấy median lương tăng qua cả năm nhóm kinh nghiệm: 0–2 năm 28.083 USD, 3–5 năm 46.406 USD, 6–10 năm 75.268 USD, 11–20 năm 95.299 USD, 21+ năm 111.515 USD.</w:t>
+        <w:t>Bảng 3.2 cho thấy median lương tăng qua cả năm nhóm kinh nghiệm: 0–2 năm 28.083 USD, 3–5 năm 46.406 USD, 6–10 năm 75.268 USD, 11–20 năm 95.299 USD, 21+ năm 111.515 USD.</w:t>
       </w:r>
     </w:p>
     <w:p>
@@ -10334,16 +10330,16 @@
         <w:pStyle w:val="Caption"/>
         <w:keepNext/>
       </w:pPr>
-      <w:bookmarkStart w:id="42" w:name="_Toc4029109411"/>
-      <w:r>
-        <w:t>Bảng 4.2: Median lương theo nhóm năm kinh nghiệm (WorkExp).</w:t>
+      <w:bookmarkStart w:id="42" w:name="_Toc3918460877"/>
+      <w:r>
+        <w:t>Bảng 3.2: Median lương theo nhóm năm kinh nghiệm (WorkExp).</w:t>
       </w:r>
       <w:bookmarkEnd w:id="42"/>
       <w:r>
         <w:fldChar w:fldCharType="begin"/>
       </w:r>
       <w:r>
-        <w:instrText xml:space="preserve"> TC "Bảng 4.2: Median lương theo nhóm năm kinh nghiệm (WorkExp)." \f T \l 1 </w:instrText>
+        <w:instrText xml:space="preserve"> TC "Bảng 3.2: Median lương theo nhóm năm kinh nghiệm (WorkExp)." \f T \l 1 </w:instrText>
       </w:r>
       <w:r>
         <w:fldChar w:fldCharType="end"/>
@@ -10821,9 +10817,9 @@
           <w:numId w:val="0"/>
         </w:numPr>
       </w:pPr>
-      <w:bookmarkStart w:id="43" w:name="_Toc2168904604"/>
-      <w:r>
-        <w:t>4.2. Công nghệ nào đi cùng mức lương cao (Q6)</w:t>
+      <w:bookmarkStart w:id="43" w:name="_Toc1867301612"/>
+      <w:r>
+        <w:t>3.2. Công nghệ nào đi cùng mức lương cao (Q6)</w:t>
       </w:r>
       <w:bookmarkEnd w:id="43"/>
     </w:p>
@@ -10838,7 +10834,7 @@
         <w:rPr>
           <w:i w:val="0"/>
         </w:rPr>
-        <w:t>Hình 4.4 là biểu đồ cột ngang kèm thanh sai số: chiều dài cột là median lương, thanh sai số là khoảng tin cậy bootstrap 95%. Khi hai thanh sai số chồng lấn thì chênh lệch giữa hai nhóm kém chắc chắn.</w:t>
+        <w:t>Hình 3.4 là biểu đồ cột ngang kèm thanh sai số: chiều dài cột là median lương, thanh sai số là khoảng tin cậy bootstrap 95%. Khi hai thanh sai số chồng lấn thì chênh lệch giữa hai nhóm kém chắc chắn.</w:t>
       </w:r>
     </w:p>
     <w:p>
@@ -10885,16 +10881,16 @@
       <w:pPr>
         <w:pStyle w:val="Caption"/>
       </w:pPr>
-      <w:bookmarkStart w:id="44" w:name="_Toc935326842"/>
-      <w:r>
-        <w:t>Hình 4.4: Giữa 15 ngôn ngữ phổ biến, median lương chênh 49%: từ PHP đến Go.</w:t>
+      <w:bookmarkStart w:id="44" w:name="_Toc3232648628"/>
+      <w:r>
+        <w:t>Hình 3.4: Giữa 15 ngôn ngữ phổ biến, median lương chênh 49%: từ PHP đến Go.</w:t>
       </w:r>
       <w:bookmarkEnd w:id="44"/>
       <w:r>
         <w:fldChar w:fldCharType="begin"/>
       </w:r>
       <w:r>
-        <w:instrText xml:space="preserve"> TC "Hình 4.4: Giữa 15 ngôn ngữ phổ biến, median lương chênh 49%: từ PHP đến Go." \f F \l 1 </w:instrText>
+        <w:instrText xml:space="preserve"> TC "Hình 3.4: Giữa 15 ngôn ngữ phổ biến, median lương chênh 49%: từ PHP đến Go." \f F \l 1 </w:instrText>
       </w:r>
       <w:r>
         <w:fldChar w:fldCharType="end"/>
@@ -10955,7 +10951,7 @@
         <w:rPr>
           <w:i w:val="0"/>
         </w:rPr>
-        <w:t>Hình 4.5 là heatmap biểu diễn ma trận hai chiều (ngôn ngữ × vai trò) bằng màu: ô càng đậm thì median lương càng cao, số trong ô là median tính bằng nghìn USD. Ô thiếu dữ liệu (ít hơn 30 người) được để trống thay vì tô màu.</w:t>
+        <w:t>Hình 3.5 là heatmap biểu diễn ma trận hai chiều (ngôn ngữ × vai trò) bằng màu: ô càng đậm thì median lương càng cao, số trong ô là median tính bằng nghìn USD. Ô thiếu dữ liệu (ít hơn 30 người) được để trống thay vì tô màu.</w:t>
       </w:r>
     </w:p>
     <w:p>
@@ -11002,16 +10998,16 @@
       <w:pPr>
         <w:pStyle w:val="Caption"/>
       </w:pPr>
-      <w:bookmarkStart w:id="45" w:name="_Toc2984389420"/>
-      <w:r>
-        <w:t>Hình 4.5: Architect có median lương cao nhất ở 10/10 ngôn ngữ được so sánh.</w:t>
+      <w:bookmarkStart w:id="45" w:name="_Toc2204581035"/>
+      <w:r>
+        <w:t>Hình 3.5: Architect có median lương cao nhất ở 10/10 ngôn ngữ được so sánh.</w:t>
       </w:r>
       <w:bookmarkEnd w:id="45"/>
       <w:r>
         <w:fldChar w:fldCharType="begin"/>
       </w:r>
       <w:r>
-        <w:instrText xml:space="preserve"> TC "Hình 4.5: Architect có median lương cao nhất ở 10/10 ngôn ngữ được so sánh." \f F \l 1 </w:instrText>
+        <w:instrText xml:space="preserve"> TC "Hình 3.5: Architect có median lương cao nhất ở 10/10 ngôn ngữ được so sánh." \f F \l 1 </w:instrText>
       </w:r>
       <w:r>
         <w:fldChar w:fldCharType="end"/>
@@ -11072,7 +11068,7 @@
         <w:rPr>
           <w:i w:val="0"/>
         </w:rPr>
-        <w:t>Hình 4.6 là biểu đồ cột so sánh R² của các mô hình hồi quy: R² là phần trăm biến thiên của log(lương) được mô hình giải thích. Mô hình càng nhiều biến thì R² càng không giảm, nên điều cần xem là phần R² tăng thêm khi bổ sung từng nhóm biến.</w:t>
+        <w:t>Hình 3.6 là biểu đồ cột so sánh R² của các mô hình hồi quy: R² là phần trăm biến thiên của log(lương) được mô hình giải thích. Mô hình càng nhiều biến thì R² càng không giảm, nên điều cần xem là phần R² tăng thêm khi bổ sung từng nhóm biến.</w:t>
       </w:r>
     </w:p>
     <w:p>
@@ -11119,16 +11115,16 @@
       <w:pPr>
         <w:pStyle w:val="Caption"/>
       </w:pPr>
-      <w:bookmarkStart w:id="46" w:name="_Toc1012992342"/>
-      <w:r>
-        <w:t>Hình 4.6: Quốc gia một mình giải thích 45% biến thiên lương; thêm 15 ngôn ngữ chỉ cộng 2,6 điểm phần trăm.</w:t>
+      <w:bookmarkStart w:id="46" w:name="_Toc2812199631"/>
+      <w:r>
+        <w:t>Hình 3.6: Quốc gia một mình giải thích 45% biến thiên lương; thêm 15 ngôn ngữ chỉ cộng 2,6 điểm phần trăm.</w:t>
       </w:r>
       <w:bookmarkEnd w:id="46"/>
       <w:r>
         <w:fldChar w:fldCharType="begin"/>
       </w:r>
       <w:r>
-        <w:instrText xml:space="preserve"> TC "Hình 4.6: Quốc gia một mình giải thích 45% biến thiên lương; thêm 15 ngôn ngữ chỉ cộng 2,6 điểm phần trăm." \f F \l 1 </w:instrText>
+        <w:instrText xml:space="preserve"> TC "Hình 3.6: Quốc gia một mình giải thích 45% biến thiên lương; thêm 15 ngôn ngữ chỉ cộng 2,6 điểm phần trăm." \f F \l 1 </w:instrText>
       </w:r>
       <w:r>
         <w:fldChar w:fldCharType="end"/>
@@ -11153,7 +11149,7 @@
         <w:rPr>
           <w:i w:val="0"/>
         </w:rPr>
-        <w:t>Phần R² tăng thêm khi bổ sung từng nhóm biến được nêu ở Bảng 4.3.</w:t>
+        <w:t>Phần R² tăng thêm khi bổ sung từng nhóm biến được nêu ở Bảng 3.3.</w:t>
       </w:r>
     </w:p>
     <w:p>
@@ -11175,16 +11171,16 @@
         <w:pStyle w:val="Caption"/>
         <w:keepNext/>
       </w:pPr>
-      <w:bookmarkStart w:id="47" w:name="_Toc703461009"/>
-      <w:r>
-        <w:t>Bảng 4.3: R² của các mô hình hồi quy log(lương) và phần tăng thêm.</w:t>
+      <w:bookmarkStart w:id="47" w:name="_Toc885190057"/>
+      <w:r>
+        <w:t>Bảng 3.3: R² của các mô hình hồi quy log(lương) và phần tăng thêm.</w:t>
       </w:r>
       <w:bookmarkEnd w:id="47"/>
       <w:r>
         <w:fldChar w:fldCharType="begin"/>
       </w:r>
       <w:r>
-        <w:instrText xml:space="preserve"> TC "Bảng 4.3: R² của các mô hình hồi quy log(lương) và phần tăng thêm." \f T \l 1 </w:instrText>
+        <w:instrText xml:space="preserve"> TC "Bảng 3.3: R² của các mô hình hồi quy log(lương) và phần tăng thêm." \f T \l 1 </w:instrText>
       </w:r>
       <w:r>
         <w:fldChar w:fldCharType="end"/>
@@ -11563,7 +11559,7 @@
         <w:rPr>
           <w:i w:val="0"/>
         </w:rPr>
-        <w:t>Hình 4.7 là biểu đồ hệ số hồi quy: mỗi chấm là chênh lệch lương ước lượng (quy ra phần trăm) đi cùng việc dùng một ngôn ngữ so với không dùng, đã kiểm soát quốc gia và kinh nghiệm; thanh ngang là khoảng tin cậy 95%. Chấm xanh có khoảng tin cậy không chứa 0, chấm xám thì chưa đủ bằng chứng.</w:t>
+        <w:t>Hình 3.7 là biểu đồ hệ số hồi quy: mỗi chấm là chênh lệch lương ước lượng (quy ra phần trăm) đi cùng việc dùng một ngôn ngữ so với không dùng, đã kiểm soát quốc gia và kinh nghiệm; thanh ngang là khoảng tin cậy 95%. Chấm xanh có khoảng tin cậy không chứa 0, chấm xám thì chưa đủ bằng chứng.</w:t>
       </w:r>
     </w:p>
     <w:p>
@@ -11610,16 +11606,16 @@
       <w:pPr>
         <w:pStyle w:val="Caption"/>
       </w:pPr>
-      <w:bookmarkStart w:id="48" w:name="_Toc1305277471"/>
-      <w:r>
-        <w:t>Hình 4.7: Sau khi cố định nước và kinh nghiệm, chênh lệch lương theo ngôn ngữ chỉ từ −21% đến 14%.</w:t>
+      <w:bookmarkStart w:id="48" w:name="_Toc2793605284"/>
+      <w:r>
+        <w:t>Hình 3.7: Sau khi cố định nước và kinh nghiệm, chênh lệch lương theo ngôn ngữ chỉ từ −21% đến 14%.</w:t>
       </w:r>
       <w:bookmarkEnd w:id="48"/>
       <w:r>
         <w:fldChar w:fldCharType="begin"/>
       </w:r>
       <w:r>
-        <w:instrText xml:space="preserve"> TC "Hình 4.7: Sau khi cố định nước và kinh nghiệm, chênh lệch lương theo ngôn ngữ chỉ từ −21% đến 14%." \f F \l 1 </w:instrText>
+        <w:instrText xml:space="preserve"> TC "Hình 3.7: Sau khi cố định nước và kinh nghiệm, chênh lệch lương theo ngôn ngữ chỉ từ −21% đến 14%." \f F \l 1 </w:instrText>
       </w:r>
       <w:r>
         <w:fldChar w:fldCharType="end"/>
@@ -11674,7 +11670,7 @@
         <w:rPr>
           <w:i w:val="0"/>
         </w:rPr>
-        <w:t>Kết luận kiểm chứng: dữ liệu ủng hộ giả thuyết. Biết người đó sống ở nước nào đã giải thích 45% biến thiên log(lương), thêm kinh nghiệm lên 52%, còn thêm 15 ngôn ngữ chỉ tăng thêm 2,6 điểm phần trăm. Khi đã cố định nước và kinh nghiệm, chênh lệch lương đi cùng việc dùng từng ngôn ngữ nằm trong khoảng từ −21% đến +14%; để so sánh, median thô của nước cao nhất gấp khoảng 38,7 lần nước thấp nhất (Bảng 4.4), tuy hai đại lượng này tính khác nhau nên chỉ so sánh tham khảo. Phép so sánh có cơ sở hơn là R²: quốc gia giải thích 44,9% biến thiên log(lương), còn 15 ngôn ngữ chỉ thêm 2,6 điểm phần trăm.</w:t>
+        <w:t>Kết luận kiểm chứng: dữ liệu ủng hộ giả thuyết. Biết người đó sống ở nước nào đã giải thích 45% biến thiên log(lương), thêm kinh nghiệm lên 52%, còn thêm 15 ngôn ngữ chỉ tăng thêm 2,6 điểm phần trăm. Khi đã cố định nước và kinh nghiệm, chênh lệch lương đi cùng việc dùng từng ngôn ngữ nằm trong khoảng từ −21% đến +14%; để so sánh, median thô của nước cao nhất gấp khoảng 38,7 lần nước thấp nhất (Bảng 3.4), tuy hai đại lượng này tính khác nhau nên chỉ so sánh tham khảo. Phép so sánh có cơ sở hơn là R²: quốc gia giải thích 44,9% biến thiên log(lương), còn 15 ngôn ngữ chỉ thêm 2,6 điểm phần trăm.</w:t>
       </w:r>
     </w:p>
     <w:p>
@@ -11686,9 +11682,9 @@
           <w:numId w:val="0"/>
         </w:numPr>
       </w:pPr>
-      <w:bookmarkStart w:id="49" w:name="_Toc2214735358"/>
-      <w:r>
-        <w:t>4.3. Lương theo nước và vị trí của Việt Nam (Q7)</w:t>
+      <w:bookmarkStart w:id="49" w:name="_Toc772917250"/>
+      <w:r>
+        <w:t>3.3. Lương theo nước và vị trí của Việt Nam (Q7)</w:t>
       </w:r>
       <w:bookmarkEnd w:id="49"/>
     </w:p>
@@ -11703,7 +11699,7 @@
         <w:rPr>
           <w:i w:val="0"/>
         </w:rPr>
-        <w:t>Hình 4.8 là bản đồ choropleth tô màu mỗi nước theo median lương, một biến duy nhất với thang màu tuần tự (càng đậm càng cao). Bản đồ chỉ dùng giá trị chuẩn hóa (median) chứ không dùng số tuyệt đối, và chỉ hiển thị nước đủ 30 dòng lương.</w:t>
+        <w:t>Hình 3.8 là bản đồ choropleth tô màu mỗi nước theo median lương, một biến duy nhất với thang màu tuần tự (càng đậm càng cao). Bản đồ chỉ dùng giá trị chuẩn hóa (median) chứ không dùng số tuyệt đối, và chỉ hiển thị nước đủ 30 dòng lương.</w:t>
       </w:r>
     </w:p>
     <w:p>
@@ -11750,16 +11746,16 @@
       <w:pPr>
         <w:pStyle w:val="Caption"/>
       </w:pPr>
-      <w:bookmarkStart w:id="50" w:name="_Toc337426000"/>
-      <w:r>
-        <w:t>Hình 4.8: Median lương cao nhất ở United States (150.000 USD), thấp nhất ở Nigeria (3.874 USD); Việt Nam 11.464 USD.</w:t>
+      <w:bookmarkStart w:id="50" w:name="_Toc579378501"/>
+      <w:r>
+        <w:t>Hình 3.8: Median lương cao nhất ở United States (150.000 USD), thấp nhất ở Nigeria (3.874 USD); Việt Nam 11.464 USD.</w:t>
       </w:r>
       <w:bookmarkEnd w:id="50"/>
       <w:r>
         <w:fldChar w:fldCharType="begin"/>
       </w:r>
       <w:r>
-        <w:instrText xml:space="preserve"> TC "Hình 4.8: Median lương cao nhất ở United States (150.000 USD), thấp nhất ở Nigeria (3.874 USD); Việt Nam 11.464 USD." \f F \l 1 </w:instrText>
+        <w:instrText xml:space="preserve"> TC "Hình 3.8: Median lương cao nhất ở United States (150.000 USD), thấp nhất ở Nigeria (3.874 USD); Việt Nam 11.464 USD." \f F \l 1 </w:instrText>
       </w:r>
       <w:r>
         <w:fldChar w:fldCharType="end"/>
@@ -11812,7 +11808,7 @@
         <w:rPr>
           <w:i w:val="0"/>
         </w:rPr>
-        <w:t>Hình 4.9 là biểu đồ xếp hạng gồm 10 nước cao nhất, Việt Nam (màu cam) và 10 nước thấp nhất; thanh sai số là khoảng tin cậy bootstrap 95% và n là số người có lương ở mỗi nước.</w:t>
+        <w:t>Hình 3.9 là biểu đồ xếp hạng gồm 10 nước cao nhất, Việt Nam (màu cam) và 10 nước thấp nhất; thanh sai số là khoảng tin cậy bootstrap 95% và n là số người có lương ở mỗi nước.</w:t>
       </w:r>
     </w:p>
     <w:p>
@@ -11859,16 +11855,16 @@
       <w:pPr>
         <w:pStyle w:val="Caption"/>
       </w:pPr>
-      <w:bookmarkStart w:id="51" w:name="_Toc961331276"/>
-      <w:r>
-        <w:t>Hình 4.9: Việt Nam xếp thứ 57/62 nước về median lương (11.464 USD), mẫu chỉ 31 người.</w:t>
+      <w:bookmarkStart w:id="51" w:name="_Toc2866976734"/>
+      <w:r>
+        <w:t>Hình 3.9: Việt Nam xếp thứ 57/62 nước về median lương (11.464 USD), mẫu chỉ 31 người.</w:t>
       </w:r>
       <w:bookmarkEnd w:id="51"/>
       <w:r>
         <w:fldChar w:fldCharType="begin"/>
       </w:r>
       <w:r>
-        <w:instrText xml:space="preserve"> TC "Hình 4.9: Việt Nam xếp thứ 57/62 nước về median lương (11.464 USD), mẫu chỉ 31 người." \f F \l 1 </w:instrText>
+        <w:instrText xml:space="preserve"> TC "Hình 3.9: Việt Nam xếp thứ 57/62 nước về median lương (11.464 USD), mẫu chỉ 31 người." \f F \l 1 </w:instrText>
       </w:r>
       <w:r>
         <w:fldChar w:fldCharType="end"/>
@@ -11893,7 +11889,7 @@
         <w:rPr>
           <w:i w:val="0"/>
         </w:rPr>
-        <w:t>Bảng 4.5 so sánh Việt Nam với một số nước chọn trong khu vực. Việt Nam xếp thứ 57/62 với median 11.464 USD từ 31 người. Khoảng tin cậy rộng nên thứ hạng không chắc chắn, nhưng Việt Nam nằm gần nhóm các nước đang phát triển ở châu Á và châu Phi trong dữ liệu này.</w:t>
+        <w:t>Bảng 3.5 so sánh Việt Nam với một số nước chọn trong khu vực. Việt Nam xếp thứ 57/62 với median 11.464 USD từ 31 người. Khoảng tin cậy rộng nên thứ hạng không chắc chắn, nhưng Việt Nam nằm gần nhóm các nước đang phát triển ở châu Á và châu Phi trong dữ liệu này.</w:t>
       </w:r>
     </w:p>
     <w:p>
@@ -11915,16 +11911,16 @@
         <w:pStyle w:val="Caption"/>
         <w:keepNext/>
       </w:pPr>
-      <w:bookmarkStart w:id="52" w:name="_Toc1447259553"/>
-      <w:r>
-        <w:t>Bảng 4.4: 10 nước có median cao nhất và 10 nước thấp nhất.</w:t>
+      <w:bookmarkStart w:id="52" w:name="_Toc1113906347"/>
+      <w:r>
+        <w:t>Bảng 3.4: 10 nước có median cao nhất và 10 nước thấp nhất.</w:t>
       </w:r>
       <w:bookmarkEnd w:id="52"/>
       <w:r>
         <w:fldChar w:fldCharType="begin"/>
       </w:r>
       <w:r>
-        <w:instrText xml:space="preserve"> TC "Bảng 4.4: 10 nước có median cao nhất và 10 nước thấp nhất." \f T \l 1 </w:instrText>
+        <w:instrText xml:space="preserve"> TC "Bảng 3.4: 10 nước có median cao nhất và 10 nước thấp nhất." \f T \l 1 </w:instrText>
       </w:r>
       <w:r>
         <w:fldChar w:fldCharType="end"/>
@@ -13508,16 +13504,16 @@
         <w:pStyle w:val="Caption"/>
         <w:keepNext/>
       </w:pPr>
-      <w:bookmarkStart w:id="53" w:name="_Toc3729208642"/>
-      <w:r>
-        <w:t>Bảng 4.5: Việt Nam và một số nước chọn để so sánh (đủ 30 dòng lương).</w:t>
+      <w:bookmarkStart w:id="53" w:name="_Toc2913576662"/>
+      <w:r>
+        <w:t>Bảng 3.5: Việt Nam và một số nước chọn để so sánh (đủ 30 dòng lương).</w:t>
       </w:r>
       <w:bookmarkEnd w:id="53"/>
       <w:r>
         <w:fldChar w:fldCharType="begin"/>
       </w:r>
       <w:r>
-        <w:instrText xml:space="preserve"> TC "Bảng 4.5: Việt Nam và một số nước chọn để so sánh (đủ 30 dòng lương)." \f T \l 1 </w:instrText>
+        <w:instrText xml:space="preserve"> TC "Bảng 3.5: Việt Nam và một số nước chọn để so sánh (đủ 30 dòng lương)." \f T \l 1 </w:instrText>
       </w:r>
       <w:r>
         <w:fldChar w:fldCharType="end"/>
@@ -14743,9 +14739,9 @@
           <w:numId w:val="0"/>
         </w:numPr>
       </w:pPr>
-      <w:bookmarkStart w:id="54" w:name="_Toc2518512753"/>
-      <w:r>
-        <w:t>4.4. So sánh các vai trò (Q8)</w:t>
+      <w:bookmarkStart w:id="54" w:name="_Toc780691172"/>
+      <w:r>
+        <w:t>3.4. So sánh các vai trò (Q8)</w:t>
       </w:r>
       <w:bookmarkEnd w:id="54"/>
     </w:p>
@@ -14760,7 +14756,7 @@
         <w:rPr>
           <w:i w:val="0"/>
         </w:rPr>
-        <w:t>Hình 4.10 là spider chart (radar) so sánh hồ sơ nhiều chỉ số của vài đối tượng trên các trục xuất phát từ tâm. Để tránh các nhược điểm đã biết (thứ tự trục ảnh hưởng hình dạng, diện tích phóng đại chênh lệch), biểu đồ chỉ có 4 trục, 3 vai trò, mỗi trục được chia cho giá trị cao nhất để bắt đầu từ 0 và dải giá trị thật ghi cạnh tên trục.</w:t>
+        <w:t>Hình 3.10 là spider chart (radar) so sánh hồ sơ nhiều chỉ số của vài đối tượng trên các trục xuất phát từ tâm. Để tránh các nhược điểm đã biết (thứ tự trục ảnh hưởng hình dạng, diện tích phóng đại chênh lệch), biểu đồ chỉ có 4 trục, 3 vai trò, mỗi trục được chia cho giá trị cao nhất để bắt đầu từ 0 và dải giá trị thật ghi cạnh tên trục.</w:t>
       </w:r>
     </w:p>
     <w:p>
@@ -14807,16 +14803,16 @@
       <w:pPr>
         <w:pStyle w:val="Caption"/>
       </w:pPr>
-      <w:bookmarkStart w:id="55" w:name="_Toc1509602278"/>
-      <w:r>
-        <w:t>Hình 4.10: AI/ML engineer dùng AI hằng ngày nhiều nhất (74%), Engineering manager có lương cao nhất.</w:t>
+      <w:bookmarkStart w:id="55" w:name="_Toc1738406413"/>
+      <w:r>
+        <w:t>Hình 3.10: AI/ML engineer dùng AI hằng ngày nhiều nhất (74%), Engineering manager có lương cao nhất.</w:t>
       </w:r>
       <w:bookmarkEnd w:id="55"/>
       <w:r>
         <w:fldChar w:fldCharType="begin"/>
       </w:r>
       <w:r>
-        <w:instrText xml:space="preserve"> TC "Hình 4.10: AI/ML engineer dùng AI hằng ngày nhiều nhất (74%), Engineering manager có lương cao nhất." \f F \l 1 </w:instrText>
+        <w:instrText xml:space="preserve"> TC "Hình 3.10: AI/ML engineer dùng AI hằng ngày nhiều nhất (74%), Engineering manager có lương cao nhất." \f F \l 1 </w:instrText>
       </w:r>
       <w:r>
         <w:fldChar w:fldCharType="end"/>
@@ -14869,7 +14865,7 @@
         <w:rPr>
           <w:i w:val="0"/>
         </w:rPr>
-        <w:t>Hình 4.11 là biểu đồ chấm (dot plot) hiển thị giá trị thật của từng chỉ số cho mọi vai trò, sắp theo lương; ba chấm màu là ba vai trò đã so sánh trong spider chart, dùng khi cần đọc số chính xác.</w:t>
+        <w:t>Hình 3.11 là biểu đồ chấm (dot plot) hiển thị giá trị thật của từng chỉ số cho mọi vai trò, sắp theo lương; ba chấm màu là ba vai trò đã so sánh trong spider chart, dùng khi cần đọc số chính xác.</w:t>
       </w:r>
     </w:p>
     <w:p>
@@ -14916,16 +14912,16 @@
       <w:pPr>
         <w:pStyle w:val="Caption"/>
       </w:pPr>
-      <w:bookmarkStart w:id="56" w:name="_Toc2568708478"/>
-      <w:r>
-        <w:t>Hình 4.11: Giá trị thật của 4 chỉ số: vai trò tô màu là 3 vai trò trong spider.</w:t>
+      <w:bookmarkStart w:id="56" w:name="_Toc1570631616"/>
+      <w:r>
+        <w:t>Hình 3.11: Giá trị thật của 4 chỉ số: vai trò tô màu là 3 vai trò trong spider.</w:t>
       </w:r>
       <w:bookmarkEnd w:id="56"/>
       <w:r>
         <w:fldChar w:fldCharType="begin"/>
       </w:r>
       <w:r>
-        <w:instrText xml:space="preserve"> TC "Hình 4.11: Giá trị thật của 4 chỉ số: vai trò tô màu là 3 vai trò trong spider." \f F \l 1 </w:instrText>
+        <w:instrText xml:space="preserve"> TC "Hình 3.11: Giá trị thật của 4 chỉ số: vai trò tô màu là 3 vai trò trong spider." \f F \l 1 </w:instrText>
       </w:r>
       <w:r>
         <w:fldChar w:fldCharType="end"/>
@@ -14950,7 +14946,7 @@
         <w:rPr>
           <w:i w:val="0"/>
         </w:rPr>
-        <w:t>Bảng 4.6 liệt kê số liệu đầy đủ của 12 vai trò.</w:t>
+        <w:t>Bảng 3.6 liệt kê số liệu đầy đủ của 12 vai trò.</w:t>
       </w:r>
     </w:p>
     <w:p>
@@ -14972,16 +14968,16 @@
         <w:pStyle w:val="Caption"/>
         <w:keepNext/>
       </w:pPr>
-      <w:bookmarkStart w:id="57" w:name="_Toc3569865858"/>
-      <w:r>
-        <w:t>Bảng 4.6: Hồ sơ 12 vai trò: lương, kinh nghiệm, dùng AI hằng ngày và hài lòng công việc.</w:t>
+      <w:bookmarkStart w:id="57" w:name="_Toc3394603197"/>
+      <w:r>
+        <w:t>Bảng 3.6: Hồ sơ 12 vai trò: lương, kinh nghiệm, dùng AI hằng ngày và hài lòng công việc.</w:t>
       </w:r>
       <w:bookmarkEnd w:id="57"/>
       <w:r>
         <w:fldChar w:fldCharType="begin"/>
       </w:r>
       <w:r>
-        <w:instrText xml:space="preserve"> TC "Bảng 4.6: Hồ sơ 12 vai trò: lương, kinh nghiệm, dùng AI hằng ngày và hài lòng công việc." \f T \l 1 </w:instrText>
+        <w:instrText xml:space="preserve"> TC "Bảng 3.6: Hồ sơ 12 vai trò: lương, kinh nghiệm, dùng AI hằng ngày và hài lòng công việc." \f T \l 1 </w:instrText>
       </w:r>
       <w:r>
         <w:fldChar w:fldCharType="end"/>
@@ -16455,9 +16451,9 @@
           <w:numId w:val="0"/>
         </w:numPr>
       </w:pPr>
-      <w:bookmarkStart w:id="58" w:name="_Toc572703701"/>
-      <w:r>
-        <w:t>4.5. Tóm tắt chương</w:t>
+      <w:bookmarkStart w:id="58" w:name="_Toc322630818"/>
+      <w:r>
+        <w:t>3.5. Tóm tắt chương</w:t>
       </w:r>
       <w:bookmarkEnd w:id="58"/>
     </w:p>
@@ -16478,9 +16474,9 @@
           <w:numId w:val="0"/>
         </w:numPr>
       </w:pPr>
-      <w:bookmarkStart w:id="59" w:name="_Toc2010487642"/>
-      <w:r>
-        <w:t>CHƯƠNG 5. AI VÀ KỸ NĂNG CÒN GIÁ TRỊ, CÂU CHUYỆN DỮ LIỆU TỔNG HỢP</w:t>
+      <w:bookmarkStart w:id="59" w:name="_Toc4187433572"/>
+      <w:r>
+        <w:t>CHƯƠNG 4. AI VÀ KỸ NĂNG CÒN GIÁ TRỊ, CÂU CHUYỆN DỮ LIỆU TỔNG HỢP</w:t>
       </w:r>
       <w:bookmarkEnd w:id="59"/>
     </w:p>
@@ -16493,9 +16489,9 @@
           <w:numId w:val="0"/>
         </w:numPr>
       </w:pPr>
-      <w:bookmarkStart w:id="60" w:name="_Toc2491379647"/>
-      <w:r>
-        <w:t>5.1. AI trong công việc của lập trình viên</w:t>
+      <w:bookmarkStart w:id="60" w:name="_Toc1581358124"/>
+      <w:r>
+        <w:t>4.1. AI trong công việc của lập trình viên</w:t>
       </w:r>
       <w:bookmarkEnd w:id="60"/>
     </w:p>
@@ -16504,7 +16500,7 @@
         <w:rPr>
           <w:i w:val="0"/>
         </w:rPr>
-        <w:t>Trong 33.720 người trả lời câu hỏi về việc dùng công cụ AI, 47% dùng AI hằng ngày. Ở mức vai trò (Chương 4), tỷ lệ dùng AI hằng ngày từ 29% (Embedded) đến 74% (AI/ML engineer), và không liên hệ rõ với mức lương (hệ số Spearman 0,08). Nói cách khác, AI đã trở thành công cụ hằng ngày của gần một nửa số người trả lời, nhưng việc dùng AI nhiều không đi cùng mức lương cao ở cấp vai trò.</w:t>
+        <w:t>Trong 33.720 người trả lời câu hỏi về việc dùng công cụ AI, 47% dùng AI hằng ngày. Ở mức vai trò (Chương 3), tỷ lệ dùng AI hằng ngày từ 29% (Embedded) đến 74% (AI/ML engineer), và không liên hệ rõ với mức lương (hệ số Spearman 0,08). Nói cách khác, AI đã trở thành công cụ hằng ngày của gần một nửa số người trả lời, nhưng việc dùng AI nhiều không đi cùng mức lương cao ở cấp vai trò.</w:t>
       </w:r>
     </w:p>
     <w:p>
@@ -16516,9 +16512,9 @@
           <w:numId w:val="0"/>
         </w:numPr>
       </w:pPr>
-      <w:bookmarkStart w:id="61" w:name="_Toc2896829126"/>
-      <w:r>
-        <w:t>5.2. Kỹ năng nào còn giá trị trong 3–5 năm tới (Q9)</w:t>
+      <w:bookmarkStart w:id="61" w:name="_Toc597636947"/>
+      <w:r>
+        <w:t>4.2. Kỹ năng nào còn giá trị trong 3–5 năm tới (Q9)</w:t>
       </w:r>
       <w:bookmarkEnd w:id="61"/>
     </w:p>
@@ -16541,7 +16537,7 @@
         <w:rPr>
           <w:i w:val="0"/>
         </w:rPr>
-        <w:t>Hình 5.1 là wordcloud thể hiện tần suất từ trong văn bản: kích thước chữ tỷ lệ với số câu trả lời chứa từ đó. Wordcloud nhanh và trực quan nhưng không cho biết ngữ cảnh, nên đi kèm bảng tần suất.</w:t>
+        <w:t>Hình 4.1 là wordcloud thể hiện tần suất từ trong văn bản: kích thước chữ tỷ lệ với số câu trả lời chứa từ đó. Wordcloud nhanh và trực quan nhưng không cho biết ngữ cảnh, nên đi kèm bảng tần suất.</w:t>
       </w:r>
     </w:p>
     <w:p>
@@ -16588,16 +16584,16 @@
       <w:pPr>
         <w:pStyle w:val="Caption"/>
       </w:pPr>
-      <w:bookmarkStart w:id="62" w:name="_Toc4154492226"/>
-      <w:r>
-        <w:t>Hình 5.1: ai, problem, code là những từ được nhắc nhiều nhất khi nói về kỹ năng còn giá trị.</w:t>
+      <w:bookmarkStart w:id="62" w:name="_Toc3327702397"/>
+      <w:r>
+        <w:t>Hình 4.1: ai, problem, code là những từ được nhắc nhiều nhất khi nói về kỹ năng còn giá trị.</w:t>
       </w:r>
       <w:bookmarkEnd w:id="62"/>
       <w:r>
         <w:fldChar w:fldCharType="begin"/>
       </w:r>
       <w:r>
-        <w:instrText xml:space="preserve"> TC "Hình 5.1: ai, problem, code là những từ được nhắc nhiều nhất khi nói về kỹ năng còn giá trị." \f F \l 1 </w:instrText>
+        <w:instrText xml:space="preserve"> TC "Hình 4.1: ai, problem, code là những từ được nhắc nhiều nhất khi nói về kỹ năng còn giá trị." \f F \l 1 </w:instrText>
       </w:r>
       <w:r>
         <w:fldChar w:fldCharType="end"/>
@@ -16650,7 +16646,7 @@
         <w:rPr>
           <w:i w:val="0"/>
         </w:rPr>
-        <w:t>Hình 5.2 là biểu đồ cột ngang liệt kê 20 từ khóa xuất hiện trong nhiều câu trả lời nhất; tỷ lệ là số câu trả lời chứa từ chia cho tổng số câu trả lời.</w:t>
+        <w:t>Hình 4.2 là biểu đồ cột ngang liệt kê 20 từ khóa xuất hiện trong nhiều câu trả lời nhất; tỷ lệ là số câu trả lời chứa từ chia cho tổng số câu trả lời.</w:t>
       </w:r>
     </w:p>
     <w:p>
@@ -16697,16 +16693,16 @@
       <w:pPr>
         <w:pStyle w:val="Caption"/>
       </w:pPr>
-      <w:bookmarkStart w:id="63" w:name="_Toc2827397134"/>
-      <w:r>
-        <w:t>Hình 5.2: Top 20 từ khóa: ai, problem, code, understanding dẫn đầu.</w:t>
+      <w:bookmarkStart w:id="63" w:name="_Toc4058026085"/>
+      <w:r>
+        <w:t>Hình 4.2: Top 20 từ khóa: ai, problem, code, understanding dẫn đầu.</w:t>
       </w:r>
       <w:bookmarkEnd w:id="63"/>
       <w:r>
         <w:fldChar w:fldCharType="begin"/>
       </w:r>
       <w:r>
-        <w:instrText xml:space="preserve"> TC "Hình 5.2: Top 20 từ khóa: ai, problem, code, understanding dẫn đầu." \f F \l 1 </w:instrText>
+        <w:instrText xml:space="preserve"> TC "Hình 4.2: Top 20 từ khóa: ai, problem, code, understanding dẫn đầu." \f F \l 1 </w:instrText>
       </w:r>
       <w:r>
         <w:fldChar w:fldCharType="end"/>
@@ -16731,7 +16727,7 @@
         <w:rPr>
           <w:i w:val="0"/>
         </w:rPr>
-        <w:t>Bảng tần suất ở Bảng 5.1 cho biết tỷ lệ chính xác.</w:t>
+        <w:t>Bảng tần suất ở Bảng 4.1 cho biết tỷ lệ chính xác.</w:t>
       </w:r>
     </w:p>
     <w:p>
@@ -16753,16 +16749,16 @@
         <w:pStyle w:val="Caption"/>
         <w:keepNext/>
       </w:pPr>
-      <w:bookmarkStart w:id="64" w:name="_Toc805354525"/>
-      <w:r>
-        <w:t>Bảng 5.1: 15 từ khóa xuất hiện nhiều nhất trong câu trả lời về kỹ năng.</w:t>
+      <w:bookmarkStart w:id="64" w:name="_Toc2650636393"/>
+      <w:r>
+        <w:t>Bảng 4.1: 15 từ khóa xuất hiện nhiều nhất trong câu trả lời về kỹ năng.</w:t>
       </w:r>
       <w:bookmarkEnd w:id="64"/>
       <w:r>
         <w:fldChar w:fldCharType="begin"/>
       </w:r>
       <w:r>
-        <w:instrText xml:space="preserve"> TC "Bảng 5.1: 15 từ khóa xuất hiện nhiều nhất trong câu trả lời về kỹ năng." \f T \l 1 </w:instrText>
+        <w:instrText xml:space="preserve"> TC "Bảng 4.1: 15 từ khóa xuất hiện nhiều nhất trong câu trả lời về kỹ năng." \f T \l 1 </w:instrText>
       </w:r>
       <w:r>
         <w:fldChar w:fldCharType="end"/>
@@ -17699,9 +17695,9 @@
           <w:numId w:val="0"/>
         </w:numPr>
       </w:pPr>
-      <w:bookmarkStart w:id="65" w:name="_Toc4264006660"/>
-      <w:r>
-        <w:t>5.3. Câu chuyện dữ liệu tổng hợp</w:t>
+      <w:bookmarkStart w:id="65" w:name="_Toc3107218175"/>
+      <w:r>
+        <w:t>4.3. Câu chuyện dữ liệu tổng hợp</w:t>
       </w:r>
       <w:bookmarkEnd w:id="65"/>
     </w:p>
@@ -17724,7 +17720,7 @@
         <w:rPr>
           <w:i w:val="0"/>
         </w:rPr>
-        <w:t>Khảo sát Stack Overflow 2025 có 49.191 phản hồi, 76% là lập trình viên chuyên nghiệp, nhiều nhất ở Mỹ, Đức và Ấn Độ; Việt Nam chỉ có 145 phản hồi (Hình 2.3). Sinh viên và lập trình viên mới ở Việt Nam cần trả lời hai câu hỏi: học công nghệ nào, và kỳ vọng mức lương ra sao.</w:t>
+        <w:t>Khảo sát Stack Overflow 2025 có 49.191 phản hồi, 76% là lập trình viên chuyên nghiệp, nhiều nhất ở Mỹ, Đức và Ấn Độ; Việt Nam chỉ có 145 phản hồi (Hình 1.3). Sinh viên và lập trình viên mới ở Việt Nam cần trả lời hai câu hỏi: học công nghệ nào, và kỳ vọng mức lương ra sao.</w:t>
       </w:r>
     </w:p>
     <w:p>
@@ -17753,7 +17749,7 @@
         <w:spacing w:line="264" w:lineRule="auto"/>
       </w:pPr>
       <w:r>
-        <w:t>JavaScript, HTML/CSS và SQL là ba ngôn ngữ dùng nhiều nhất (Hình 3.1), nhưng mức dùng và mức ngưỡng mộ gần như không liên hệ (Spearman 0,12): ngôn ngữ được ngưỡng mộ nhất trong nhóm khá phổ biến là Rust, TypeScript và SQL (Hình 3.4).</w:t>
+        <w:t>JavaScript, HTML/CSS và SQL là ba ngôn ngữ dùng nhiều nhất (Hình 2.1), nhưng mức dùng và mức ngưỡng mộ gần như không liên hệ (Spearman 0,12): ngôn ngữ được ngưỡng mộ nhất trong nhóm khá phổ biến là Rust, TypeScript và SQL (Hình 2.4).</w:t>
       </w:r>
     </w:p>
     <w:p>
@@ -17768,7 +17764,7 @@
         <w:spacing w:line="264" w:lineRule="auto"/>
       </w:pPr>
       <w:r>
-        <w:t>Một số ngôn ngữ thường được dùng chung và tạo thành cụm, gợi ý các ngôn ngữ có thể học cùng nhau (Hình 3.6).</w:t>
+        <w:t>Một số ngôn ngữ thường được dùng chung và tạo thành cụm, gợi ý các ngôn ngữ có thể học cùng nhau (Hình 2.6).</w:t>
       </w:r>
     </w:p>
     <w:p>
@@ -17783,7 +17779,7 @@
         <w:spacing w:line="264" w:lineRule="auto"/>
       </w:pPr>
       <w:r>
-        <w:t>Lương lệch phải: median 79.578 USD thấp hơn mean 92.934 USD (Hình 4.1); lương tăng đều theo kinh nghiệm, từ 28.083 USD (0–2 năm) lên 111.515 USD (21+ năm) (Hình 4.3).</w:t>
+        <w:t>Lương lệch phải: median 79.578 USD thấp hơn mean 92.934 USD (Hình 3.1); lương tăng đều theo kinh nghiệm, từ 28.083 USD (0–2 năm) lên 111.515 USD (21+ năm) (Hình 3.3).</w:t>
       </w:r>
     </w:p>
     <w:p>
@@ -17798,7 +17794,7 @@
         <w:spacing w:line="264" w:lineRule="auto"/>
       </w:pPr>
       <w:r>
-        <w:t>Quốc gia giải thích 45% biến thiên log(lương), thêm kinh nghiệm lên 52%, thêm 15 ngôn ngữ chỉ cộng 2,6 điểm phần trăm (Hình 4.6).</w:t>
+        <w:t>Quốc gia giải thích 45% biến thiên log(lương), thêm kinh nghiệm lên 52%, thêm 15 ngôn ngữ chỉ cộng 2,6 điểm phần trăm (Hình 3.6).</w:t>
       </w:r>
     </w:p>
     <w:p>
@@ -17813,7 +17809,7 @@
         <w:spacing w:line="264" w:lineRule="auto"/>
       </w:pPr>
       <w:r>
-        <w:t>Việt Nam xếp thứ 57/62 về median lương (11.464 USD, n = 31), mẫu nhỏ nên chỉ tham khảo (Hình 4.9).</w:t>
+        <w:t>Việt Nam xếp thứ 57/62 về median lương (11.464 USD, n = 31), mẫu nhỏ nên chỉ tham khảo (Hình 3.9).</w:t>
       </w:r>
     </w:p>
     <w:p>
@@ -17828,7 +17824,7 @@
         <w:spacing w:line="264" w:lineRule="auto"/>
       </w:pPr>
       <w:r>
-        <w:t>47% người trả lời dùng AI hằng ngày, nhưng mức dùng AI không liên hệ với lương giữa các vai trò (Hình 4.10); cụm 'problem solving' có trong 10,6% và 'critical thinking' có trong 5,3% câu trả lời về kỹ năng còn giá trị (Hình 5.1).</w:t>
+        <w:t>47% người trả lời dùng AI hằng ngày, nhưng mức dùng AI không liên hệ với lương giữa các vai trò (Hình 3.10); cụm 'problem solving' có trong 10,6% và 'critical thinking' có trong 5,3% câu trả lời về kỹ năng còn giá trị (Hình 4.1).</w:t>
       </w:r>
     </w:p>
     <w:p>
@@ -17861,16 +17857,12 @@
     </w:p>
     <w:p>
       <w:pPr>
-        <w:pStyle w:val="Heading1"/>
+        <w:pStyle w:val="section"/>
         <w:pageBreakBefore/>
-        <w:numPr>
-          <w:ilvl w:val="0"/>
-          <w:numId w:val="0"/>
-        </w:numPr>
-      </w:pPr>
-      <w:bookmarkStart w:id="66" w:name="_Toc3623029765"/>
-      <w:r>
-        <w:t>CHƯƠNG 6. KẾT LUẬN VÀ HẠN CHẾ</w:t>
+      </w:pPr>
+      <w:bookmarkStart w:id="66" w:name="_Toc2699881821"/>
+      <w:r>
+        <w:t>KẾT LUẬN VÀ HẠN CHẾ</w:t>
       </w:r>
       <w:bookmarkEnd w:id="66"/>
     </w:p>
@@ -17883,9 +17875,9 @@
           <w:numId w:val="0"/>
         </w:numPr>
       </w:pPr>
-      <w:bookmarkStart w:id="67" w:name="_Toc3070284381"/>
-      <w:r>
-        <w:t>6.1. Kết luận</w:t>
+      <w:bookmarkStart w:id="67" w:name="_Toc1822189634"/>
+      <w:r>
+        <w:t>Kết luận</w:t>
       </w:r>
       <w:bookmarkEnd w:id="67"/>
     </w:p>
@@ -17906,9 +17898,9 @@
           <w:numId w:val="0"/>
         </w:numPr>
       </w:pPr>
-      <w:bookmarkStart w:id="68" w:name="_Toc1338042166"/>
-      <w:r>
-        <w:t>6.2. Khuyến nghị cho sinh viên và lập trình viên mới ở Việt Nam</w:t>
+      <w:bookmarkStart w:id="68" w:name="_Toc3504217516"/>
+      <w:r>
+        <w:t>Khuyến nghị cho sinh viên và lập trình viên mới ở Việt Nam</w:t>
       </w:r>
       <w:bookmarkEnd w:id="68"/>
     </w:p>
@@ -17981,9 +17973,9 @@
           <w:numId w:val="0"/>
         </w:numPr>
       </w:pPr>
-      <w:bookmarkStart w:id="69" w:name="_Toc3010280920"/>
-      <w:r>
-        <w:t>6.3. Hạn chế</w:t>
+      <w:bookmarkStart w:id="69" w:name="_Toc1970286687"/>
+      <w:r>
+        <w:t>Hạn chế</w:t>
       </w:r>
       <w:bookmarkEnd w:id="69"/>
     </w:p>
@@ -18101,9 +18093,9 @@
           <w:numId w:val="0"/>
         </w:numPr>
       </w:pPr>
-      <w:bookmarkStart w:id="70" w:name="_Toc2224724612"/>
-      <w:r>
-        <w:t>6.4. Hướng phát triển</w:t>
+      <w:bookmarkStart w:id="70" w:name="_Toc11019798"/>
+      <w:r>
+        <w:t>Hướng phát triển</w:t>
       </w:r>
       <w:bookmarkEnd w:id="70"/>
     </w:p>

</xml_diff>

<commit_message>
fix(report): number introduction and conclusion sections from 1
Co-Authored-By: Claude Fable 5.1 <noreply@anthropic.com>
</commit_message>
<xml_diff>
--- a/deliverables/report.docx
+++ b/deliverables/report.docx
@@ -2373,9 +2373,9 @@
           <w:tab w:pos="9061" w:val="right" w:leader="dot"/>
         </w:tabs>
       </w:pPr>
-      <w:hyperlink w:anchor="_Toc1625638599" w:history="1">
+      <w:hyperlink w:anchor="_Toc205430747" w:history="1">
         <w:r>
-          <w:t xml:space="preserve">Bối cảnh</w:t>
+          <w:t xml:space="preserve">1. Bối cảnh</w:t>
         </w:r>
         <w:r>
           <w:tab/>
@@ -2392,9 +2392,9 @@
           <w:tab w:pos="9061" w:val="right" w:leader="dot"/>
         </w:tabs>
       </w:pPr>
-      <w:hyperlink w:anchor="_Toc2236665712" w:history="1">
+      <w:hyperlink w:anchor="_Toc40482919" w:history="1">
         <w:r>
-          <w:t xml:space="preserve">Mục tiêu và đối tượng</w:t>
+          <w:t xml:space="preserve">2. Mục tiêu và đối tượng</w:t>
         </w:r>
         <w:r>
           <w:tab/>
@@ -2411,9 +2411,9 @@
           <w:tab w:pos="9061" w:val="right" w:leader="dot"/>
         </w:tabs>
       </w:pPr>
-      <w:hyperlink w:anchor="_Toc1030828578" w:history="1">
+      <w:hyperlink w:anchor="_Toc1061211808" w:history="1">
         <w:r>
-          <w:t xml:space="preserve">Câu hỏi phân tích</w:t>
+          <w:t xml:space="preserve">3. Câu hỏi phân tích</w:t>
         </w:r>
         <w:r>
           <w:tab/>
@@ -2430,9 +2430,9 @@
           <w:tab w:pos="9061" w:val="right" w:leader="dot"/>
         </w:tabs>
       </w:pPr>
-      <w:hyperlink w:anchor="_Toc2501247624" w:history="1">
+      <w:hyperlink w:anchor="_Toc4025387148" w:history="1">
         <w:r>
-          <w:t xml:space="preserve">Phạm vi và cấu trúc báo cáo</w:t>
+          <w:t xml:space="preserve">4. Phạm vi và cấu trúc báo cáo</w:t>
         </w:r>
         <w:r>
           <w:tab/>
@@ -2886,9 +2886,9 @@
           <w:tab w:pos="9061" w:val="right" w:leader="dot"/>
         </w:tabs>
       </w:pPr>
-      <w:hyperlink w:anchor="_Toc1822189634" w:history="1">
+      <w:hyperlink w:anchor="_Toc4698462" w:history="1">
         <w:r>
-          <w:t xml:space="preserve">Kết luận</w:t>
+          <w:t xml:space="preserve">1. Kết luận</w:t>
         </w:r>
         <w:r>
           <w:tab/>
@@ -2905,9 +2905,9 @@
           <w:tab w:pos="9061" w:val="right" w:leader="dot"/>
         </w:tabs>
       </w:pPr>
-      <w:hyperlink w:anchor="_Toc3504217516" w:history="1">
+      <w:hyperlink w:anchor="_Toc3334315038" w:history="1">
         <w:r>
-          <w:t xml:space="preserve">Khuyến nghị cho sinh viên và lập trình viên mới ở Việt Nam</w:t>
+          <w:t xml:space="preserve">2. Khuyến nghị cho sinh viên và lập trình viên mới ở Việt Nam</w:t>
         </w:r>
         <w:r>
           <w:tab/>
@@ -2924,9 +2924,9 @@
           <w:tab w:pos="9061" w:val="right" w:leader="dot"/>
         </w:tabs>
       </w:pPr>
-      <w:hyperlink w:anchor="_Toc1970286687" w:history="1">
+      <w:hyperlink w:anchor="_Toc1230112166" w:history="1">
         <w:r>
-          <w:t xml:space="preserve">Hạn chế</w:t>
+          <w:t xml:space="preserve">3. Hạn chế</w:t>
         </w:r>
         <w:r>
           <w:tab/>
@@ -2943,9 +2943,9 @@
           <w:tab w:pos="9061" w:val="right" w:leader="dot"/>
         </w:tabs>
       </w:pPr>
-      <w:hyperlink w:anchor="_Toc11019798" w:history="1">
+      <w:hyperlink w:anchor="_Toc3435734588" w:history="1">
         <w:r>
-          <w:t xml:space="preserve">Hướng phát triển</w:t>
+          <w:t xml:space="preserve">4. Hướng phát triển</w:t>
         </w:r>
         <w:r>
           <w:tab/>
@@ -4616,9 +4616,9 @@
           <w:numId w:val="0"/>
         </w:numPr>
       </w:pPr>
-      <w:bookmarkStart w:id="7" w:name="_Toc1625638599"/>
-      <w:r>
-        <w:t>Bối cảnh</w:t>
+      <w:bookmarkStart w:id="7" w:name="_Toc205430747"/>
+      <w:r>
+        <w:t>1. Bối cảnh</w:t>
       </w:r>
       <w:bookmarkEnd w:id="7"/>
     </w:p>
@@ -4647,9 +4647,9 @@
           <w:numId w:val="0"/>
         </w:numPr>
       </w:pPr>
-      <w:bookmarkStart w:id="8" w:name="_Toc2236665712"/>
-      <w:r>
-        <w:t>Mục tiêu và đối tượng</w:t>
+      <w:bookmarkStart w:id="8" w:name="_Toc40482919"/>
+      <w:r>
+        <w:t>2. Mục tiêu và đối tượng</w:t>
       </w:r>
       <w:bookmarkEnd w:id="8"/>
     </w:p>
@@ -4678,9 +4678,9 @@
           <w:numId w:val="0"/>
         </w:numPr>
       </w:pPr>
-      <w:bookmarkStart w:id="9" w:name="_Toc1030828578"/>
-      <w:r>
-        <w:t>Câu hỏi phân tích</w:t>
+      <w:bookmarkStart w:id="9" w:name="_Toc1061211808"/>
+      <w:r>
+        <w:t>3. Câu hỏi phân tích</w:t>
       </w:r>
       <w:bookmarkEnd w:id="9"/>
     </w:p>
@@ -4828,9 +4828,9 @@
           <w:numId w:val="0"/>
         </w:numPr>
       </w:pPr>
-      <w:bookmarkStart w:id="10" w:name="_Toc2501247624"/>
-      <w:r>
-        <w:t>Phạm vi và cấu trúc báo cáo</w:t>
+      <w:bookmarkStart w:id="10" w:name="_Toc4025387148"/>
+      <w:r>
+        <w:t>4. Phạm vi và cấu trúc báo cáo</w:t>
       </w:r>
       <w:bookmarkEnd w:id="10"/>
     </w:p>
@@ -17875,9 +17875,9 @@
           <w:numId w:val="0"/>
         </w:numPr>
       </w:pPr>
-      <w:bookmarkStart w:id="67" w:name="_Toc1822189634"/>
-      <w:r>
-        <w:t>Kết luận</w:t>
+      <w:bookmarkStart w:id="67" w:name="_Toc4698462"/>
+      <w:r>
+        <w:t>1. Kết luận</w:t>
       </w:r>
       <w:bookmarkEnd w:id="67"/>
     </w:p>
@@ -17898,9 +17898,9 @@
           <w:numId w:val="0"/>
         </w:numPr>
       </w:pPr>
-      <w:bookmarkStart w:id="68" w:name="_Toc3504217516"/>
-      <w:r>
-        <w:t>Khuyến nghị cho sinh viên và lập trình viên mới ở Việt Nam</w:t>
+      <w:bookmarkStart w:id="68" w:name="_Toc3334315038"/>
+      <w:r>
+        <w:t>2. Khuyến nghị cho sinh viên và lập trình viên mới ở Việt Nam</w:t>
       </w:r>
       <w:bookmarkEnd w:id="68"/>
     </w:p>
@@ -17973,9 +17973,9 @@
           <w:numId w:val="0"/>
         </w:numPr>
       </w:pPr>
-      <w:bookmarkStart w:id="69" w:name="_Toc1970286687"/>
-      <w:r>
-        <w:t>Hạn chế</w:t>
+      <w:bookmarkStart w:id="69" w:name="_Toc1230112166"/>
+      <w:r>
+        <w:t>3. Hạn chế</w:t>
       </w:r>
       <w:bookmarkEnd w:id="69"/>
     </w:p>
@@ -18093,9 +18093,9 @@
           <w:numId w:val="0"/>
         </w:numPr>
       </w:pPr>
-      <w:bookmarkStart w:id="70" w:name="_Toc11019798"/>
-      <w:r>
-        <w:t>Hướng phát triển</w:t>
+      <w:bookmarkStart w:id="70" w:name="_Toc3435734588"/>
+      <w:r>
+        <w:t>4. Hướng phát triển</w:t>
       </w:r>
       <w:bookmarkEnd w:id="70"/>
     </w:p>

</xml_diff>